<commit_message>
feat(tools): register SearchLoreTool and GetCharacterTool in ToolRegistry
AgentTool now has a name, description, JSON Schema and execute(args,
session). ToolRegistry registers tools, hands the agent their
LLMToolSpec definitions and validates every call before a tool runs:
an unknown tool, a missing required argument (read from the schema) or
a tool that throws comes back as a failed ToolResult for the model, so
a bad request never stops the turn.

SearchLoreTool returns up to five entries (pinned marked canon) and
reports their ids so the turn can list the lore it used; it falls back
to any-word matching when no entry has every keyword. GetCharacterTool
returns the character profile or lists the known names.

ProposeLoreTool and UpdatePlotTool stop implementing AgentTool until
their execute() lands (F07 this week, F06 next week).

Refs: F04
Co-Authored-By: Claude Opus 5.5 <noreply@anthropic.com>
Claude-Session: https://claude.ai/code/session_01WQ5gKVQXkP6gSc2ew2jXdc
</commit_message>
<xml_diff>
--- a/Stage2_Report.docx
+++ b/Stage2_Report.docx
@@ -896,11 +896,8 @@
           </w:tcPr>
           <w:p>
             <w:r>
-              <w:rPr>
-                <w:i/>
-                <w:color w:val="7F7F7F"/>
-              </w:rPr>
-              <w:t>[Not started]</w:t>
+              <w:rPr/>
+              <w:t>In progress (tools done)</w:t>
             </w:r>
           </w:p>
         </w:tc>
@@ -922,11 +919,8 @@
           </w:tcPr>
           <w:p>
             <w:r>
-              <w:rPr>
-                <w:i/>
-                <w:color w:val="7F7F7F"/>
-              </w:rPr>
-              <w:t>[-]</w:t>
+              <w:rPr/>
+              <w:t>-</w:t>
             </w:r>
           </w:p>
         </w:tc>
@@ -948,11 +942,8 @@
           </w:tcPr>
           <w:p>
             <w:r>
-              <w:rPr>
-                <w:i/>
-                <w:color w:val="7F7F7F"/>
-              </w:rPr>
-              <w:t>[-]</w:t>
+              <w:rPr/>
+              <w:t>-</w:t>
             </w:r>
           </w:p>
         </w:tc>
@@ -15118,6 +15109,99 @@
           </w:p>
         </w:tc>
       </w:tr>
+      <w:tr>
+        <w:trPr>
+          <w:cantSplit/>
+        </w:trPr>
+        <w:tc>
+          <w:tcPr>
+            <w:tcW w:w="1900" w:type="dxa"/>
+            <w:tcBorders>
+              <w:top w:val="single" w:sz="4" w:space="0" w:color="BFBFBF"/>
+              <w:left w:val="single" w:sz="4" w:space="0" w:color="BFBFBF"/>
+              <w:bottom w:val="single" w:sz="4" w:space="0" w:color="BFBFBF"/>
+              <w:right w:val="single" w:sz="4" w:space="0" w:color="BFBFBF"/>
+            </w:tcBorders>
+            <w:tcMar>
+              <w:top w:w="70" w:type="dxa"/>
+              <w:left w:w="110" w:type="dxa"/>
+              <w:bottom w:w="70" w:type="dxa"/>
+              <w:right w:w="110" w:type="dxa"/>
+            </w:tcMar>
+          </w:tcPr>
+          <w:p>
+            <w:r>
+              <w:t>F04</w:t>
+            </w:r>
+          </w:p>
+        </w:tc>
+        <w:tc>
+          <w:tcPr>
+            <w:tcW w:w="2500" w:type="dxa"/>
+            <w:tcBorders>
+              <w:top w:val="single" w:sz="4" w:space="0" w:color="BFBFBF"/>
+              <w:left w:val="single" w:sz="4" w:space="0" w:color="BFBFBF"/>
+              <w:bottom w:val="single" w:sz="4" w:space="0" w:color="BFBFBF"/>
+              <w:right w:val="single" w:sz="4" w:space="0" w:color="BFBFBF"/>
+            </w:tcBorders>
+            <w:tcMar>
+              <w:top w:w="70" w:type="dxa"/>
+              <w:left w:w="110" w:type="dxa"/>
+              <w:bottom w:w="70" w:type="dxa"/>
+              <w:right w:w="110" w:type="dxa"/>
+            </w:tcMar>
+          </w:tcPr>
+          <w:p>
+            <w:r>
+              <w:t>AgentTool gains getDescription; ToolCall gains id; ToolResult gains loreIds; schemas() returns LLMToolSpec</w:t>
+            </w:r>
+          </w:p>
+        </w:tc>
+        <w:tc>
+          <w:tcPr>
+            <w:tcW w:w="2480" w:type="dxa"/>
+            <w:tcBorders>
+              <w:top w:val="single" w:sz="4" w:space="0" w:color="BFBFBF"/>
+              <w:left w:val="single" w:sz="4" w:space="0" w:color="BFBFBF"/>
+              <w:bottom w:val="single" w:sz="4" w:space="0" w:color="BFBFBF"/>
+              <w:right w:val="single" w:sz="4" w:space="0" w:color="BFBFBF"/>
+            </w:tcBorders>
+            <w:tcMar>
+              <w:top w:w="70" w:type="dxa"/>
+              <w:left w:w="110" w:type="dxa"/>
+              <w:bottom w:w="70" w:type="dxa"/>
+              <w:right w:w="110" w:type="dxa"/>
+            </w:tcMar>
+          </w:tcPr>
+          <w:p>
+            <w:r>
+              <w:t>The API needs descriptions and call ids; the turn must record the lore it used</w:t>
+            </w:r>
+          </w:p>
+        </w:tc>
+        <w:tc>
+          <w:tcPr>
+            <w:tcW w:w="2480" w:type="dxa"/>
+            <w:tcBorders>
+              <w:top w:val="single" w:sz="4" w:space="0" w:color="BFBFBF"/>
+              <w:left w:val="single" w:sz="4" w:space="0" w:color="BFBFBF"/>
+              <w:bottom w:val="single" w:sz="4" w:space="0" w:color="BFBFBF"/>
+              <w:right w:val="single" w:sz="4" w:space="0" w:color="BFBFBF"/>
+            </w:tcBorders>
+            <w:tcMar>
+              <w:top w:w="70" w:type="dxa"/>
+              <w:left w:w="110" w:type="dxa"/>
+              <w:bottom w:w="70" w:type="dxa"/>
+              <w:right w:w="110" w:type="dxa"/>
+            </w:tcMar>
+          </w:tcPr>
+          <w:p>
+            <w:r>
+              <w:t>UC04; agent.tools; Facade</w:t>
+            </w:r>
+          </w:p>
+        </w:tc>
+      </w:tr>
     </w:tbl>
     <w:p>
       <w:pPr>
@@ -17310,6 +17394,445 @@
           <w:p>
             <w:r>
               <w:t>c749429 (https://github.com/Polarralop/EECS3311Project/commit/c749429): feat(controller): expose lore, characters and save/load in StoryCLI</w:t>
+            </w:r>
+          </w:p>
+        </w:tc>
+      </w:tr>
+    </w:tbl>
+    <w:p>
+      <w:pPr>
+        <w:spacing w:after="0"/>
+      </w:pPr>
+    </w:p>
+    <w:tbl>
+      <w:tblPr>
+        <w:tblLook w:firstColumn="1" w:firstRow="1" w:lastColumn="0" w:lastRow="0" w:noHBand="0" w:noVBand="1" w:val="04A0"/>
+        <w:tblW w:w="9360" w:type="dxa"/>
+      </w:tblPr>
+      <w:tblGrid>
+        <w:gridCol w:w="2500"/>
+        <w:gridCol w:w="6860"/>
+      </w:tblGrid>
+      <w:tr>
+        <w:trPr>
+          <w:cantSplit/>
+        </w:trPr>
+        <w:tc>
+          <w:tcPr>
+            <w:tcW w:w="2500" w:type="dxa"/>
+            <w:tcBorders>
+              <w:top w:val="single" w:sz="4" w:space="0" w:color="BFBFBF"/>
+              <w:left w:val="single" w:sz="4" w:space="0" w:color="BFBFBF"/>
+              <w:bottom w:val="single" w:sz="4" w:space="0" w:color="BFBFBF"/>
+              <w:right w:val="single" w:sz="4" w:space="0" w:color="BFBFBF"/>
+            </w:tcBorders>
+            <w:shd w:val="clear" w:color="auto" w:fill="F2F2F2"/>
+            <w:tcMar>
+              <w:top w:w="70" w:type="dxa"/>
+              <w:left w:w="110" w:type="dxa"/>
+              <w:bottom w:w="70" w:type="dxa"/>
+              <w:right w:w="110" w:type="dxa"/>
+            </w:tcMar>
+          </w:tcPr>
+          <w:p>
+            <w:r>
+              <w:rPr>
+                <w:b/>
+              </w:rPr>
+              <w:t>Original ID</w:t>
+            </w:r>
+          </w:p>
+        </w:tc>
+        <w:tc>
+          <w:tcPr>
+            <w:tcW w:w="6860" w:type="dxa"/>
+            <w:tcBorders>
+              <w:top w:val="single" w:sz="4" w:space="0" w:color="BFBFBF"/>
+              <w:left w:val="single" w:sz="4" w:space="0" w:color="BFBFBF"/>
+              <w:bottom w:val="single" w:sz="4" w:space="0" w:color="BFBFBF"/>
+              <w:right w:val="single" w:sz="4" w:space="0" w:color="BFBFBF"/>
+            </w:tcBorders>
+            <w:tcMar>
+              <w:top w:w="70" w:type="dxa"/>
+              <w:left w:w="110" w:type="dxa"/>
+              <w:bottom w:w="70" w:type="dxa"/>
+              <w:right w:w="110" w:type="dxa"/>
+            </w:tcMar>
+          </w:tcPr>
+          <w:p>
+            <w:r>
+              <w:t>F04: Tool types carry what the agent loop needs</w:t>
+            </w:r>
+          </w:p>
+        </w:tc>
+      </w:tr>
+      <w:tr>
+        <w:trPr>
+          <w:cantSplit/>
+        </w:trPr>
+        <w:tc>
+          <w:tcPr>
+            <w:tcW w:w="2500" w:type="dxa"/>
+            <w:tcBorders>
+              <w:top w:val="single" w:sz="4" w:space="0" w:color="BFBFBF"/>
+              <w:left w:val="single" w:sz="4" w:space="0" w:color="BFBFBF"/>
+              <w:bottom w:val="single" w:sz="4" w:space="0" w:color="BFBFBF"/>
+              <w:right w:val="single" w:sz="4" w:space="0" w:color="BFBFBF"/>
+            </w:tcBorders>
+            <w:shd w:val="clear" w:color="auto" w:fill="F2F2F2"/>
+            <w:tcMar>
+              <w:top w:w="70" w:type="dxa"/>
+              <w:left w:w="110" w:type="dxa"/>
+              <w:bottom w:w="70" w:type="dxa"/>
+              <w:right w:w="110" w:type="dxa"/>
+            </w:tcMar>
+          </w:tcPr>
+          <w:p>
+            <w:r>
+              <w:rPr>
+                <w:b/>
+              </w:rPr>
+              <w:t>Original (Stage 1)</w:t>
+            </w:r>
+          </w:p>
+        </w:tc>
+        <w:tc>
+          <w:tcPr>
+            <w:tcW w:w="6860" w:type="dxa"/>
+            <w:tcBorders>
+              <w:top w:val="single" w:sz="4" w:space="0" w:color="BFBFBF"/>
+              <w:left w:val="single" w:sz="4" w:space="0" w:color="BFBFBF"/>
+              <w:bottom w:val="single" w:sz="4" w:space="0" w:color="BFBFBF"/>
+              <w:right w:val="single" w:sz="4" w:space="0" w:color="BFBFBF"/>
+            </w:tcBorders>
+            <w:tcMar>
+              <w:top w:w="70" w:type="dxa"/>
+              <w:left w:w="110" w:type="dxa"/>
+              <w:bottom w:w="70" w:type="dxa"/>
+              <w:right w:w="110" w:type="dxa"/>
+            </w:tcMar>
+          </w:tcPr>
+          <w:p>
+            <w:r>
+              <w:t>AgentTool has getName(), getSchema() and execute(args, session); ToolCall(toolName, arguments); ToolResult(success, content); ToolRegistry.schemas(): List&lt;String&gt;.</w:t>
+            </w:r>
+          </w:p>
+        </w:tc>
+      </w:tr>
+      <w:tr>
+        <w:trPr>
+          <w:cantSplit/>
+        </w:trPr>
+        <w:tc>
+          <w:tcPr>
+            <w:tcW w:w="2500" w:type="dxa"/>
+            <w:tcBorders>
+              <w:top w:val="single" w:sz="4" w:space="0" w:color="BFBFBF"/>
+              <w:left w:val="single" w:sz="4" w:space="0" w:color="BFBFBF"/>
+              <w:bottom w:val="single" w:sz="4" w:space="0" w:color="BFBFBF"/>
+              <w:right w:val="single" w:sz="4" w:space="0" w:color="BFBFBF"/>
+            </w:tcBorders>
+            <w:shd w:val="clear" w:color="auto" w:fill="F2F2F2"/>
+            <w:tcMar>
+              <w:top w:w="70" w:type="dxa"/>
+              <w:left w:w="110" w:type="dxa"/>
+              <w:bottom w:w="70" w:type="dxa"/>
+              <w:right w:w="110" w:type="dxa"/>
+            </w:tcMar>
+          </w:tcPr>
+          <w:p>
+            <w:r>
+              <w:rPr>
+                <w:b/>
+              </w:rPr>
+              <w:t>Implemented</w:t>
+            </w:r>
+          </w:p>
+        </w:tc>
+        <w:tc>
+          <w:tcPr>
+            <w:tcW w:w="6860" w:type="dxa"/>
+            <w:tcBorders>
+              <w:top w:val="single" w:sz="4" w:space="0" w:color="BFBFBF"/>
+              <w:left w:val="single" w:sz="4" w:space="0" w:color="BFBFBF"/>
+              <w:bottom w:val="single" w:sz="4" w:space="0" w:color="BFBFBF"/>
+              <w:right w:val="single" w:sz="4" w:space="0" w:color="BFBFBF"/>
+            </w:tcBorders>
+            <w:tcMar>
+              <w:top w:w="70" w:type="dxa"/>
+              <w:left w:w="110" w:type="dxa"/>
+              <w:bottom w:w="70" w:type="dxa"/>
+              <w:right w:w="110" w:type="dxa"/>
+            </w:tcMar>
+          </w:tcPr>
+          <w:p>
+            <w:r>
+              <w:t>AgentTool also has getDescription(). ToolCall is a record with the model's call id as well. ToolResult is a record with loreIds, the lore entries the result showed the model. ToolRegistry.schemas() returns List&lt;LLMToolSpec&gt;. The registry reads each tool's required arguments from its schema and rejects a call missing one before the tool runs; an unknown tool or a tool that throws becomes a failed ToolResult.</w:t>
+            </w:r>
+          </w:p>
+        </w:tc>
+      </w:tr>
+      <w:tr>
+        <w:trPr>
+          <w:cantSplit/>
+        </w:trPr>
+        <w:tc>
+          <w:tcPr>
+            <w:tcW w:w="2500" w:type="dxa"/>
+            <w:tcBorders>
+              <w:top w:val="single" w:sz="4" w:space="0" w:color="BFBFBF"/>
+              <w:left w:val="single" w:sz="4" w:space="0" w:color="BFBFBF"/>
+              <w:bottom w:val="single" w:sz="4" w:space="0" w:color="BFBFBF"/>
+              <w:right w:val="single" w:sz="4" w:space="0" w:color="BFBFBF"/>
+            </w:tcBorders>
+            <w:shd w:val="clear" w:color="auto" w:fill="F2F2F2"/>
+            <w:tcMar>
+              <w:top w:w="70" w:type="dxa"/>
+              <w:left w:w="110" w:type="dxa"/>
+              <w:bottom w:w="70" w:type="dxa"/>
+              <w:right w:w="110" w:type="dxa"/>
+            </w:tcMar>
+          </w:tcPr>
+          <w:p>
+            <w:r>
+              <w:rPr>
+                <w:b/>
+              </w:rPr>
+              <w:t>What Changed and Why</w:t>
+            </w:r>
+          </w:p>
+        </w:tc>
+        <w:tc>
+          <w:tcPr>
+            <w:tcW w:w="6860" w:type="dxa"/>
+            <w:tcBorders>
+              <w:top w:val="single" w:sz="4" w:space="0" w:color="BFBFBF"/>
+              <w:left w:val="single" w:sz="4" w:space="0" w:color="BFBFBF"/>
+              <w:bottom w:val="single" w:sz="4" w:space="0" w:color="BFBFBF"/>
+              <w:right w:val="single" w:sz="4" w:space="0" w:color="BFBFBF"/>
+            </w:tcBorders>
+            <w:tcMar>
+              <w:top w:w="70" w:type="dxa"/>
+              <w:left w:w="110" w:type="dxa"/>
+              <w:bottom w:w="70" w:type="dxa"/>
+              <w:right w:w="110" w:type="dxa"/>
+            </w:tcMar>
+          </w:tcPr>
+          <w:p>
+            <w:r>
+              <w:t>The Messages API needs a description and an id per tool call, and F04's "record of which lore entries were used" needs the tool result to say which entries it returned.</w:t>
+            </w:r>
+          </w:p>
+        </w:tc>
+      </w:tr>
+      <w:tr>
+        <w:trPr>
+          <w:cantSplit/>
+        </w:trPr>
+        <w:tc>
+          <w:tcPr>
+            <w:tcW w:w="2500" w:type="dxa"/>
+            <w:tcBorders>
+              <w:top w:val="single" w:sz="4" w:space="0" w:color="BFBFBF"/>
+              <w:left w:val="single" w:sz="4" w:space="0" w:color="BFBFBF"/>
+              <w:bottom w:val="single" w:sz="4" w:space="0" w:color="BFBFBF"/>
+              <w:right w:val="single" w:sz="4" w:space="0" w:color="BFBFBF"/>
+            </w:tcBorders>
+            <w:shd w:val="clear" w:color="auto" w:fill="F2F2F2"/>
+            <w:tcMar>
+              <w:top w:w="70" w:type="dxa"/>
+              <w:left w:w="110" w:type="dxa"/>
+              <w:bottom w:w="70" w:type="dxa"/>
+              <w:right w:w="110" w:type="dxa"/>
+            </w:tcMar>
+          </w:tcPr>
+          <w:p>
+            <w:r>
+              <w:rPr>
+                <w:b/>
+              </w:rPr>
+              <w:t>How the User Need Is Still Met</w:t>
+            </w:r>
+          </w:p>
+        </w:tc>
+        <w:tc>
+          <w:tcPr>
+            <w:tcW w:w="6860" w:type="dxa"/>
+            <w:tcBorders>
+              <w:top w:val="single" w:sz="4" w:space="0" w:color="BFBFBF"/>
+              <w:left w:val="single" w:sz="4" w:space="0" w:color="BFBFBF"/>
+              <w:bottom w:val="single" w:sz="4" w:space="0" w:color="BFBFBF"/>
+              <w:right w:val="single" w:sz="4" w:space="0" w:color="BFBFBF"/>
+            </w:tcBorders>
+            <w:tcMar>
+              <w:top w:w="70" w:type="dxa"/>
+              <w:left w:w="110" w:type="dxa"/>
+              <w:bottom w:w="70" w:type="dxa"/>
+              <w:right w:w="110" w:type="dxa"/>
+            </w:tcMar>
+          </w:tcPr>
+          <w:p>
+            <w:r>
+              <w:t>The agent still reaches the story only through validated tool calls, and an invalid request is reported back to the agent while the turn continues (UC04 4b).</w:t>
+            </w:r>
+          </w:p>
+        </w:tc>
+      </w:tr>
+      <w:tr>
+        <w:trPr>
+          <w:cantSplit/>
+        </w:trPr>
+        <w:tc>
+          <w:tcPr>
+            <w:tcW w:w="2500" w:type="dxa"/>
+            <w:tcBorders>
+              <w:top w:val="single" w:sz="4" w:space="0" w:color="BFBFBF"/>
+              <w:left w:val="single" w:sz="4" w:space="0" w:color="BFBFBF"/>
+              <w:bottom w:val="single" w:sz="4" w:space="0" w:color="BFBFBF"/>
+              <w:right w:val="single" w:sz="4" w:space="0" w:color="BFBFBF"/>
+            </w:tcBorders>
+            <w:shd w:val="clear" w:color="auto" w:fill="F2F2F2"/>
+            <w:tcMar>
+              <w:top w:w="70" w:type="dxa"/>
+              <w:left w:w="110" w:type="dxa"/>
+              <w:bottom w:w="70" w:type="dxa"/>
+              <w:right w:w="110" w:type="dxa"/>
+            </w:tcMar>
+          </w:tcPr>
+          <w:p>
+            <w:r>
+              <w:rPr>
+                <w:b/>
+              </w:rPr>
+              <w:t>Affected Use Cases / Classes / Methods / Patterns</w:t>
+            </w:r>
+          </w:p>
+        </w:tc>
+        <w:tc>
+          <w:tcPr>
+            <w:tcW w:w="6860" w:type="dxa"/>
+            <w:tcBorders>
+              <w:top w:val="single" w:sz="4" w:space="0" w:color="BFBFBF"/>
+              <w:left w:val="single" w:sz="4" w:space="0" w:color="BFBFBF"/>
+              <w:bottom w:val="single" w:sz="4" w:space="0" w:color="BFBFBF"/>
+              <w:right w:val="single" w:sz="4" w:space="0" w:color="BFBFBF"/>
+            </w:tcBorders>
+            <w:tcMar>
+              <w:top w:w="70" w:type="dxa"/>
+              <w:left w:w="110" w:type="dxa"/>
+              <w:bottom w:w="70" w:type="dxa"/>
+              <w:right w:w="110" w:type="dxa"/>
+            </w:tcMar>
+          </w:tcPr>
+          <w:p>
+            <w:r>
+              <w:t>UC04; AgentTool, ToolCall, ToolResult, ToolRegistry, SearchLoreTool, GetCharacterTool; Facade (subsystem).</w:t>
+            </w:r>
+          </w:p>
+        </w:tc>
+      </w:tr>
+      <w:tr>
+        <w:trPr>
+          <w:cantSplit/>
+        </w:trPr>
+        <w:tc>
+          <w:tcPr>
+            <w:tcW w:w="2500" w:type="dxa"/>
+            <w:tcBorders>
+              <w:top w:val="single" w:sz="4" w:space="0" w:color="BFBFBF"/>
+              <w:left w:val="single" w:sz="4" w:space="0" w:color="BFBFBF"/>
+              <w:bottom w:val="single" w:sz="4" w:space="0" w:color="BFBFBF"/>
+              <w:right w:val="single" w:sz="4" w:space="0" w:color="BFBFBF"/>
+            </w:tcBorders>
+            <w:shd w:val="clear" w:color="auto" w:fill="F2F2F2"/>
+            <w:tcMar>
+              <w:top w:w="70" w:type="dxa"/>
+              <w:left w:w="110" w:type="dxa"/>
+              <w:bottom w:w="70" w:type="dxa"/>
+              <w:right w:w="110" w:type="dxa"/>
+            </w:tcMar>
+          </w:tcPr>
+          <w:p>
+            <w:r>
+              <w:rPr>
+                <w:b/>
+              </w:rPr>
+              <w:t>Diagrams Updated</w:t>
+            </w:r>
+          </w:p>
+        </w:tc>
+        <w:tc>
+          <w:tcPr>
+            <w:tcW w:w="6860" w:type="dxa"/>
+            <w:tcBorders>
+              <w:top w:val="single" w:sz="4" w:space="0" w:color="BFBFBF"/>
+              <w:left w:val="single" w:sz="4" w:space="0" w:color="BFBFBF"/>
+              <w:bottom w:val="single" w:sz="4" w:space="0" w:color="BFBFBF"/>
+              <w:right w:val="single" w:sz="4" w:space="0" w:color="BFBFBF"/>
+            </w:tcBorders>
+            <w:tcMar>
+              <w:top w:w="70" w:type="dxa"/>
+              <w:left w:w="110" w:type="dxa"/>
+              <w:bottom w:w="70" w:type="dxa"/>
+              <w:right w:w="110" w:type="dxa"/>
+            </w:tcMar>
+          </w:tcPr>
+          <w:p>
+            <w:r>
+              <w:t>figures/class-diagram/07-agent-tools.png (redrawn under figures/stage2/).</w:t>
+            </w:r>
+          </w:p>
+        </w:tc>
+      </w:tr>
+      <w:tr>
+        <w:trPr>
+          <w:cantSplit/>
+        </w:trPr>
+        <w:tc>
+          <w:tcPr>
+            <w:tcW w:w="2500" w:type="dxa"/>
+            <w:tcBorders>
+              <w:top w:val="single" w:sz="4" w:space="0" w:color="BFBFBF"/>
+              <w:left w:val="single" w:sz="4" w:space="0" w:color="BFBFBF"/>
+              <w:bottom w:val="single" w:sz="4" w:space="0" w:color="BFBFBF"/>
+              <w:right w:val="single" w:sz="4" w:space="0" w:color="BFBFBF"/>
+            </w:tcBorders>
+            <w:shd w:val="clear" w:color="auto" w:fill="F2F2F2"/>
+            <w:tcMar>
+              <w:top w:w="70" w:type="dxa"/>
+              <w:left w:w="110" w:type="dxa"/>
+              <w:bottom w:w="70" w:type="dxa"/>
+              <w:right w:w="110" w:type="dxa"/>
+            </w:tcMar>
+          </w:tcPr>
+          <w:p>
+            <w:r>
+              <w:rPr>
+                <w:b/>
+              </w:rPr>
+              <w:t>Commit(s)</w:t>
+            </w:r>
+          </w:p>
+        </w:tc>
+        <w:tc>
+          <w:tcPr>
+            <w:tcW w:w="6860" w:type="dxa"/>
+            <w:tcBorders>
+              <w:top w:val="single" w:sz="4" w:space="0" w:color="BFBFBF"/>
+              <w:left w:val="single" w:sz="4" w:space="0" w:color="BFBFBF"/>
+              <w:bottom w:val="single" w:sz="4" w:space="0" w:color="BFBFBF"/>
+              <w:right w:val="single" w:sz="4" w:space="0" w:color="BFBFBF"/>
+            </w:tcBorders>
+            <w:tcMar>
+              <w:top w:w="70" w:type="dxa"/>
+              <w:left w:w="110" w:type="dxa"/>
+              <w:bottom w:w="70" w:type="dxa"/>
+              <w:right w:w="110" w:type="dxa"/>
+            </w:tcMar>
+          </w:tcPr>
+          <w:p>
+            <w:r>
+              <w:t>feat(tools): register SearchLoreTool and GetCharacterTool in ToolRegistry</w:t>
             </w:r>
           </w:p>
         </w:tc>
@@ -18852,6 +19375,99 @@
           </w:p>
         </w:tc>
       </w:tr>
+      <w:tr>
+        <w:trPr>
+          <w:cantSplit/>
+        </w:trPr>
+        <w:tc>
+          <w:tcPr>
+            <w:tcW w:w="600" w:type="dxa"/>
+            <w:tcBorders>
+              <w:top w:val="single" w:sz="4" w:space="0" w:color="BFBFBF"/>
+              <w:left w:val="single" w:sz="4" w:space="0" w:color="BFBFBF"/>
+              <w:bottom w:val="single" w:sz="4" w:space="0" w:color="BFBFBF"/>
+              <w:right w:val="single" w:sz="4" w:space="0" w:color="BFBFBF"/>
+            </w:tcBorders>
+            <w:tcMar>
+              <w:top w:w="70" w:type="dxa"/>
+              <w:left w:w="110" w:type="dxa"/>
+              <w:bottom w:w="70" w:type="dxa"/>
+              <w:right w:w="110" w:type="dxa"/>
+            </w:tcMar>
+          </w:tcPr>
+          <w:p>
+            <w:r>
+              <w:t>7</w:t>
+            </w:r>
+          </w:p>
+        </w:tc>
+        <w:tc>
+          <w:tcPr>
+            <w:tcW w:w="2000" w:type="dxa"/>
+            <w:tcBorders>
+              <w:top w:val="single" w:sz="4" w:space="0" w:color="BFBFBF"/>
+              <w:left w:val="single" w:sz="4" w:space="0" w:color="BFBFBF"/>
+              <w:bottom w:val="single" w:sz="4" w:space="0" w:color="BFBFBF"/>
+              <w:right w:val="single" w:sz="4" w:space="0" w:color="BFBFBF"/>
+            </w:tcBorders>
+            <w:tcMar>
+              <w:top w:w="70" w:type="dxa"/>
+              <w:left w:w="110" w:type="dxa"/>
+              <w:bottom w:w="70" w:type="dxa"/>
+              <w:right w:w="110" w:type="dxa"/>
+            </w:tcMar>
+          </w:tcPr>
+          <w:p>
+            <w:r>
+              <w:t>2990b8f (https://github.com/Polarralop/EECS3311Project/commit/2990b8f)</w:t>
+            </w:r>
+          </w:p>
+        </w:tc>
+        <w:tc>
+          <w:tcPr>
+            <w:tcW w:w="5160" w:type="dxa"/>
+            <w:tcBorders>
+              <w:top w:val="single" w:sz="4" w:space="0" w:color="BFBFBF"/>
+              <w:left w:val="single" w:sz="4" w:space="0" w:color="BFBFBF"/>
+              <w:bottom w:val="single" w:sz="4" w:space="0" w:color="BFBFBF"/>
+              <w:right w:val="single" w:sz="4" w:space="0" w:color="BFBFBF"/>
+            </w:tcBorders>
+            <w:tcMar>
+              <w:top w:w="70" w:type="dxa"/>
+              <w:left w:w="110" w:type="dxa"/>
+              <w:bottom w:w="70" w:type="dxa"/>
+              <w:right w:w="110" w:type="dxa"/>
+            </w:tcMar>
+          </w:tcPr>
+          <w:p>
+            <w:r>
+              <w:t>feat(ui): manage lore, characters and saves in StoryGUI</w:t>
+            </w:r>
+          </w:p>
+        </w:tc>
+        <w:tc>
+          <w:tcPr>
+            <w:tcW w:w="1600" w:type="dxa"/>
+            <w:tcBorders>
+              <w:top w:val="single" w:sz="4" w:space="0" w:color="BFBFBF"/>
+              <w:left w:val="single" w:sz="4" w:space="0" w:color="BFBFBF"/>
+              <w:bottom w:val="single" w:sz="4" w:space="0" w:color="BFBFBF"/>
+              <w:right w:val="single" w:sz="4" w:space="0" w:color="BFBFBF"/>
+            </w:tcBorders>
+            <w:tcMar>
+              <w:top w:w="70" w:type="dxa"/>
+              <w:left w:w="110" w:type="dxa"/>
+              <w:bottom w:w="70" w:type="dxa"/>
+              <w:right w:w="110" w:type="dxa"/>
+            </w:tcMar>
+          </w:tcPr>
+          <w:p>
+            <w:r>
+              <w:t>F02, F03, F11 (MVC, Observer)</w:t>
+            </w:r>
+          </w:p>
+        </w:tc>
+      </w:tr>
     </w:tbl>
     <w:p>
       <w:pPr>
@@ -18863,7 +19479,7 @@
         <w:spacing w:after="120"/>
       </w:pPr>
       <w:r>
-        <w:t>Count so far: 6 meaningful code commits on Oct 20 (the GUI commit that adds this table is the 7th and is logged in the next commit).</w:t>
+        <w:t>Count: 7 meaningful code commits, all on Oct 20.</w:t>
       </w:r>
     </w:p>
     <w:p>

</xml_diff>

<commit_message>
feat(agent): run the tool-use loop in StoryAgent.takeTurn
StoryAgent.takeTurn frames the input with the chosen InputModeStrategy
(Do, Say or Story), adds the scenario, the known characters, the story
so far from MemoryManager.buildContext and the hidden plot guidance
from PlotPlanner.planStep, then runs the tool-use loop: every tool call
goes through ToolRegistry and its result back to the model until the
model answers with narration. Lore ids returned by successful lookups
are recorded on the Turn. A refusal, empty narration or more than
eight rounds is an LLMException, and no turn is produced.

planStep builds its guidance from the plot rather than with a second
model call (logged in changes-from-stage1). The system prompt lives in
prompts/system.txt. Tests use FakeLLMClient only.

Refs: F04, F06
Co-Authored-By: Claude Opus 5.5 <noreply@anthropic.com>
Claude-Session: https://claude.ai/code/session_01WQ5gKVQXkP6gSc2ew2jXdc
</commit_message>
<xml_diff>
--- a/Stage2_Report.docx
+++ b/Stage2_Report.docx
@@ -897,7 +897,7 @@
           <w:p>
             <w:r>
               <w:rPr/>
-              <w:t>In progress (tools done)</w:t>
+              <w:t>In progress (agent loop done)</w:t>
             </w:r>
           </w:p>
         </w:tc>
@@ -12923,11 +12923,8 @@
           </w:tcPr>
           <w:p>
             <w:r>
-              <w:rPr>
-                <w:i/>
-                <w:color w:val="7F7F7F"/>
-              </w:rPr>
-              <w:t>[The concrete design problem in this app that the pattern solves.]</w:t>
+              <w:rPr/>
+              <w:t>Do, Say and Story input go through exactly the same turn (context, plot guidance, tool loop, narration); only the way the input is worded for the model differs, and the user picks the mode again on every turn.</w:t>
             </w:r>
           </w:p>
         </w:tc>
@@ -12980,11 +12977,8 @@
           </w:tcPr>
           <w:p>
             <w:r>
-              <w:rPr>
-                <w:i/>
-                <w:color w:val="7F7F7F"/>
-              </w:rPr>
-              <w:t>[Stage 1: Strategy: InputModeStrategy. Concrete strategies: DoModeStrategy, SayModeStrategy, StoryModeStrategy. Context: StoryAgent; StoryController selects the strategy by mode. Replace with the implemented roles.]</w:t>
+              <w:rPr/>
+              <w:t>Strategy: InputModeStrategy (getName, frame). Concrete strategies: DoModeStrategy, SayModeStrategy, StoryModeStrategy. Context: StoryAgent, whose takeTurn(session, input, mode) calls mode.frame(input) and stores mode.getName() on the Turn. Client: StoryController, which picks the strategy from the mode name the user chose.</w:t>
             </w:r>
           </w:p>
         </w:tc>
@@ -13037,11 +13031,8 @@
           </w:tcPr>
           <w:p>
             <w:r>
-              <w:rPr>
-                <w:i/>
-                <w:color w:val="7F7F7F"/>
-              </w:rPr>
-              <w:t>[File paths and the methods where the pattern is visible.]</w:t>
+              <w:rPr/>
+              <w:t>src/main/java/ca/yorku/storyteller/agent/InputModeStrategy.java: String getName(), String frame(String input). DoModeStrategy.java, SayModeStrategy.java, StoryModeStrategy.java: frame(input). src/main/java/ca/yorku/storyteller/agent/StoryAgent.java: takeTurn(StorySession, String, InputModeStrategy), buildTurnPrompt(...).</w:t>
             </w:r>
           </w:p>
         </w:tc>
@@ -13094,11 +13085,8 @@
           </w:tcPr>
           <w:p>
             <w:r>
-              <w:rPr>
-                <w:i/>
-                <w:color w:val="7F7F7F"/>
-              </w:rPr>
-              <w:t>[Why this pattern, and what the code would look like without it.]</w:t>
+              <w:rPr/>
+              <w:t>Each mode is a small object with one varying step, so takeTurn has no branch on the mode name and a new mode is one new class. Without it, StoryAgent would switch on "Do"/"Say"/"Story" wherever the input is worded, and the retry in F10 would have to remember a string and repeat the switch.</w:t>
             </w:r>
           </w:p>
         </w:tc>
@@ -13151,11 +13139,8 @@
           </w:tcPr>
           <w:p>
             <w:r>
-              <w:rPr>
-                <w:i/>
-                <w:color w:val="7F7F7F"/>
-              </w:rPr>
-              <w:t>[Matches the Stage 1 design / changed (see Section 4).]</w:t>
+              <w:rPr/>
+              <w:t>Matches the Stage 1 design (getName and frame as in the agent class diagram).</w:t>
             </w:r>
           </w:p>
         </w:tc>
@@ -15202,6 +15187,192 @@
           </w:p>
         </w:tc>
       </w:tr>
+      <w:tr>
+        <w:trPr>
+          <w:cantSplit/>
+        </w:trPr>
+        <w:tc>
+          <w:tcPr>
+            <w:tcW w:w="1900" w:type="dxa"/>
+            <w:tcBorders>
+              <w:top w:val="single" w:sz="4" w:space="0" w:color="BFBFBF"/>
+              <w:left w:val="single" w:sz="4" w:space="0" w:color="BFBFBF"/>
+              <w:bottom w:val="single" w:sz="4" w:space="0" w:color="BFBFBF"/>
+              <w:right w:val="single" w:sz="4" w:space="0" w:color="BFBFBF"/>
+            </w:tcBorders>
+            <w:tcMar>
+              <w:top w:w="70" w:type="dxa"/>
+              <w:left w:w="110" w:type="dxa"/>
+              <w:bottom w:w="70" w:type="dxa"/>
+              <w:right w:w="110" w:type="dxa"/>
+            </w:tcMar>
+          </w:tcPr>
+          <w:p>
+            <w:r>
+              <w:t>F04/F06</w:t>
+            </w:r>
+          </w:p>
+        </w:tc>
+        <w:tc>
+          <w:tcPr>
+            <w:tcW w:w="2500" w:type="dxa"/>
+            <w:tcBorders>
+              <w:top w:val="single" w:sz="4" w:space="0" w:color="BFBFBF"/>
+              <w:left w:val="single" w:sz="4" w:space="0" w:color="BFBFBF"/>
+              <w:bottom w:val="single" w:sz="4" w:space="0" w:color="BFBFBF"/>
+              <w:right w:val="single" w:sz="4" w:space="0" w:color="BFBFBF"/>
+            </w:tcBorders>
+            <w:tcMar>
+              <w:top w:w="70" w:type="dxa"/>
+              <w:left w:w="110" w:type="dxa"/>
+              <w:bottom w:w="70" w:type="dxa"/>
+              <w:right w:w="110" w:type="dxa"/>
+            </w:tcMar>
+          </w:tcPr>
+          <w:p>
+            <w:r>
+              <w:t>PlotPlanner.planStep builds the guidance from the plot; no second model call</w:t>
+            </w:r>
+          </w:p>
+        </w:tc>
+        <w:tc>
+          <w:tcPr>
+            <w:tcW w:w="2480" w:type="dxa"/>
+            <w:tcBorders>
+              <w:top w:val="single" w:sz="4" w:space="0" w:color="BFBFBF"/>
+              <w:left w:val="single" w:sz="4" w:space="0" w:color="BFBFBF"/>
+              <w:bottom w:val="single" w:sz="4" w:space="0" w:color="BFBFBF"/>
+              <w:right w:val="single" w:sz="4" w:space="0" w:color="BFBFBF"/>
+            </w:tcBorders>
+            <w:tcMar>
+              <w:top w:w="70" w:type="dxa"/>
+              <w:left w:w="110" w:type="dxa"/>
+              <w:bottom w:w="70" w:type="dxa"/>
+              <w:right w:w="110" w:type="dxa"/>
+            </w:tcMar>
+          </w:tcPr>
+          <w:p>
+            <w:r>
+              <w:t>Halves the cost and latency of each turn; the narrating model still decides</w:t>
+            </w:r>
+          </w:p>
+        </w:tc>
+        <w:tc>
+          <w:tcPr>
+            <w:tcW w:w="2480" w:type="dxa"/>
+            <w:tcBorders>
+              <w:top w:val="single" w:sz="4" w:space="0" w:color="BFBFBF"/>
+              <w:left w:val="single" w:sz="4" w:space="0" w:color="BFBFBF"/>
+              <w:bottom w:val="single" w:sz="4" w:space="0" w:color="BFBFBF"/>
+              <w:right w:val="single" w:sz="4" w:space="0" w:color="BFBFBF"/>
+            </w:tcBorders>
+            <w:tcMar>
+              <w:top w:w="70" w:type="dxa"/>
+              <w:left w:w="110" w:type="dxa"/>
+              <w:bottom w:w="70" w:type="dxa"/>
+              <w:right w:w="110" w:type="dxa"/>
+            </w:tcMar>
+          </w:tcPr>
+          <w:p>
+            <w:r>
+              <w:t>UC04; PlotPlanner, StoryAgent; SD05</w:t>
+            </w:r>
+          </w:p>
+        </w:tc>
+      </w:tr>
+      <w:tr>
+        <w:trPr>
+          <w:cantSplit/>
+        </w:trPr>
+        <w:tc>
+          <w:tcPr>
+            <w:tcW w:w="1900" w:type="dxa"/>
+            <w:tcBorders>
+              <w:top w:val="single" w:sz="4" w:space="0" w:color="BFBFBF"/>
+              <w:left w:val="single" w:sz="4" w:space="0" w:color="BFBFBF"/>
+              <w:bottom w:val="single" w:sz="4" w:space="0" w:color="BFBFBF"/>
+              <w:right w:val="single" w:sz="4" w:space="0" w:color="BFBFBF"/>
+            </w:tcBorders>
+            <w:tcMar>
+              <w:top w:w="70" w:type="dxa"/>
+              <w:left w:w="110" w:type="dxa"/>
+              <w:bottom w:w="70" w:type="dxa"/>
+              <w:right w:w="110" w:type="dxa"/>
+            </w:tcMar>
+          </w:tcPr>
+          <w:p>
+            <w:r>
+              <w:t>F04</w:t>
+            </w:r>
+          </w:p>
+        </w:tc>
+        <w:tc>
+          <w:tcPr>
+            <w:tcW w:w="2500" w:type="dxa"/>
+            <w:tcBorders>
+              <w:top w:val="single" w:sz="4" w:space="0" w:color="BFBFBF"/>
+              <w:left w:val="single" w:sz="4" w:space="0" w:color="BFBFBF"/>
+              <w:bottom w:val="single" w:sz="4" w:space="0" w:color="BFBFBF"/>
+              <w:right w:val="single" w:sz="4" w:space="0" w:color="BFBFBF"/>
+            </w:tcBorders>
+            <w:tcMar>
+              <w:top w:w="70" w:type="dxa"/>
+              <w:left w:w="110" w:type="dxa"/>
+              <w:bottom w:w="70" w:type="dxa"/>
+              <w:right w:w="110" w:type="dxa"/>
+            </w:tcMar>
+          </w:tcPr>
+          <w:p>
+            <w:r>
+              <w:t>StoryAgent(llm, tools, planner, memory) and create(llm); runToolLoop capped at 8 calls and records lore used</w:t>
+            </w:r>
+          </w:p>
+        </w:tc>
+        <w:tc>
+          <w:tcPr>
+            <w:tcW w:w="2480" w:type="dxa"/>
+            <w:tcBorders>
+              <w:top w:val="single" w:sz="4" w:space="0" w:color="BFBFBF"/>
+              <w:left w:val="single" w:sz="4" w:space="0" w:color="BFBFBF"/>
+              <w:bottom w:val="single" w:sz="4" w:space="0" w:color="BFBFBF"/>
+              <w:right w:val="single" w:sz="4" w:space="0" w:color="BFBFBF"/>
+            </w:tcBorders>
+            <w:tcMar>
+              <w:top w:w="70" w:type="dxa"/>
+              <w:left w:w="110" w:type="dxa"/>
+              <w:bottom w:w="70" w:type="dxa"/>
+              <w:right w:w="110" w:type="dxa"/>
+            </w:tcMar>
+          </w:tcPr>
+          <w:p>
+            <w:r>
+              <w:t>A loop needs a bound; F04 records the lore used</w:t>
+            </w:r>
+          </w:p>
+        </w:tc>
+        <w:tc>
+          <w:tcPr>
+            <w:tcW w:w="2480" w:type="dxa"/>
+            <w:tcBorders>
+              <w:top w:val="single" w:sz="4" w:space="0" w:color="BFBFBF"/>
+              <w:left w:val="single" w:sz="4" w:space="0" w:color="BFBFBF"/>
+              <w:bottom w:val="single" w:sz="4" w:space="0" w:color="BFBFBF"/>
+              <w:right w:val="single" w:sz="4" w:space="0" w:color="BFBFBF"/>
+            </w:tcBorders>
+            <w:tcMar>
+              <w:top w:w="70" w:type="dxa"/>
+              <w:left w:w="110" w:type="dxa"/>
+              <w:bottom w:w="70" w:type="dxa"/>
+              <w:right w:w="110" w:type="dxa"/>
+            </w:tcMar>
+          </w:tcPr>
+          <w:p>
+            <w:r>
+              <w:t>UC04; StoryAgent; Facade, Strategy</w:t>
+            </w:r>
+          </w:p>
+        </w:tc>
+      </w:tr>
     </w:tbl>
     <w:p>
       <w:pPr>
@@ -17833,6 +18004,884 @@
           <w:p>
             <w:r>
               <w:t>feat(tools): register SearchLoreTool and GetCharacterTool in ToolRegistry</w:t>
+            </w:r>
+          </w:p>
+        </w:tc>
+      </w:tr>
+    </w:tbl>
+    <w:p>
+      <w:pPr>
+        <w:spacing w:after="0"/>
+      </w:pPr>
+    </w:p>
+    <w:tbl>
+      <w:tblPr>
+        <w:tblLook w:firstColumn="1" w:firstRow="1" w:lastColumn="0" w:lastRow="0" w:noHBand="0" w:noVBand="1" w:val="04A0"/>
+        <w:tblW w:w="9360" w:type="dxa"/>
+      </w:tblPr>
+      <w:tblGrid>
+        <w:gridCol w:w="2500"/>
+        <w:gridCol w:w="6860"/>
+      </w:tblGrid>
+      <w:tr>
+        <w:trPr>
+          <w:cantSplit/>
+        </w:trPr>
+        <w:tc>
+          <w:tcPr>
+            <w:tcW w:w="2500" w:type="dxa"/>
+            <w:tcBorders>
+              <w:top w:val="single" w:sz="4" w:space="0" w:color="BFBFBF"/>
+              <w:left w:val="single" w:sz="4" w:space="0" w:color="BFBFBF"/>
+              <w:bottom w:val="single" w:sz="4" w:space="0" w:color="BFBFBF"/>
+              <w:right w:val="single" w:sz="4" w:space="0" w:color="BFBFBF"/>
+            </w:tcBorders>
+            <w:shd w:val="clear" w:color="auto" w:fill="F2F2F2"/>
+            <w:tcMar>
+              <w:top w:w="70" w:type="dxa"/>
+              <w:left w:w="110" w:type="dxa"/>
+              <w:bottom w:w="70" w:type="dxa"/>
+              <w:right w:w="110" w:type="dxa"/>
+            </w:tcMar>
+          </w:tcPr>
+          <w:p>
+            <w:r>
+              <w:rPr>
+                <w:b/>
+              </w:rPr>
+              <w:t>Original ID</w:t>
+            </w:r>
+          </w:p>
+        </w:tc>
+        <w:tc>
+          <w:tcPr>
+            <w:tcW w:w="6860" w:type="dxa"/>
+            <w:tcBorders>
+              <w:top w:val="single" w:sz="4" w:space="0" w:color="BFBFBF"/>
+              <w:left w:val="single" w:sz="4" w:space="0" w:color="BFBFBF"/>
+              <w:bottom w:val="single" w:sz="4" w:space="0" w:color="BFBFBF"/>
+              <w:right w:val="single" w:sz="4" w:space="0" w:color="BFBFBF"/>
+            </w:tcBorders>
+            <w:tcMar>
+              <w:top w:w="70" w:type="dxa"/>
+              <w:left w:w="110" w:type="dxa"/>
+              <w:bottom w:w="70" w:type="dxa"/>
+              <w:right w:w="110" w:type="dxa"/>
+            </w:tcMar>
+          </w:tcPr>
+          <w:p>
+            <w:r>
+              <w:t>F04/F06: Steering guidance is built without a separate model call</w:t>
+            </w:r>
+          </w:p>
+        </w:tc>
+      </w:tr>
+      <w:tr>
+        <w:trPr>
+          <w:cantSplit/>
+        </w:trPr>
+        <w:tc>
+          <w:tcPr>
+            <w:tcW w:w="2500" w:type="dxa"/>
+            <w:tcBorders>
+              <w:top w:val="single" w:sz="4" w:space="0" w:color="BFBFBF"/>
+              <w:left w:val="single" w:sz="4" w:space="0" w:color="BFBFBF"/>
+              <w:bottom w:val="single" w:sz="4" w:space="0" w:color="BFBFBF"/>
+              <w:right w:val="single" w:sz="4" w:space="0" w:color="BFBFBF"/>
+            </w:tcBorders>
+            <w:shd w:val="clear" w:color="auto" w:fill="F2F2F2"/>
+            <w:tcMar>
+              <w:top w:w="70" w:type="dxa"/>
+              <w:left w:w="110" w:type="dxa"/>
+              <w:bottom w:w="70" w:type="dxa"/>
+              <w:right w:w="110" w:type="dxa"/>
+            </w:tcMar>
+          </w:tcPr>
+          <w:p>
+            <w:r>
+              <w:rPr>
+                <w:b/>
+              </w:rPr>
+              <w:t>Original (Stage 1)</w:t>
+            </w:r>
+          </w:p>
+        </w:tc>
+        <w:tc>
+          <w:tcPr>
+            <w:tcW w:w="6860" w:type="dxa"/>
+            <w:tcBorders>
+              <w:top w:val="single" w:sz="4" w:space="0" w:color="BFBFBF"/>
+              <w:left w:val="single" w:sz="4" w:space="0" w:color="BFBFBF"/>
+              <w:bottom w:val="single" w:sz="4" w:space="0" w:color="BFBFBF"/>
+              <w:right w:val="single" w:sz="4" w:space="0" w:color="BFBFBF"/>
+            </w:tcBorders>
+            <w:tcMar>
+              <w:top w:w="70" w:type="dxa"/>
+              <w:left w:w="110" w:type="dxa"/>
+              <w:bottom w:w="70" w:type="dxa"/>
+              <w:right w:w="110" w:type="dxa"/>
+            </w:tcMar>
+          </w:tcPr>
+          <w:p>
+            <w:r>
+              <w:t>During a turn, PlotPlanner.planStep(session, input) sends the input, the recent story and the next pending event to the model and returns guidance, which then goes into the narration request.</w:t>
+            </w:r>
+          </w:p>
+        </w:tc>
+      </w:tr>
+      <w:tr>
+        <w:trPr>
+          <w:cantSplit/>
+        </w:trPr>
+        <w:tc>
+          <w:tcPr>
+            <w:tcW w:w="2500" w:type="dxa"/>
+            <w:tcBorders>
+              <w:top w:val="single" w:sz="4" w:space="0" w:color="BFBFBF"/>
+              <w:left w:val="single" w:sz="4" w:space="0" w:color="BFBFBF"/>
+              <w:bottom w:val="single" w:sz="4" w:space="0" w:color="BFBFBF"/>
+              <w:right w:val="single" w:sz="4" w:space="0" w:color="BFBFBF"/>
+            </w:tcBorders>
+            <w:shd w:val="clear" w:color="auto" w:fill="F2F2F2"/>
+            <w:tcMar>
+              <w:top w:w="70" w:type="dxa"/>
+              <w:left w:w="110" w:type="dxa"/>
+              <w:bottom w:w="70" w:type="dxa"/>
+              <w:right w:w="110" w:type="dxa"/>
+            </w:tcMar>
+          </w:tcPr>
+          <w:p>
+            <w:r>
+              <w:rPr>
+                <w:b/>
+              </w:rPr>
+              <w:t>Implemented</w:t>
+            </w:r>
+          </w:p>
+        </w:tc>
+        <w:tc>
+          <w:tcPr>
+            <w:tcW w:w="6860" w:type="dxa"/>
+            <w:tcBorders>
+              <w:top w:val="single" w:sz="4" w:space="0" w:color="BFBFBF"/>
+              <w:left w:val="single" w:sz="4" w:space="0" w:color="BFBFBF"/>
+              <w:bottom w:val="single" w:sz="4" w:space="0" w:color="BFBFBF"/>
+              <w:right w:val="single" w:sz="4" w:space="0" w:color="BFBFBF"/>
+            </w:tcBorders>
+            <w:tcMar>
+              <w:top w:w="70" w:type="dxa"/>
+              <w:left w:w="110" w:type="dxa"/>
+              <w:bottom w:w="70" w:type="dxa"/>
+              <w:right w:w="110" w:type="dxa"/>
+            </w:tcMar>
+          </w:tcPr>
+          <w:p>
+            <w:r>
+              <w:t>planStep builds the guidance from the plot itself: how many events are reached, the next pending event and an instruction to nudge back gradually; empty when there is no plan. The narration call receives it in a section marked hidden and decides whether to continue, nudge or (with UpdatePlotTool, F06) revise.</w:t>
+            </w:r>
+          </w:p>
+        </w:tc>
+      </w:tr>
+      <w:tr>
+        <w:trPr>
+          <w:cantSplit/>
+        </w:trPr>
+        <w:tc>
+          <w:tcPr>
+            <w:tcW w:w="2500" w:type="dxa"/>
+            <w:tcBorders>
+              <w:top w:val="single" w:sz="4" w:space="0" w:color="BFBFBF"/>
+              <w:left w:val="single" w:sz="4" w:space="0" w:color="BFBFBF"/>
+              <w:bottom w:val="single" w:sz="4" w:space="0" w:color="BFBFBF"/>
+              <w:right w:val="single" w:sz="4" w:space="0" w:color="BFBFBF"/>
+            </w:tcBorders>
+            <w:shd w:val="clear" w:color="auto" w:fill="F2F2F2"/>
+            <w:tcMar>
+              <w:top w:w="70" w:type="dxa"/>
+              <w:left w:w="110" w:type="dxa"/>
+              <w:bottom w:w="70" w:type="dxa"/>
+              <w:right w:w="110" w:type="dxa"/>
+            </w:tcMar>
+          </w:tcPr>
+          <w:p>
+            <w:r>
+              <w:rPr>
+                <w:b/>
+              </w:rPr>
+              <w:t>What Changed and Why</w:t>
+            </w:r>
+          </w:p>
+        </w:tc>
+        <w:tc>
+          <w:tcPr>
+            <w:tcW w:w="6860" w:type="dxa"/>
+            <w:tcBorders>
+              <w:top w:val="single" w:sz="4" w:space="0" w:color="BFBFBF"/>
+              <w:left w:val="single" w:sz="4" w:space="0" w:color="BFBFBF"/>
+              <w:bottom w:val="single" w:sz="4" w:space="0" w:color="BFBFBF"/>
+              <w:right w:val="single" w:sz="4" w:space="0" w:color="BFBFBF"/>
+            </w:tcBorders>
+            <w:tcMar>
+              <w:top w:w="70" w:type="dxa"/>
+              <w:left w:w="110" w:type="dxa"/>
+              <w:bottom w:w="70" w:type="dxa"/>
+              <w:right w:w="110" w:type="dxa"/>
+            </w:tcMar>
+          </w:tcPr>
+          <w:p>
+            <w:r>
+              <w:t>A second model call per turn would double the cost and latency of every turn for a decision the narrating model can make while it already has the guidance, the input and the story. The decision is still the model's, so F06 stays an AI feature.</w:t>
+            </w:r>
+          </w:p>
+        </w:tc>
+      </w:tr>
+      <w:tr>
+        <w:trPr>
+          <w:cantSplit/>
+        </w:trPr>
+        <w:tc>
+          <w:tcPr>
+            <w:tcW w:w="2500" w:type="dxa"/>
+            <w:tcBorders>
+              <w:top w:val="single" w:sz="4" w:space="0" w:color="BFBFBF"/>
+              <w:left w:val="single" w:sz="4" w:space="0" w:color="BFBFBF"/>
+              <w:bottom w:val="single" w:sz="4" w:space="0" w:color="BFBFBF"/>
+              <w:right w:val="single" w:sz="4" w:space="0" w:color="BFBFBF"/>
+            </w:tcBorders>
+            <w:shd w:val="clear" w:color="auto" w:fill="F2F2F2"/>
+            <w:tcMar>
+              <w:top w:w="70" w:type="dxa"/>
+              <w:left w:w="110" w:type="dxa"/>
+              <w:bottom w:w="70" w:type="dxa"/>
+              <w:right w:w="110" w:type="dxa"/>
+            </w:tcMar>
+          </w:tcPr>
+          <w:p>
+            <w:r>
+              <w:rPr>
+                <w:b/>
+              </w:rPr>
+              <w:t>How the User Need Is Still Met</w:t>
+            </w:r>
+          </w:p>
+        </w:tc>
+        <w:tc>
+          <w:tcPr>
+            <w:tcW w:w="6860" w:type="dxa"/>
+            <w:tcBorders>
+              <w:top w:val="single" w:sz="4" w:space="0" w:color="BFBFBF"/>
+              <w:left w:val="single" w:sz="4" w:space="0" w:color="BFBFBF"/>
+              <w:bottom w:val="single" w:sz="4" w:space="0" w:color="BFBFBF"/>
+              <w:right w:val="single" w:sz="4" w:space="0" w:color="BFBFBF"/>
+            </w:tcBorders>
+            <w:tcMar>
+              <w:top w:w="70" w:type="dxa"/>
+              <w:left w:w="110" w:type="dxa"/>
+              <w:bottom w:w="70" w:type="dxa"/>
+              <w:right w:w="110" w:type="dxa"/>
+            </w:tcMar>
+          </w:tcPr>
+          <w:p>
+            <w:r>
+              <w:t>The story is still steered towards the hidden events, and the events are never shown to the user.</w:t>
+            </w:r>
+          </w:p>
+        </w:tc>
+      </w:tr>
+      <w:tr>
+        <w:trPr>
+          <w:cantSplit/>
+        </w:trPr>
+        <w:tc>
+          <w:tcPr>
+            <w:tcW w:w="2500" w:type="dxa"/>
+            <w:tcBorders>
+              <w:top w:val="single" w:sz="4" w:space="0" w:color="BFBFBF"/>
+              <w:left w:val="single" w:sz="4" w:space="0" w:color="BFBFBF"/>
+              <w:bottom w:val="single" w:sz="4" w:space="0" w:color="BFBFBF"/>
+              <w:right w:val="single" w:sz="4" w:space="0" w:color="BFBFBF"/>
+            </w:tcBorders>
+            <w:shd w:val="clear" w:color="auto" w:fill="F2F2F2"/>
+            <w:tcMar>
+              <w:top w:w="70" w:type="dxa"/>
+              <w:left w:w="110" w:type="dxa"/>
+              <w:bottom w:w="70" w:type="dxa"/>
+              <w:right w:w="110" w:type="dxa"/>
+            </w:tcMar>
+          </w:tcPr>
+          <w:p>
+            <w:r>
+              <w:rPr>
+                <w:b/>
+              </w:rPr>
+              <w:t>Affected Use Cases / Classes / Methods / Patterns</w:t>
+            </w:r>
+          </w:p>
+        </w:tc>
+        <w:tc>
+          <w:tcPr>
+            <w:tcW w:w="6860" w:type="dxa"/>
+            <w:tcBorders>
+              <w:top w:val="single" w:sz="4" w:space="0" w:color="BFBFBF"/>
+              <w:left w:val="single" w:sz="4" w:space="0" w:color="BFBFBF"/>
+              <w:bottom w:val="single" w:sz="4" w:space="0" w:color="BFBFBF"/>
+              <w:right w:val="single" w:sz="4" w:space="0" w:color="BFBFBF"/>
+            </w:tcBorders>
+            <w:tcMar>
+              <w:top w:w="70" w:type="dxa"/>
+              <w:left w:w="110" w:type="dxa"/>
+              <w:bottom w:w="70" w:type="dxa"/>
+              <w:right w:w="110" w:type="dxa"/>
+            </w:tcMar>
+          </w:tcPr>
+          <w:p>
+            <w:r>
+              <w:t>UC04 step 6; PlotPlanner.planStep, StoryAgent.takeTurn; Facade.</w:t>
+            </w:r>
+          </w:p>
+        </w:tc>
+      </w:tr>
+      <w:tr>
+        <w:trPr>
+          <w:cantSplit/>
+        </w:trPr>
+        <w:tc>
+          <w:tcPr>
+            <w:tcW w:w="2500" w:type="dxa"/>
+            <w:tcBorders>
+              <w:top w:val="single" w:sz="4" w:space="0" w:color="BFBFBF"/>
+              <w:left w:val="single" w:sz="4" w:space="0" w:color="BFBFBF"/>
+              <w:bottom w:val="single" w:sz="4" w:space="0" w:color="BFBFBF"/>
+              <w:right w:val="single" w:sz="4" w:space="0" w:color="BFBFBF"/>
+            </w:tcBorders>
+            <w:shd w:val="clear" w:color="auto" w:fill="F2F2F2"/>
+            <w:tcMar>
+              <w:top w:w="70" w:type="dxa"/>
+              <w:left w:w="110" w:type="dxa"/>
+              <w:bottom w:w="70" w:type="dxa"/>
+              <w:right w:w="110" w:type="dxa"/>
+            </w:tcMar>
+          </w:tcPr>
+          <w:p>
+            <w:r>
+              <w:rPr>
+                <w:b/>
+              </w:rPr>
+              <w:t>Diagrams Updated</w:t>
+            </w:r>
+          </w:p>
+        </w:tc>
+        <w:tc>
+          <w:tcPr>
+            <w:tcW w:w="6860" w:type="dxa"/>
+            <w:tcBorders>
+              <w:top w:val="single" w:sz="4" w:space="0" w:color="BFBFBF"/>
+              <w:left w:val="single" w:sz="4" w:space="0" w:color="BFBFBF"/>
+              <w:bottom w:val="single" w:sz="4" w:space="0" w:color="BFBFBF"/>
+              <w:right w:val="single" w:sz="4" w:space="0" w:color="BFBFBF"/>
+            </w:tcBorders>
+            <w:tcMar>
+              <w:top w:w="70" w:type="dxa"/>
+              <w:left w:w="110" w:type="dxa"/>
+              <w:bottom w:w="70" w:type="dxa"/>
+              <w:right w:w="110" w:type="dxa"/>
+            </w:tcMar>
+          </w:tcPr>
+          <w:p>
+            <w:r>
+              <w:t>SD05 (no model call inside planStep).</w:t>
+            </w:r>
+          </w:p>
+        </w:tc>
+      </w:tr>
+      <w:tr>
+        <w:trPr>
+          <w:cantSplit/>
+        </w:trPr>
+        <w:tc>
+          <w:tcPr>
+            <w:tcW w:w="2500" w:type="dxa"/>
+            <w:tcBorders>
+              <w:top w:val="single" w:sz="4" w:space="0" w:color="BFBFBF"/>
+              <w:left w:val="single" w:sz="4" w:space="0" w:color="BFBFBF"/>
+              <w:bottom w:val="single" w:sz="4" w:space="0" w:color="BFBFBF"/>
+              <w:right w:val="single" w:sz="4" w:space="0" w:color="BFBFBF"/>
+            </w:tcBorders>
+            <w:shd w:val="clear" w:color="auto" w:fill="F2F2F2"/>
+            <w:tcMar>
+              <w:top w:w="70" w:type="dxa"/>
+              <w:left w:w="110" w:type="dxa"/>
+              <w:bottom w:w="70" w:type="dxa"/>
+              <w:right w:w="110" w:type="dxa"/>
+            </w:tcMar>
+          </w:tcPr>
+          <w:p>
+            <w:r>
+              <w:rPr>
+                <w:b/>
+              </w:rPr>
+              <w:t>Commit(s)</w:t>
+            </w:r>
+          </w:p>
+        </w:tc>
+        <w:tc>
+          <w:tcPr>
+            <w:tcW w:w="6860" w:type="dxa"/>
+            <w:tcBorders>
+              <w:top w:val="single" w:sz="4" w:space="0" w:color="BFBFBF"/>
+              <w:left w:val="single" w:sz="4" w:space="0" w:color="BFBFBF"/>
+              <w:bottom w:val="single" w:sz="4" w:space="0" w:color="BFBFBF"/>
+              <w:right w:val="single" w:sz="4" w:space="0" w:color="BFBFBF"/>
+            </w:tcBorders>
+            <w:tcMar>
+              <w:top w:w="70" w:type="dxa"/>
+              <w:left w:w="110" w:type="dxa"/>
+              <w:bottom w:w="70" w:type="dxa"/>
+              <w:right w:w="110" w:type="dxa"/>
+            </w:tcMar>
+          </w:tcPr>
+          <w:p>
+            <w:r>
+              <w:t>feat(agent): run the tool-use loop in StoryAgent.takeTurn</w:t>
+            </w:r>
+          </w:p>
+        </w:tc>
+      </w:tr>
+    </w:tbl>
+    <w:p>
+      <w:pPr>
+        <w:spacing w:after="0"/>
+      </w:pPr>
+    </w:p>
+    <w:tbl>
+      <w:tblPr>
+        <w:tblLook w:firstColumn="1" w:firstRow="1" w:lastColumn="0" w:lastRow="0" w:noHBand="0" w:noVBand="1" w:val="04A0"/>
+        <w:tblW w:w="9360" w:type="dxa"/>
+      </w:tblPr>
+      <w:tblGrid>
+        <w:gridCol w:w="2500"/>
+        <w:gridCol w:w="6860"/>
+      </w:tblGrid>
+      <w:tr>
+        <w:trPr>
+          <w:cantSplit/>
+        </w:trPr>
+        <w:tc>
+          <w:tcPr>
+            <w:tcW w:w="2500" w:type="dxa"/>
+            <w:tcBorders>
+              <w:top w:val="single" w:sz="4" w:space="0" w:color="BFBFBF"/>
+              <w:left w:val="single" w:sz="4" w:space="0" w:color="BFBFBF"/>
+              <w:bottom w:val="single" w:sz="4" w:space="0" w:color="BFBFBF"/>
+              <w:right w:val="single" w:sz="4" w:space="0" w:color="BFBFBF"/>
+            </w:tcBorders>
+            <w:shd w:val="clear" w:color="auto" w:fill="F2F2F2"/>
+            <w:tcMar>
+              <w:top w:w="70" w:type="dxa"/>
+              <w:left w:w="110" w:type="dxa"/>
+              <w:bottom w:w="70" w:type="dxa"/>
+              <w:right w:w="110" w:type="dxa"/>
+            </w:tcMar>
+          </w:tcPr>
+          <w:p>
+            <w:r>
+              <w:rPr>
+                <w:b/>
+              </w:rPr>
+              <w:t>Original ID</w:t>
+            </w:r>
+          </w:p>
+        </w:tc>
+        <w:tc>
+          <w:tcPr>
+            <w:tcW w:w="6860" w:type="dxa"/>
+            <w:tcBorders>
+              <w:top w:val="single" w:sz="4" w:space="0" w:color="BFBFBF"/>
+              <w:left w:val="single" w:sz="4" w:space="0" w:color="BFBFBF"/>
+              <w:bottom w:val="single" w:sz="4" w:space="0" w:color="BFBFBF"/>
+              <w:right w:val="single" w:sz="4" w:space="0" w:color="BFBFBF"/>
+            </w:tcBorders>
+            <w:tcMar>
+              <w:top w:w="70" w:type="dxa"/>
+              <w:left w:w="110" w:type="dxa"/>
+              <w:bottom w:w="70" w:type="dxa"/>
+              <w:right w:w="110" w:type="dxa"/>
+            </w:tcMar>
+          </w:tcPr>
+          <w:p>
+            <w:r>
+              <w:t>F04: StoryAgent wiring and the turn loop limit</w:t>
+            </w:r>
+          </w:p>
+        </w:tc>
+      </w:tr>
+      <w:tr>
+        <w:trPr>
+          <w:cantSplit/>
+        </w:trPr>
+        <w:tc>
+          <w:tcPr>
+            <w:tcW w:w="2500" w:type="dxa"/>
+            <w:tcBorders>
+              <w:top w:val="single" w:sz="4" w:space="0" w:color="BFBFBF"/>
+              <w:left w:val="single" w:sz="4" w:space="0" w:color="BFBFBF"/>
+              <w:bottom w:val="single" w:sz="4" w:space="0" w:color="BFBFBF"/>
+              <w:right w:val="single" w:sz="4" w:space="0" w:color="BFBFBF"/>
+            </w:tcBorders>
+            <w:shd w:val="clear" w:color="auto" w:fill="F2F2F2"/>
+            <w:tcMar>
+              <w:top w:w="70" w:type="dxa"/>
+              <w:left w:w="110" w:type="dxa"/>
+              <w:bottom w:w="70" w:type="dxa"/>
+              <w:right w:w="110" w:type="dxa"/>
+            </w:tcMar>
+          </w:tcPr>
+          <w:p>
+            <w:r>
+              <w:rPr>
+                <w:b/>
+              </w:rPr>
+              <w:t>Original (Stage 1)</w:t>
+            </w:r>
+          </w:p>
+        </w:tc>
+        <w:tc>
+          <w:tcPr>
+            <w:tcW w:w="6860" w:type="dxa"/>
+            <w:tcBorders>
+              <w:top w:val="single" w:sz="4" w:space="0" w:color="BFBFBF"/>
+              <w:left w:val="single" w:sz="4" w:space="0" w:color="BFBFBF"/>
+              <w:bottom w:val="single" w:sz="4" w:space="0" w:color="BFBFBF"/>
+              <w:right w:val="single" w:sz="4" w:space="0" w:color="BFBFBF"/>
+            </w:tcBorders>
+            <w:tcMar>
+              <w:top w:w="70" w:type="dxa"/>
+              <w:left w:w="110" w:type="dxa"/>
+              <w:bottom w:w="70" w:type="dxa"/>
+              <w:right w:w="110" w:type="dxa"/>
+            </w:tcMar>
+          </w:tcPr>
+          <w:p>
+            <w:r>
+              <w:t>StoryAgent composes PlotPlanner, ConsistencyChecker and MemoryManager and uses ToolRegistry and LLMClient; runToolLoop(request, session): LLMResponse repeats while the response has tool calls.</w:t>
+            </w:r>
+          </w:p>
+        </w:tc>
+      </w:tr>
+      <w:tr>
+        <w:trPr>
+          <w:cantSplit/>
+        </w:trPr>
+        <w:tc>
+          <w:tcPr>
+            <w:tcW w:w="2500" w:type="dxa"/>
+            <w:tcBorders>
+              <w:top w:val="single" w:sz="4" w:space="0" w:color="BFBFBF"/>
+              <w:left w:val="single" w:sz="4" w:space="0" w:color="BFBFBF"/>
+              <w:bottom w:val="single" w:sz="4" w:space="0" w:color="BFBFBF"/>
+              <w:right w:val="single" w:sz="4" w:space="0" w:color="BFBFBF"/>
+            </w:tcBorders>
+            <w:shd w:val="clear" w:color="auto" w:fill="F2F2F2"/>
+            <w:tcMar>
+              <w:top w:w="70" w:type="dxa"/>
+              <w:left w:w="110" w:type="dxa"/>
+              <w:bottom w:w="70" w:type="dxa"/>
+              <w:right w:w="110" w:type="dxa"/>
+            </w:tcMar>
+          </w:tcPr>
+          <w:p>
+            <w:r>
+              <w:rPr>
+                <w:b/>
+              </w:rPr>
+              <w:t>Implemented</w:t>
+            </w:r>
+          </w:p>
+        </w:tc>
+        <w:tc>
+          <w:tcPr>
+            <w:tcW w:w="6860" w:type="dxa"/>
+            <w:tcBorders>
+              <w:top w:val="single" w:sz="4" w:space="0" w:color="BFBFBF"/>
+              <w:left w:val="single" w:sz="4" w:space="0" w:color="BFBFBF"/>
+              <w:bottom w:val="single" w:sz="4" w:space="0" w:color="BFBFBF"/>
+              <w:right w:val="single" w:sz="4" w:space="0" w:color="BFBFBF"/>
+            </w:tcBorders>
+            <w:tcMar>
+              <w:top w:w="70" w:type="dxa"/>
+              <w:left w:w="110" w:type="dxa"/>
+              <w:bottom w:w="70" w:type="dxa"/>
+              <w:right w:w="110" w:type="dxa"/>
+            </w:tcMar>
+          </w:tcPr>
+          <w:p>
+            <w:r>
+              <w:t>StoryAgent(llm, tools, planner, memory) plus StoryAgent.create(llm), which registers the standard tools. runToolLoop(request, session, usedLore) collects the lore ids of successful lookups and stops after 8 model calls with an error. The system prompt is read from src/main/resources/prompts/system.txt. ConsistencyChecker joins the constructor with F08.</w:t>
+            </w:r>
+          </w:p>
+        </w:tc>
+      </w:tr>
+      <w:tr>
+        <w:trPr>
+          <w:cantSplit/>
+        </w:trPr>
+        <w:tc>
+          <w:tcPr>
+            <w:tcW w:w="2500" w:type="dxa"/>
+            <w:tcBorders>
+              <w:top w:val="single" w:sz="4" w:space="0" w:color="BFBFBF"/>
+              <w:left w:val="single" w:sz="4" w:space="0" w:color="BFBFBF"/>
+              <w:bottom w:val="single" w:sz="4" w:space="0" w:color="BFBFBF"/>
+              <w:right w:val="single" w:sz="4" w:space="0" w:color="BFBFBF"/>
+            </w:tcBorders>
+            <w:shd w:val="clear" w:color="auto" w:fill="F2F2F2"/>
+            <w:tcMar>
+              <w:top w:w="70" w:type="dxa"/>
+              <w:left w:w="110" w:type="dxa"/>
+              <w:bottom w:w="70" w:type="dxa"/>
+              <w:right w:w="110" w:type="dxa"/>
+            </w:tcMar>
+          </w:tcPr>
+          <w:p>
+            <w:r>
+              <w:rPr>
+                <w:b/>
+              </w:rPr>
+              <w:t>What Changed and Why</w:t>
+            </w:r>
+          </w:p>
+        </w:tc>
+        <w:tc>
+          <w:tcPr>
+            <w:tcW w:w="6860" w:type="dxa"/>
+            <w:tcBorders>
+              <w:top w:val="single" w:sz="4" w:space="0" w:color="BFBFBF"/>
+              <w:left w:val="single" w:sz="4" w:space="0" w:color="BFBFBF"/>
+              <w:bottom w:val="single" w:sz="4" w:space="0" w:color="BFBFBF"/>
+              <w:right w:val="single" w:sz="4" w:space="0" w:color="BFBFBF"/>
+            </w:tcBorders>
+            <w:tcMar>
+              <w:top w:w="70" w:type="dxa"/>
+              <w:left w:w="110" w:type="dxa"/>
+              <w:bottom w:w="70" w:type="dxa"/>
+              <w:right w:w="110" w:type="dxa"/>
+            </w:tcMar>
+          </w:tcPr>
+          <w:p>
+            <w:r>
+              <w:t>The loop needs a bound; recording the lore used is the F04 output "a record on the turn of which lore entries were used".</w:t>
+            </w:r>
+          </w:p>
+        </w:tc>
+      </w:tr>
+      <w:tr>
+        <w:trPr>
+          <w:cantSplit/>
+        </w:trPr>
+        <w:tc>
+          <w:tcPr>
+            <w:tcW w:w="2500" w:type="dxa"/>
+            <w:tcBorders>
+              <w:top w:val="single" w:sz="4" w:space="0" w:color="BFBFBF"/>
+              <w:left w:val="single" w:sz="4" w:space="0" w:color="BFBFBF"/>
+              <w:bottom w:val="single" w:sz="4" w:space="0" w:color="BFBFBF"/>
+              <w:right w:val="single" w:sz="4" w:space="0" w:color="BFBFBF"/>
+            </w:tcBorders>
+            <w:shd w:val="clear" w:color="auto" w:fill="F2F2F2"/>
+            <w:tcMar>
+              <w:top w:w="70" w:type="dxa"/>
+              <w:left w:w="110" w:type="dxa"/>
+              <w:bottom w:w="70" w:type="dxa"/>
+              <w:right w:w="110" w:type="dxa"/>
+            </w:tcMar>
+          </w:tcPr>
+          <w:p>
+            <w:r>
+              <w:rPr>
+                <w:b/>
+              </w:rPr>
+              <w:t>How the User Need Is Still Met</w:t>
+            </w:r>
+          </w:p>
+        </w:tc>
+        <w:tc>
+          <w:tcPr>
+            <w:tcW w:w="6860" w:type="dxa"/>
+            <w:tcBorders>
+              <w:top w:val="single" w:sz="4" w:space="0" w:color="BFBFBF"/>
+              <w:left w:val="single" w:sz="4" w:space="0" w:color="BFBFBF"/>
+              <w:bottom w:val="single" w:sz="4" w:space="0" w:color="BFBFBF"/>
+              <w:right w:val="single" w:sz="4" w:space="0" w:color="BFBFBF"/>
+            </w:tcBorders>
+            <w:tcMar>
+              <w:top w:w="70" w:type="dxa"/>
+              <w:left w:w="110" w:type="dxa"/>
+              <w:bottom w:w="70" w:type="dxa"/>
+              <w:right w:w="110" w:type="dxa"/>
+            </w:tcMar>
+          </w:tcPr>
+          <w:p>
+            <w:r>
+              <w:t>As designed; a turn that cannot finish shows a message and adds nothing (UC04 7a).</w:t>
+            </w:r>
+          </w:p>
+        </w:tc>
+      </w:tr>
+      <w:tr>
+        <w:trPr>
+          <w:cantSplit/>
+        </w:trPr>
+        <w:tc>
+          <w:tcPr>
+            <w:tcW w:w="2500" w:type="dxa"/>
+            <w:tcBorders>
+              <w:top w:val="single" w:sz="4" w:space="0" w:color="BFBFBF"/>
+              <w:left w:val="single" w:sz="4" w:space="0" w:color="BFBFBF"/>
+              <w:bottom w:val="single" w:sz="4" w:space="0" w:color="BFBFBF"/>
+              <w:right w:val="single" w:sz="4" w:space="0" w:color="BFBFBF"/>
+            </w:tcBorders>
+            <w:shd w:val="clear" w:color="auto" w:fill="F2F2F2"/>
+            <w:tcMar>
+              <w:top w:w="70" w:type="dxa"/>
+              <w:left w:w="110" w:type="dxa"/>
+              <w:bottom w:w="70" w:type="dxa"/>
+              <w:right w:w="110" w:type="dxa"/>
+            </w:tcMar>
+          </w:tcPr>
+          <w:p>
+            <w:r>
+              <w:rPr>
+                <w:b/>
+              </w:rPr>
+              <w:t>Affected Use Cases / Classes / Methods / Patterns</w:t>
+            </w:r>
+          </w:p>
+        </w:tc>
+        <w:tc>
+          <w:tcPr>
+            <w:tcW w:w="6860" w:type="dxa"/>
+            <w:tcBorders>
+              <w:top w:val="single" w:sz="4" w:space="0" w:color="BFBFBF"/>
+              <w:left w:val="single" w:sz="4" w:space="0" w:color="BFBFBF"/>
+              <w:bottom w:val="single" w:sz="4" w:space="0" w:color="BFBFBF"/>
+              <w:right w:val="single" w:sz="4" w:space="0" w:color="BFBFBF"/>
+            </w:tcBorders>
+            <w:tcMar>
+              <w:top w:w="70" w:type="dxa"/>
+              <w:left w:w="110" w:type="dxa"/>
+              <w:bottom w:w="70" w:type="dxa"/>
+              <w:right w:w="110" w:type="dxa"/>
+            </w:tcMar>
+          </w:tcPr>
+          <w:p>
+            <w:r>
+              <w:t>UC04; StoryAgent; Facade, Strategy.</w:t>
+            </w:r>
+          </w:p>
+        </w:tc>
+      </w:tr>
+      <w:tr>
+        <w:trPr>
+          <w:cantSplit/>
+        </w:trPr>
+        <w:tc>
+          <w:tcPr>
+            <w:tcW w:w="2500" w:type="dxa"/>
+            <w:tcBorders>
+              <w:top w:val="single" w:sz="4" w:space="0" w:color="BFBFBF"/>
+              <w:left w:val="single" w:sz="4" w:space="0" w:color="BFBFBF"/>
+              <w:bottom w:val="single" w:sz="4" w:space="0" w:color="BFBFBF"/>
+              <w:right w:val="single" w:sz="4" w:space="0" w:color="BFBFBF"/>
+            </w:tcBorders>
+            <w:shd w:val="clear" w:color="auto" w:fill="F2F2F2"/>
+            <w:tcMar>
+              <w:top w:w="70" w:type="dxa"/>
+              <w:left w:w="110" w:type="dxa"/>
+              <w:bottom w:w="70" w:type="dxa"/>
+              <w:right w:w="110" w:type="dxa"/>
+            </w:tcMar>
+          </w:tcPr>
+          <w:p>
+            <w:r>
+              <w:rPr>
+                <w:b/>
+              </w:rPr>
+              <w:t>Diagrams Updated</w:t>
+            </w:r>
+          </w:p>
+        </w:tc>
+        <w:tc>
+          <w:tcPr>
+            <w:tcW w:w="6860" w:type="dxa"/>
+            <w:tcBorders>
+              <w:top w:val="single" w:sz="4" w:space="0" w:color="BFBFBF"/>
+              <w:left w:val="single" w:sz="4" w:space="0" w:color="BFBFBF"/>
+              <w:bottom w:val="single" w:sz="4" w:space="0" w:color="BFBFBF"/>
+              <w:right w:val="single" w:sz="4" w:space="0" w:color="BFBFBF"/>
+            </w:tcBorders>
+            <w:tcMar>
+              <w:top w:w="70" w:type="dxa"/>
+              <w:left w:w="110" w:type="dxa"/>
+              <w:bottom w:w="70" w:type="dxa"/>
+              <w:right w:w="110" w:type="dxa"/>
+            </w:tcMar>
+          </w:tcPr>
+          <w:p>
+            <w:r>
+              <w:t>figures/class-diagram/06-agent.png (redrawn under figures/stage2/).</w:t>
+            </w:r>
+          </w:p>
+        </w:tc>
+      </w:tr>
+      <w:tr>
+        <w:trPr>
+          <w:cantSplit/>
+        </w:trPr>
+        <w:tc>
+          <w:tcPr>
+            <w:tcW w:w="2500" w:type="dxa"/>
+            <w:tcBorders>
+              <w:top w:val="single" w:sz="4" w:space="0" w:color="BFBFBF"/>
+              <w:left w:val="single" w:sz="4" w:space="0" w:color="BFBFBF"/>
+              <w:bottom w:val="single" w:sz="4" w:space="0" w:color="BFBFBF"/>
+              <w:right w:val="single" w:sz="4" w:space="0" w:color="BFBFBF"/>
+            </w:tcBorders>
+            <w:shd w:val="clear" w:color="auto" w:fill="F2F2F2"/>
+            <w:tcMar>
+              <w:top w:w="70" w:type="dxa"/>
+              <w:left w:w="110" w:type="dxa"/>
+              <w:bottom w:w="70" w:type="dxa"/>
+              <w:right w:w="110" w:type="dxa"/>
+            </w:tcMar>
+          </w:tcPr>
+          <w:p>
+            <w:r>
+              <w:rPr>
+                <w:b/>
+              </w:rPr>
+              <w:t>Commit(s)</w:t>
+            </w:r>
+          </w:p>
+        </w:tc>
+        <w:tc>
+          <w:tcPr>
+            <w:tcW w:w="6860" w:type="dxa"/>
+            <w:tcBorders>
+              <w:top w:val="single" w:sz="4" w:space="0" w:color="BFBFBF"/>
+              <w:left w:val="single" w:sz="4" w:space="0" w:color="BFBFBF"/>
+              <w:bottom w:val="single" w:sz="4" w:space="0" w:color="BFBFBF"/>
+              <w:right w:val="single" w:sz="4" w:space="0" w:color="BFBFBF"/>
+            </w:tcBorders>
+            <w:tcMar>
+              <w:top w:w="70" w:type="dxa"/>
+              <w:left w:w="110" w:type="dxa"/>
+              <w:bottom w:w="70" w:type="dxa"/>
+              <w:right w:w="110" w:type="dxa"/>
+            </w:tcMar>
+          </w:tcPr>
+          <w:p>
+            <w:r>
+              <w:t>feat(agent): run the tool-use loop in StoryAgent.takeTurn</w:t>
             </w:r>
           </w:p>
         </w:tc>

</xml_diff>

<commit_message>
feat(agent): plan hidden pivotal events before the story starts
PlotPlanner.createPlot sends the scenario and the user's optional plot
basis to the model with prompts/plot-planner.txt and parses the JSON
reply into pending pivotal events E1..En (at most eight). A refusal,
a failed call or a reply without events is an LLMException.

StoryController.startStory checks the scenario (premise and setting
required, a title made from the premise if empty), asks
StoryAgent.planPlot for the plan and only then opens the story, so a
failed plan changes nothing. Lore and characters prepared in an empty
session are kept. The controller now receives the agent; both front
ends build it through StoryCLI.createController, which reads .env and
still opens without an API key. The CLI gains a start command that
never prints the plan.

Refs: F01, F05
Co-Authored-By: Claude Opus 5.5 <noreply@anthropic.com>
Claude-Session: https://claude.ai/code/session_01WQ5gKVQXkP6gSc2ew2jXdc
</commit_message>
<xml_diff>
--- a/Stage2_Report.docx
+++ b/Stage2_Report.docx
@@ -473,11 +473,8 @@
           </w:tcPr>
           <w:p>
             <w:r>
-              <w:rPr>
-                <w:i/>
-                <w:color w:val="7F7F7F"/>
-              </w:rPr>
-              <w:t>[Not started]</w:t>
+              <w:rPr/>
+              <w:t>In progress (manual scenario done)</w:t>
             </w:r>
           </w:p>
         </w:tc>
@@ -499,11 +496,8 @@
           </w:tcPr>
           <w:p>
             <w:r>
-              <w:rPr>
-                <w:i/>
-                <w:color w:val="7F7F7F"/>
-              </w:rPr>
-              <w:t>[-]</w:t>
+              <w:rPr/>
+              <w:t>-</w:t>
             </w:r>
           </w:p>
         </w:tc>
@@ -525,11 +519,8 @@
           </w:tcPr>
           <w:p>
             <w:r>
-              <w:rPr>
-                <w:i/>
-                <w:color w:val="7F7F7F"/>
-              </w:rPr>
-              <w:t>[-]</w:t>
+              <w:rPr/>
+              <w:t>Yes (start)</w:t>
             </w:r>
           </w:p>
         </w:tc>
@@ -1036,11 +1027,8 @@
           </w:tcPr>
           <w:p>
             <w:r>
-              <w:rPr>
-                <w:i/>
-                <w:color w:val="7F7F7F"/>
-              </w:rPr>
-              <w:t>[Not started]</w:t>
+              <w:rPr/>
+              <w:t>Partial (CLI done; GUI form next)</w:t>
             </w:r>
           </w:p>
         </w:tc>
@@ -1062,11 +1050,8 @@
           </w:tcPr>
           <w:p>
             <w:r>
-              <w:rPr>
-                <w:i/>
-                <w:color w:val="7F7F7F"/>
-              </w:rPr>
-              <w:t>[-]</w:t>
+              <w:rPr/>
+              <w:t>-</w:t>
             </w:r>
           </w:p>
         </w:tc>
@@ -1088,11 +1073,8 @@
           </w:tcPr>
           <w:p>
             <w:r>
-              <w:rPr>
-                <w:i/>
-                <w:color w:val="7F7F7F"/>
-              </w:rPr>
-              <w:t>[-]</w:t>
+              <w:rPr/>
+              <w:t>Yes</w:t>
             </w:r>
           </w:p>
         </w:tc>
@@ -5246,11 +5228,515 @@
           </w:tcPr>
           <w:p>
             <w:r>
+              <w:rPr/>
+              <w:t>Partial: planning and the hidden plan work end to end from the CLI (start); the GUI new-story form follows in the GUI slice this week.</w:t>
+            </w:r>
+          </w:p>
+        </w:tc>
+      </w:tr>
+      <w:tr>
+        <w:trPr>
+          <w:cantSplit/>
+        </w:trPr>
+        <w:tc>
+          <w:tcPr>
+            <w:tcW w:w="2500" w:type="dxa"/>
+            <w:tcBorders>
+              <w:top w:val="single" w:sz="4" w:space="0" w:color="BFBFBF"/>
+              <w:left w:val="single" w:sz="4" w:space="0" w:color="BFBFBF"/>
+              <w:bottom w:val="single" w:sz="4" w:space="0" w:color="BFBFBF"/>
+              <w:right w:val="single" w:sz="4" w:space="0" w:color="BFBFBF"/>
+            </w:tcBorders>
+            <w:shd w:val="clear" w:color="auto" w:fill="F2F2F2"/>
+            <w:tcMar>
+              <w:top w:w="70" w:type="dxa"/>
+              <w:left w:w="110" w:type="dxa"/>
+              <w:bottom w:w="70" w:type="dxa"/>
+              <w:right w:w="110" w:type="dxa"/>
+            </w:tcMar>
+          </w:tcPr>
+          <w:p>
+            <w:r>
+              <w:rPr>
+                <w:b/>
+              </w:rPr>
+              <w:t>Type</w:t>
+            </w:r>
+          </w:p>
+        </w:tc>
+        <w:tc>
+          <w:tcPr>
+            <w:tcW w:w="6860" w:type="dxa"/>
+            <w:tcBorders>
+              <w:top w:val="single" w:sz="4" w:space="0" w:color="BFBFBF"/>
+              <w:left w:val="single" w:sz="4" w:space="0" w:color="BFBFBF"/>
+              <w:bottom w:val="single" w:sz="4" w:space="0" w:color="BFBFBF"/>
+              <w:right w:val="single" w:sz="4" w:space="0" w:color="BFBFBF"/>
+            </w:tcBorders>
+            <w:tcMar>
+              <w:top w:w="70" w:type="dxa"/>
+              <w:left w:w="110" w:type="dxa"/>
+              <w:bottom w:w="70" w:type="dxa"/>
+              <w:right w:w="110" w:type="dxa"/>
+            </w:tcMar>
+          </w:tcPr>
+          <w:p>
+            <w:r>
+              <w:rPr/>
+              <w:t>Hybrid, as in Stage 1. The model writes the events (PlotPlanner.createPlot); code validates the scenario first, parses the JSON reply, numbers the events E1, E2, ... as PENDING, caps the plan at 8 and stores it on the session.</w:t>
+            </w:r>
+          </w:p>
+        </w:tc>
+      </w:tr>
+      <w:tr>
+        <w:trPr>
+          <w:cantSplit/>
+        </w:trPr>
+        <w:tc>
+          <w:tcPr>
+            <w:tcW w:w="2500" w:type="dxa"/>
+            <w:tcBorders>
+              <w:top w:val="single" w:sz="4" w:space="0" w:color="BFBFBF"/>
+              <w:left w:val="single" w:sz="4" w:space="0" w:color="BFBFBF"/>
+              <w:bottom w:val="single" w:sz="4" w:space="0" w:color="BFBFBF"/>
+              <w:right w:val="single" w:sz="4" w:space="0" w:color="BFBFBF"/>
+            </w:tcBorders>
+            <w:shd w:val="clear" w:color="auto" w:fill="F2F2F2"/>
+            <w:tcMar>
+              <w:top w:w="70" w:type="dxa"/>
+              <w:left w:w="110" w:type="dxa"/>
+              <w:bottom w:w="70" w:type="dxa"/>
+              <w:right w:w="110" w:type="dxa"/>
+            </w:tcMar>
+          </w:tcPr>
+          <w:p>
+            <w:r>
+              <w:rPr>
+                <w:b/>
+              </w:rPr>
+              <w:t>Classes / Files and Responsibilities</w:t>
+            </w:r>
+          </w:p>
+        </w:tc>
+        <w:tc>
+          <w:tcPr>
+            <w:tcW w:w="6860" w:type="dxa"/>
+            <w:tcBorders>
+              <w:top w:val="single" w:sz="4" w:space="0" w:color="BFBFBF"/>
+              <w:left w:val="single" w:sz="4" w:space="0" w:color="BFBFBF"/>
+              <w:bottom w:val="single" w:sz="4" w:space="0" w:color="BFBFBF"/>
+              <w:right w:val="single" w:sz="4" w:space="0" w:color="BFBFBF"/>
+            </w:tcBorders>
+            <w:tcMar>
+              <w:top w:w="70" w:type="dxa"/>
+              <w:left w:w="110" w:type="dxa"/>
+              <w:bottom w:w="70" w:type="dxa"/>
+              <w:right w:w="110" w:type="dxa"/>
+            </w:tcMar>
+          </w:tcPr>
+          <w:p>
+            <w:r>
+              <w:rPr/>
+              <w:t>StoryController (src/main/java/ca/yorku/storyteller/controller/StoryController.java): startStory validates, asks the agent for the plan and opens the story.</w:t>
+            </w:r>
+          </w:p>
+          <w:p>
+            <w:r>
+              <w:rPr/>
+              <w:t>StoryAgent (src/main/java/ca/yorku/storyteller/agent/StoryAgent.java): planPlot delegates to the planner (Facade).</w:t>
+            </w:r>
+          </w:p>
+          <w:p>
+            <w:r>
+              <w:rPr/>
+              <w:t>PlotPlanner (src/main/java/ca/yorku/storyteller/agent/PlotPlanner.java): createPlot builds the request from Scenario.describe() and the basis, parses the reply; planStep turns the next pending event into hidden guidance for each turn.</w:t>
+            </w:r>
+          </w:p>
+          <w:p>
+            <w:r>
+              <w:rPr/>
+              <w:t>Plot, PivotalEvent, EventStatus (src/main/java/ca/yorku/storyteller/model/): the hidden ordered events.</w:t>
+            </w:r>
+          </w:p>
+          <w:p>
+            <w:r>
+              <w:rPr/>
+              <w:t>Scenario (src/main/java/ca/yorku/storyteller/model/Scenario.java): readyToStart checks mandatory fields.</w:t>
+            </w:r>
+          </w:p>
+          <w:p>
+            <w:r>
+              <w:rPr/>
+              <w:t>prompts/plot-planner.txt (src/main/resources/prompts/plot-planner.txt): the planning instructions.</w:t>
+            </w:r>
+          </w:p>
+          <w:p>
+            <w:r>
+              <w:rPr/>
+              <w:t>StoryCLI (src/main/java/ca/yorku/storyteller/ui/StoryCLI.java): the start command.</w:t>
+            </w:r>
+          </w:p>
+        </w:tc>
+      </w:tr>
+      <w:tr>
+        <w:trPr>
+          <w:cantSplit/>
+        </w:trPr>
+        <w:tc>
+          <w:tcPr>
+            <w:tcW w:w="2500" w:type="dxa"/>
+            <w:tcBorders>
+              <w:top w:val="single" w:sz="4" w:space="0" w:color="BFBFBF"/>
+              <w:left w:val="single" w:sz="4" w:space="0" w:color="BFBFBF"/>
+              <w:bottom w:val="single" w:sz="4" w:space="0" w:color="BFBFBF"/>
+              <w:right w:val="single" w:sz="4" w:space="0" w:color="BFBFBF"/>
+            </w:tcBorders>
+            <w:shd w:val="clear" w:color="auto" w:fill="F2F2F2"/>
+            <w:tcMar>
+              <w:top w:w="70" w:type="dxa"/>
+              <w:left w:w="110" w:type="dxa"/>
+              <w:bottom w:w="70" w:type="dxa"/>
+              <w:right w:w="110" w:type="dxa"/>
+            </w:tcMar>
+          </w:tcPr>
+          <w:p>
+            <w:r>
+              <w:rPr>
+                <w:b/>
+              </w:rPr>
+              <w:t>Key Methods</w:t>
+            </w:r>
+          </w:p>
+        </w:tc>
+        <w:tc>
+          <w:tcPr>
+            <w:tcW w:w="6860" w:type="dxa"/>
+            <w:tcBorders>
+              <w:top w:val="single" w:sz="4" w:space="0" w:color="BFBFBF"/>
+              <w:left w:val="single" w:sz="4" w:space="0" w:color="BFBFBF"/>
+              <w:bottom w:val="single" w:sz="4" w:space="0" w:color="BFBFBF"/>
+              <w:right w:val="single" w:sz="4" w:space="0" w:color="BFBFBF"/>
+            </w:tcBorders>
+            <w:tcMar>
+              <w:top w:w="70" w:type="dxa"/>
+              <w:left w:w="110" w:type="dxa"/>
+              <w:bottom w:w="70" w:type="dxa"/>
+              <w:right w:w="110" w:type="dxa"/>
+            </w:tcMar>
+          </w:tcPr>
+          <w:p>
+            <w:r>
+              <w:rPr/>
+              <w:t>StoryController.startStory(Scenario, String), Scenario.readyToStart(), StoryAgent.planPlot(Scenario, String), PlotPlanner.createPlot(Scenario, String), PlotPlanner.parseEvents(String), PlotPlanner.planStep(StorySession, String), Plot.nextPending().</w:t>
+            </w:r>
+          </w:p>
+        </w:tc>
+      </w:tr>
+      <w:tr>
+        <w:trPr>
+          <w:cantSplit/>
+        </w:trPr>
+        <w:tc>
+          <w:tcPr>
+            <w:tcW w:w="2500" w:type="dxa"/>
+            <w:tcBorders>
+              <w:top w:val="single" w:sz="4" w:space="0" w:color="BFBFBF"/>
+              <w:left w:val="single" w:sz="4" w:space="0" w:color="BFBFBF"/>
+              <w:bottom w:val="single" w:sz="4" w:space="0" w:color="BFBFBF"/>
+              <w:right w:val="single" w:sz="4" w:space="0" w:color="BFBFBF"/>
+            </w:tcBorders>
+            <w:shd w:val="clear" w:color="auto" w:fill="F2F2F2"/>
+            <w:tcMar>
+              <w:top w:w="70" w:type="dxa"/>
+              <w:left w:w="110" w:type="dxa"/>
+              <w:bottom w:w="70" w:type="dxa"/>
+              <w:right w:w="110" w:type="dxa"/>
+            </w:tcMar>
+          </w:tcPr>
+          <w:p>
+            <w:r>
+              <w:rPr>
+                <w:b/>
+              </w:rPr>
+              <w:t>Design Patterns</w:t>
+            </w:r>
+          </w:p>
+        </w:tc>
+        <w:tc>
+          <w:tcPr>
+            <w:tcW w:w="6860" w:type="dxa"/>
+            <w:tcBorders>
+              <w:top w:val="single" w:sz="4" w:space="0" w:color="BFBFBF"/>
+              <w:left w:val="single" w:sz="4" w:space="0" w:color="BFBFBF"/>
+              <w:bottom w:val="single" w:sz="4" w:space="0" w:color="BFBFBF"/>
+              <w:right w:val="single" w:sz="4" w:space="0" w:color="BFBFBF"/>
+            </w:tcBorders>
+            <w:tcMar>
+              <w:top w:w="70" w:type="dxa"/>
+              <w:left w:w="110" w:type="dxa"/>
+              <w:bottom w:w="70" w:type="dxa"/>
+              <w:right w:w="110" w:type="dxa"/>
+            </w:tcMar>
+          </w:tcPr>
+          <w:p>
+            <w:r>
+              <w:rPr/>
+              <w:t>Facade: the controller only calls StoryAgent.planPlot. Adapter: the request goes through LLMClient. MVC: the CLI collects the fields and calls the controller; the plan never reaches a view.</w:t>
+            </w:r>
+          </w:p>
+        </w:tc>
+      </w:tr>
+      <w:tr>
+        <w:trPr>
+          <w:cantSplit/>
+        </w:trPr>
+        <w:tc>
+          <w:tcPr>
+            <w:tcW w:w="2500" w:type="dxa"/>
+            <w:tcBorders>
+              <w:top w:val="single" w:sz="4" w:space="0" w:color="BFBFBF"/>
+              <w:left w:val="single" w:sz="4" w:space="0" w:color="BFBFBF"/>
+              <w:bottom w:val="single" w:sz="4" w:space="0" w:color="BFBFBF"/>
+              <w:right w:val="single" w:sz="4" w:space="0" w:color="BFBFBF"/>
+            </w:tcBorders>
+            <w:shd w:val="clear" w:color="auto" w:fill="F2F2F2"/>
+            <w:tcMar>
+              <w:top w:w="70" w:type="dxa"/>
+              <w:left w:w="110" w:type="dxa"/>
+              <w:bottom w:w="70" w:type="dxa"/>
+              <w:right w:w="110" w:type="dxa"/>
+            </w:tcMar>
+          </w:tcPr>
+          <w:p>
+            <w:r>
+              <w:rPr>
+                <w:b/>
+              </w:rPr>
+              <w:t>Collaboration (Input to Result)</w:t>
+            </w:r>
+          </w:p>
+        </w:tc>
+        <w:tc>
+          <w:tcPr>
+            <w:tcW w:w="6860" w:type="dxa"/>
+            <w:tcBorders>
+              <w:top w:val="single" w:sz="4" w:space="0" w:color="BFBFBF"/>
+              <w:left w:val="single" w:sz="4" w:space="0" w:color="BFBFBF"/>
+              <w:bottom w:val="single" w:sz="4" w:space="0" w:color="BFBFBF"/>
+              <w:right w:val="single" w:sz="4" w:space="0" w:color="BFBFBF"/>
+            </w:tcBorders>
+            <w:tcMar>
+              <w:top w:w="70" w:type="dxa"/>
+              <w:left w:w="110" w:type="dxa"/>
+              <w:bottom w:w="70" w:type="dxa"/>
+              <w:right w:w="110" w:type="dxa"/>
+            </w:tcMar>
+          </w:tcPr>
+          <w:p>
+            <w:r>
+              <w:rPr/>
+              <w:t>1. The user types start and answers the scenario questions, ending with an optional plot basis.</w:t>
+            </w:r>
+          </w:p>
+          <w:p>
+            <w:r>
+              <w:rPr/>
+              <w:t>2. StoryCLI builds a Scenario and calls StoryController.startStory(scenario, basis).</w:t>
+            </w:r>
+          </w:p>
+          <w:p>
+            <w:r>
+              <w:rPr/>
+              <w:t>3. The controller calls scenario.readyToStart() (premise and setting are required; a title is made if missing).</w:t>
+            </w:r>
+          </w:p>
+          <w:p>
+            <w:r>
+              <w:rPr/>
+              <w:t>4. The controller calls StoryAgent.planPlot, which calls PlotPlanner.createPlot.</w:t>
+            </w:r>
+          </w:p>
+          <w:p>
+            <w:r>
+              <w:rPr/>
+              <w:t>5. The planner sends the scenario and the basis with the planning prompt through LLMClient.generate and parses {"events": [...]} from the reply into PivotalEvents E1..En, all PENDING.</w:t>
+            </w:r>
+          </w:p>
+          <w:p>
+            <w:r>
+              <w:rPr/>
+              <w:t>6. The controller puts the scenario and the Plot on the session (the open empty one, or a new one) and notifies the observers; the CLI prints only that the story has begun.</w:t>
+            </w:r>
+          </w:p>
+          <w:p>
+            <w:r>
+              <w:rPr/>
+              <w:t>7. On every later turn PlotPlanner.planStep sends the next pending event to the narrator in a hidden section.</w:t>
+            </w:r>
+          </w:p>
+        </w:tc>
+      </w:tr>
+      <w:tr>
+        <w:trPr>
+          <w:cantSplit/>
+        </w:trPr>
+        <w:tc>
+          <w:tcPr>
+            <w:tcW w:w="2500" w:type="dxa"/>
+            <w:tcBorders>
+              <w:top w:val="single" w:sz="4" w:space="0" w:color="BFBFBF"/>
+              <w:left w:val="single" w:sz="4" w:space="0" w:color="BFBFBF"/>
+              <w:bottom w:val="single" w:sz="4" w:space="0" w:color="BFBFBF"/>
+              <w:right w:val="single" w:sz="4" w:space="0" w:color="BFBFBF"/>
+            </w:tcBorders>
+            <w:shd w:val="clear" w:color="auto" w:fill="F2F2F2"/>
+            <w:tcMar>
+              <w:top w:w="70" w:type="dxa"/>
+              <w:left w:w="110" w:type="dxa"/>
+              <w:bottom w:w="70" w:type="dxa"/>
+              <w:right w:w="110" w:type="dxa"/>
+            </w:tcMar>
+          </w:tcPr>
+          <w:p>
+            <w:r>
+              <w:rPr>
+                <w:b/>
+              </w:rPr>
+              <w:t>GUI and CLI Access</w:t>
+            </w:r>
+          </w:p>
+        </w:tc>
+        <w:tc>
+          <w:tcPr>
+            <w:tcW w:w="6860" w:type="dxa"/>
+            <w:tcBorders>
+              <w:top w:val="single" w:sz="4" w:space="0" w:color="BFBFBF"/>
+              <w:left w:val="single" w:sz="4" w:space="0" w:color="BFBFBF"/>
+              <w:bottom w:val="single" w:sz="4" w:space="0" w:color="BFBFBF"/>
+              <w:right w:val="single" w:sz="4" w:space="0" w:color="BFBFBF"/>
+            </w:tcBorders>
+            <w:tcMar>
+              <w:top w:w="70" w:type="dxa"/>
+              <w:left w:w="110" w:type="dxa"/>
+              <w:bottom w:w="70" w:type="dxa"/>
+              <w:right w:w="110" w:type="dxa"/>
+            </w:tcMar>
+          </w:tcPr>
+          <w:p>
+            <w:r>
+              <w:rPr/>
+              <w:t>CLI: start (Title, Premise, Tone, Setting, Opening situation, Plot basis). GUI: the new-story form arrives with the GUI slice this week.</w:t>
+            </w:r>
+          </w:p>
+        </w:tc>
+      </w:tr>
+      <w:tr>
+        <w:trPr>
+          <w:cantSplit/>
+        </w:trPr>
+        <w:tc>
+          <w:tcPr>
+            <w:tcW w:w="2500" w:type="dxa"/>
+            <w:tcBorders>
+              <w:top w:val="single" w:sz="4" w:space="0" w:color="BFBFBF"/>
+              <w:left w:val="single" w:sz="4" w:space="0" w:color="BFBFBF"/>
+              <w:bottom w:val="single" w:sz="4" w:space="0" w:color="BFBFBF"/>
+              <w:right w:val="single" w:sz="4" w:space="0" w:color="BFBFBF"/>
+            </w:tcBorders>
+            <w:shd w:val="clear" w:color="auto" w:fill="F2F2F2"/>
+            <w:tcMar>
+              <w:top w:w="70" w:type="dxa"/>
+              <w:left w:w="110" w:type="dxa"/>
+              <w:bottom w:w="70" w:type="dxa"/>
+              <w:right w:w="110" w:type="dxa"/>
+            </w:tcMar>
+          </w:tcPr>
+          <w:p>
+            <w:r>
+              <w:rPr>
+                <w:b/>
+              </w:rPr>
+              <w:t>Error / Alternative Behaviour</w:t>
+            </w:r>
+          </w:p>
+        </w:tc>
+        <w:tc>
+          <w:tcPr>
+            <w:tcW w:w="6860" w:type="dxa"/>
+            <w:tcBorders>
+              <w:top w:val="single" w:sz="4" w:space="0" w:color="BFBFBF"/>
+              <w:left w:val="single" w:sz="4" w:space="0" w:color="BFBFBF"/>
+              <w:bottom w:val="single" w:sz="4" w:space="0" w:color="BFBFBF"/>
+              <w:right w:val="single" w:sz="4" w:space="0" w:color="BFBFBF"/>
+            </w:tcBorders>
+            <w:tcMar>
+              <w:top w:w="70" w:type="dxa"/>
+              <w:left w:w="110" w:type="dxa"/>
+              <w:bottom w:w="70" w:type="dxa"/>
+              <w:right w:w="110" w:type="dxa"/>
+            </w:tcMar>
+          </w:tcPr>
+          <w:p>
+            <w:r>
+              <w:rPr/>
+              <w:t>Empty premise or setting: a message, and no model call. Claude declines, the call fails, or the reply has no events: an error message ("Claude did not return any pivotal events. Try starting the story again.") and no story is started; the open session is unchanged.</w:t>
+            </w:r>
+          </w:p>
+        </w:tc>
+      </w:tr>
+      <w:tr>
+        <w:trPr>
+          <w:cantSplit/>
+        </w:trPr>
+        <w:tc>
+          <w:tcPr>
+            <w:tcW w:w="2500" w:type="dxa"/>
+            <w:tcBorders>
+              <w:top w:val="single" w:sz="4" w:space="0" w:color="BFBFBF"/>
+              <w:left w:val="single" w:sz="4" w:space="0" w:color="BFBFBF"/>
+              <w:bottom w:val="single" w:sz="4" w:space="0" w:color="BFBFBF"/>
+              <w:right w:val="single" w:sz="4" w:space="0" w:color="BFBFBF"/>
+            </w:tcBorders>
+            <w:shd w:val="clear" w:color="auto" w:fill="F2F2F2"/>
+            <w:tcMar>
+              <w:top w:w="70" w:type="dxa"/>
+              <w:left w:w="110" w:type="dxa"/>
+              <w:bottom w:w="70" w:type="dxa"/>
+              <w:right w:w="110" w:type="dxa"/>
+            </w:tcMar>
+          </w:tcPr>
+          <w:p>
+            <w:r>
+              <w:rPr>
+                <w:b/>
+              </w:rPr>
+              <w:t>Video Link and Timestamp</w:t>
+            </w:r>
+          </w:p>
+        </w:tc>
+        <w:tc>
+          <w:tcPr>
+            <w:tcW w:w="6860" w:type="dxa"/>
+            <w:tcBorders>
+              <w:top w:val="single" w:sz="4" w:space="0" w:color="BFBFBF"/>
+              <w:left w:val="single" w:sz="4" w:space="0" w:color="BFBFBF"/>
+              <w:bottom w:val="single" w:sz="4" w:space="0" w:color="BFBFBF"/>
+              <w:right w:val="single" w:sz="4" w:space="0" w:color="BFBFBF"/>
+            </w:tcBorders>
+            <w:tcMar>
+              <w:top w:w="70" w:type="dxa"/>
+              <w:left w:w="110" w:type="dxa"/>
+              <w:bottom w:w="70" w:type="dxa"/>
+              <w:right w:w="110" w:type="dxa"/>
+            </w:tcMar>
+          </w:tcPr>
+          <w:p>
+            <w:r>
               <w:rPr>
                 <w:i/>
                 <w:color w:val="7F7F7F"/>
               </w:rPr>
-              <w:t>[Done / Partial / Changed / Dropped]</w:t>
+              <w:t>[Link and mm:ss, matching Section 7.]</w:t>
             </w:r>
           </w:p>
         </w:tc>
@@ -5281,7 +5767,7 @@
               <w:rPr>
                 <w:b/>
               </w:rPr>
-              <w:t>Type</w:t>
+              <w:t>Changes from Stage 1</w:t>
             </w:r>
           </w:p>
         </w:tc>
@@ -5303,467 +5789,8 @@
           </w:tcPr>
           <w:p>
             <w:r>
-              <w:rPr>
-                <w:i/>
-                <w:color w:val="7F7F7F"/>
-              </w:rPr>
-              <w:t>Hybrid (Stage 1). [Confirm, and say which steps are deterministic code and which call the model.]</w:t>
-            </w:r>
-          </w:p>
-        </w:tc>
-      </w:tr>
-      <w:tr>
-        <w:trPr>
-          <w:cantSplit/>
-        </w:trPr>
-        <w:tc>
-          <w:tcPr>
-            <w:tcW w:w="2500" w:type="dxa"/>
-            <w:tcBorders>
-              <w:top w:val="single" w:sz="4" w:space="0" w:color="BFBFBF"/>
-              <w:left w:val="single" w:sz="4" w:space="0" w:color="BFBFBF"/>
-              <w:bottom w:val="single" w:sz="4" w:space="0" w:color="BFBFBF"/>
-              <w:right w:val="single" w:sz="4" w:space="0" w:color="BFBFBF"/>
-            </w:tcBorders>
-            <w:shd w:val="clear" w:color="auto" w:fill="F2F2F2"/>
-            <w:tcMar>
-              <w:top w:w="70" w:type="dxa"/>
-              <w:left w:w="110" w:type="dxa"/>
-              <w:bottom w:w="70" w:type="dxa"/>
-              <w:right w:w="110" w:type="dxa"/>
-            </w:tcMar>
-          </w:tcPr>
-          <w:p>
-            <w:r>
-              <w:rPr>
-                <w:b/>
-              </w:rPr>
-              <w:t>Classes / Files and Responsibilities</w:t>
-            </w:r>
-          </w:p>
-        </w:tc>
-        <w:tc>
-          <w:tcPr>
-            <w:tcW w:w="6860" w:type="dxa"/>
-            <w:tcBorders>
-              <w:top w:val="single" w:sz="4" w:space="0" w:color="BFBFBF"/>
-              <w:left w:val="single" w:sz="4" w:space="0" w:color="BFBFBF"/>
-              <w:bottom w:val="single" w:sz="4" w:space="0" w:color="BFBFBF"/>
-              <w:right w:val="single" w:sz="4" w:space="0" w:color="BFBFBF"/>
-            </w:tcBorders>
-            <w:tcMar>
-              <w:top w:w="70" w:type="dxa"/>
-              <w:left w:w="110" w:type="dxa"/>
-              <w:bottom w:w="70" w:type="dxa"/>
-              <w:right w:w="110" w:type="dxa"/>
-            </w:tcMar>
-          </w:tcPr>
-          <w:p>
-            <w:r>
-              <w:rPr>
-                <w:i/>
-                <w:color w:val="7F7F7F"/>
-              </w:rPr>
-              <w:t>[One line per class: Class (src/main/java/ca/yorku/storyteller/&lt;package&gt;/Class.java): responsibility. Stage 1 planned: StoryController, StoryAgent, PlotPlanner, Plot, PivotalEvent, EventStatus.]</w:t>
-            </w:r>
-          </w:p>
-        </w:tc>
-      </w:tr>
-      <w:tr>
-        <w:trPr>
-          <w:cantSplit/>
-        </w:trPr>
-        <w:tc>
-          <w:tcPr>
-            <w:tcW w:w="2500" w:type="dxa"/>
-            <w:tcBorders>
-              <w:top w:val="single" w:sz="4" w:space="0" w:color="BFBFBF"/>
-              <w:left w:val="single" w:sz="4" w:space="0" w:color="BFBFBF"/>
-              <w:bottom w:val="single" w:sz="4" w:space="0" w:color="BFBFBF"/>
-              <w:right w:val="single" w:sz="4" w:space="0" w:color="BFBFBF"/>
-            </w:tcBorders>
-            <w:shd w:val="clear" w:color="auto" w:fill="F2F2F2"/>
-            <w:tcMar>
-              <w:top w:w="70" w:type="dxa"/>
-              <w:left w:w="110" w:type="dxa"/>
-              <w:bottom w:w="70" w:type="dxa"/>
-              <w:right w:w="110" w:type="dxa"/>
-            </w:tcMar>
-          </w:tcPr>
-          <w:p>
-            <w:r>
-              <w:rPr>
-                <w:b/>
-              </w:rPr>
-              <w:t>Key Methods</w:t>
-            </w:r>
-          </w:p>
-        </w:tc>
-        <w:tc>
-          <w:tcPr>
-            <w:tcW w:w="6860" w:type="dxa"/>
-            <w:tcBorders>
-              <w:top w:val="single" w:sz="4" w:space="0" w:color="BFBFBF"/>
-              <w:left w:val="single" w:sz="4" w:space="0" w:color="BFBFBF"/>
-              <w:bottom w:val="single" w:sz="4" w:space="0" w:color="BFBFBF"/>
-              <w:right w:val="single" w:sz="4" w:space="0" w:color="BFBFBF"/>
-            </w:tcBorders>
-            <w:tcMar>
-              <w:top w:w="70" w:type="dxa"/>
-              <w:left w:w="110" w:type="dxa"/>
-              <w:bottom w:w="70" w:type="dxa"/>
-              <w:right w:w="110" w:type="dxa"/>
-            </w:tcMar>
-          </w:tcPr>
-          <w:p>
-            <w:r>
-              <w:rPr>
-                <w:i/>
-                <w:color w:val="7F7F7F"/>
-              </w:rPr>
-              <w:t>[The methods that actually carry the feature, as Class.method(params).]</w:t>
-            </w:r>
-          </w:p>
-        </w:tc>
-      </w:tr>
-      <w:tr>
-        <w:trPr>
-          <w:cantSplit/>
-        </w:trPr>
-        <w:tc>
-          <w:tcPr>
-            <w:tcW w:w="2500" w:type="dxa"/>
-            <w:tcBorders>
-              <w:top w:val="single" w:sz="4" w:space="0" w:color="BFBFBF"/>
-              <w:left w:val="single" w:sz="4" w:space="0" w:color="BFBFBF"/>
-              <w:bottom w:val="single" w:sz="4" w:space="0" w:color="BFBFBF"/>
-              <w:right w:val="single" w:sz="4" w:space="0" w:color="BFBFBF"/>
-            </w:tcBorders>
-            <w:shd w:val="clear" w:color="auto" w:fill="F2F2F2"/>
-            <w:tcMar>
-              <w:top w:w="70" w:type="dxa"/>
-              <w:left w:w="110" w:type="dxa"/>
-              <w:bottom w:w="70" w:type="dxa"/>
-              <w:right w:w="110" w:type="dxa"/>
-            </w:tcMar>
-          </w:tcPr>
-          <w:p>
-            <w:r>
-              <w:rPr>
-                <w:b/>
-              </w:rPr>
-              <w:t>Design Patterns</w:t>
-            </w:r>
-          </w:p>
-        </w:tc>
-        <w:tc>
-          <w:tcPr>
-            <w:tcW w:w="6860" w:type="dxa"/>
-            <w:tcBorders>
-              <w:top w:val="single" w:sz="4" w:space="0" w:color="BFBFBF"/>
-              <w:left w:val="single" w:sz="4" w:space="0" w:color="BFBFBF"/>
-              <w:bottom w:val="single" w:sz="4" w:space="0" w:color="BFBFBF"/>
-              <w:right w:val="single" w:sz="4" w:space="0" w:color="BFBFBF"/>
-            </w:tcBorders>
-            <w:tcMar>
-              <w:top w:w="70" w:type="dxa"/>
-              <w:left w:w="110" w:type="dxa"/>
-              <w:bottom w:w="70" w:type="dxa"/>
-              <w:right w:w="110" w:type="dxa"/>
-            </w:tcMar>
-          </w:tcPr>
-          <w:p>
-            <w:r>
-              <w:rPr>
-                <w:i/>
-                <w:color w:val="7F7F7F"/>
-              </w:rPr>
-              <w:t>[Stage 1: Adapter, Facade, MVC. Confirm against the code.]</w:t>
-            </w:r>
-          </w:p>
-        </w:tc>
-      </w:tr>
-      <w:tr>
-        <w:trPr>
-          <w:cantSplit/>
-        </w:trPr>
-        <w:tc>
-          <w:tcPr>
-            <w:tcW w:w="2500" w:type="dxa"/>
-            <w:tcBorders>
-              <w:top w:val="single" w:sz="4" w:space="0" w:color="BFBFBF"/>
-              <w:left w:val="single" w:sz="4" w:space="0" w:color="BFBFBF"/>
-              <w:bottom w:val="single" w:sz="4" w:space="0" w:color="BFBFBF"/>
-              <w:right w:val="single" w:sz="4" w:space="0" w:color="BFBFBF"/>
-            </w:tcBorders>
-            <w:shd w:val="clear" w:color="auto" w:fill="F2F2F2"/>
-            <w:tcMar>
-              <w:top w:w="70" w:type="dxa"/>
-              <w:left w:w="110" w:type="dxa"/>
-              <w:bottom w:w="70" w:type="dxa"/>
-              <w:right w:w="110" w:type="dxa"/>
-            </w:tcMar>
-          </w:tcPr>
-          <w:p>
-            <w:r>
-              <w:rPr>
-                <w:b/>
-              </w:rPr>
-              <w:t>Collaboration (Input to Result)</w:t>
-            </w:r>
-          </w:p>
-        </w:tc>
-        <w:tc>
-          <w:tcPr>
-            <w:tcW w:w="6860" w:type="dxa"/>
-            <w:tcBorders>
-              <w:top w:val="single" w:sz="4" w:space="0" w:color="BFBFBF"/>
-              <w:left w:val="single" w:sz="4" w:space="0" w:color="BFBFBF"/>
-              <w:bottom w:val="single" w:sz="4" w:space="0" w:color="BFBFBF"/>
-              <w:right w:val="single" w:sz="4" w:space="0" w:color="BFBFBF"/>
-            </w:tcBorders>
-            <w:tcMar>
-              <w:top w:w="70" w:type="dxa"/>
-              <w:left w:w="110" w:type="dxa"/>
-              <w:bottom w:w="70" w:type="dxa"/>
-              <w:right w:w="110" w:type="dxa"/>
-            </w:tcMar>
-          </w:tcPr>
-          <w:p>
-            <w:r>
-              <w:rPr>
-                <w:i/>
-                <w:color w:val="7F7F7F"/>
-              </w:rPr>
-              <w:t>[Numbered walk-through from the user's action in StoryGUI / StoryCLI, through StoryController and the agent, to what the user sees.]</w:t>
-            </w:r>
-          </w:p>
-        </w:tc>
-      </w:tr>
-      <w:tr>
-        <w:trPr>
-          <w:cantSplit/>
-        </w:trPr>
-        <w:tc>
-          <w:tcPr>
-            <w:tcW w:w="2500" w:type="dxa"/>
-            <w:tcBorders>
-              <w:top w:val="single" w:sz="4" w:space="0" w:color="BFBFBF"/>
-              <w:left w:val="single" w:sz="4" w:space="0" w:color="BFBFBF"/>
-              <w:bottom w:val="single" w:sz="4" w:space="0" w:color="BFBFBF"/>
-              <w:right w:val="single" w:sz="4" w:space="0" w:color="BFBFBF"/>
-            </w:tcBorders>
-            <w:shd w:val="clear" w:color="auto" w:fill="F2F2F2"/>
-            <w:tcMar>
-              <w:top w:w="70" w:type="dxa"/>
-              <w:left w:w="110" w:type="dxa"/>
-              <w:bottom w:w="70" w:type="dxa"/>
-              <w:right w:w="110" w:type="dxa"/>
-            </w:tcMar>
-          </w:tcPr>
-          <w:p>
-            <w:r>
-              <w:rPr>
-                <w:b/>
-              </w:rPr>
-              <w:t>GUI and CLI Access</w:t>
-            </w:r>
-          </w:p>
-        </w:tc>
-        <w:tc>
-          <w:tcPr>
-            <w:tcW w:w="6860" w:type="dxa"/>
-            <w:tcBorders>
-              <w:top w:val="single" w:sz="4" w:space="0" w:color="BFBFBF"/>
-              <w:left w:val="single" w:sz="4" w:space="0" w:color="BFBFBF"/>
-              <w:bottom w:val="single" w:sz="4" w:space="0" w:color="BFBFBF"/>
-              <w:right w:val="single" w:sz="4" w:space="0" w:color="BFBFBF"/>
-            </w:tcBorders>
-            <w:tcMar>
-              <w:top w:w="70" w:type="dxa"/>
-              <w:left w:w="110" w:type="dxa"/>
-              <w:bottom w:w="70" w:type="dxa"/>
-              <w:right w:w="110" w:type="dxa"/>
-            </w:tcMar>
-          </w:tcPr>
-          <w:p>
-            <w:r>
-              <w:rPr>
-                <w:i/>
-                <w:color w:val="7F7F7F"/>
-              </w:rPr>
-              <w:t>[GUI: the menu, button or panel. CLI: the command and its arguments.]</w:t>
-            </w:r>
-          </w:p>
-        </w:tc>
-      </w:tr>
-      <w:tr>
-        <w:trPr>
-          <w:cantSplit/>
-        </w:trPr>
-        <w:tc>
-          <w:tcPr>
-            <w:tcW w:w="2500" w:type="dxa"/>
-            <w:tcBorders>
-              <w:top w:val="single" w:sz="4" w:space="0" w:color="BFBFBF"/>
-              <w:left w:val="single" w:sz="4" w:space="0" w:color="BFBFBF"/>
-              <w:bottom w:val="single" w:sz="4" w:space="0" w:color="BFBFBF"/>
-              <w:right w:val="single" w:sz="4" w:space="0" w:color="BFBFBF"/>
-            </w:tcBorders>
-            <w:shd w:val="clear" w:color="auto" w:fill="F2F2F2"/>
-            <w:tcMar>
-              <w:top w:w="70" w:type="dxa"/>
-              <w:left w:w="110" w:type="dxa"/>
-              <w:bottom w:w="70" w:type="dxa"/>
-              <w:right w:w="110" w:type="dxa"/>
-            </w:tcMar>
-          </w:tcPr>
-          <w:p>
-            <w:r>
-              <w:rPr>
-                <w:b/>
-              </w:rPr>
-              <w:t>Error / Alternative Behaviour</w:t>
-            </w:r>
-          </w:p>
-        </w:tc>
-        <w:tc>
-          <w:tcPr>
-            <w:tcW w:w="6860" w:type="dxa"/>
-            <w:tcBorders>
-              <w:top w:val="single" w:sz="4" w:space="0" w:color="BFBFBF"/>
-              <w:left w:val="single" w:sz="4" w:space="0" w:color="BFBFBF"/>
-              <w:bottom w:val="single" w:sz="4" w:space="0" w:color="BFBFBF"/>
-              <w:right w:val="single" w:sz="4" w:space="0" w:color="BFBFBF"/>
-            </w:tcBorders>
-            <w:tcMar>
-              <w:top w:w="70" w:type="dxa"/>
-              <w:left w:w="110" w:type="dxa"/>
-              <w:bottom w:w="70" w:type="dxa"/>
-              <w:right w:w="110" w:type="dxa"/>
-            </w:tcMar>
-          </w:tcPr>
-          <w:p>
-            <w:r>
-              <w:rPr>
-                <w:i/>
-                <w:color w:val="7F7F7F"/>
-              </w:rPr>
-              <w:t>[What happens on invalid input or a model failure, and how it is shown.]</w:t>
-            </w:r>
-          </w:p>
-        </w:tc>
-      </w:tr>
-      <w:tr>
-        <w:trPr>
-          <w:cantSplit/>
-        </w:trPr>
-        <w:tc>
-          <w:tcPr>
-            <w:tcW w:w="2500" w:type="dxa"/>
-            <w:tcBorders>
-              <w:top w:val="single" w:sz="4" w:space="0" w:color="BFBFBF"/>
-              <w:left w:val="single" w:sz="4" w:space="0" w:color="BFBFBF"/>
-              <w:bottom w:val="single" w:sz="4" w:space="0" w:color="BFBFBF"/>
-              <w:right w:val="single" w:sz="4" w:space="0" w:color="BFBFBF"/>
-            </w:tcBorders>
-            <w:shd w:val="clear" w:color="auto" w:fill="F2F2F2"/>
-            <w:tcMar>
-              <w:top w:w="70" w:type="dxa"/>
-              <w:left w:w="110" w:type="dxa"/>
-              <w:bottom w:w="70" w:type="dxa"/>
-              <w:right w:w="110" w:type="dxa"/>
-            </w:tcMar>
-          </w:tcPr>
-          <w:p>
-            <w:r>
-              <w:rPr>
-                <w:b/>
-              </w:rPr>
-              <w:t>Video Link and Timestamp</w:t>
-            </w:r>
-          </w:p>
-        </w:tc>
-        <w:tc>
-          <w:tcPr>
-            <w:tcW w:w="6860" w:type="dxa"/>
-            <w:tcBorders>
-              <w:top w:val="single" w:sz="4" w:space="0" w:color="BFBFBF"/>
-              <w:left w:val="single" w:sz="4" w:space="0" w:color="BFBFBF"/>
-              <w:bottom w:val="single" w:sz="4" w:space="0" w:color="BFBFBF"/>
-              <w:right w:val="single" w:sz="4" w:space="0" w:color="BFBFBF"/>
-            </w:tcBorders>
-            <w:tcMar>
-              <w:top w:w="70" w:type="dxa"/>
-              <w:left w:w="110" w:type="dxa"/>
-              <w:bottom w:w="70" w:type="dxa"/>
-              <w:right w:w="110" w:type="dxa"/>
-            </w:tcMar>
-          </w:tcPr>
-          <w:p>
-            <w:r>
-              <w:rPr>
-                <w:i/>
-                <w:color w:val="7F7F7F"/>
-              </w:rPr>
-              <w:t>[Link and mm:ss, matching Section 7.]</w:t>
-            </w:r>
-          </w:p>
-        </w:tc>
-      </w:tr>
-      <w:tr>
-        <w:trPr>
-          <w:cantSplit/>
-        </w:trPr>
-        <w:tc>
-          <w:tcPr>
-            <w:tcW w:w="2500" w:type="dxa"/>
-            <w:tcBorders>
-              <w:top w:val="single" w:sz="4" w:space="0" w:color="BFBFBF"/>
-              <w:left w:val="single" w:sz="4" w:space="0" w:color="BFBFBF"/>
-              <w:bottom w:val="single" w:sz="4" w:space="0" w:color="BFBFBF"/>
-              <w:right w:val="single" w:sz="4" w:space="0" w:color="BFBFBF"/>
-            </w:tcBorders>
-            <w:shd w:val="clear" w:color="auto" w:fill="F2F2F2"/>
-            <w:tcMar>
-              <w:top w:w="70" w:type="dxa"/>
-              <w:left w:w="110" w:type="dxa"/>
-              <w:bottom w:w="70" w:type="dxa"/>
-              <w:right w:w="110" w:type="dxa"/>
-            </w:tcMar>
-          </w:tcPr>
-          <w:p>
-            <w:r>
-              <w:rPr>
-                <w:b/>
-              </w:rPr>
-              <w:t>Changes from Stage 1</w:t>
-            </w:r>
-          </w:p>
-        </w:tc>
-        <w:tc>
-          <w:tcPr>
-            <w:tcW w:w="6860" w:type="dxa"/>
-            <w:tcBorders>
-              <w:top w:val="single" w:sz="4" w:space="0" w:color="BFBFBF"/>
-              <w:left w:val="single" w:sz="4" w:space="0" w:color="BFBFBF"/>
-              <w:bottom w:val="single" w:sz="4" w:space="0" w:color="BFBFBF"/>
-              <w:right w:val="single" w:sz="4" w:space="0" w:color="BFBFBF"/>
-            </w:tcBorders>
-            <w:tcMar>
-              <w:top w:w="70" w:type="dxa"/>
-              <w:left w:w="110" w:type="dxa"/>
-              <w:bottom w:w="70" w:type="dxa"/>
-              <w:right w:w="110" w:type="dxa"/>
-            </w:tcMar>
-          </w:tcPr>
-          <w:p>
-            <w:r>
-              <w:rPr>
-                <w:i/>
-                <w:color w:val="7F7F7F"/>
-              </w:rPr>
-              <w:t>[None, or a one-line summary with a pointer to the entry in Section 4.]</w:t>
+              <w:rPr/>
+              <w:t>planStep builds the guidance without a second model call; starting keeps lore prepared beforehand (Section 4).</w:t>
             </w:r>
           </w:p>
         </w:tc>
@@ -15373,6 +15400,99 @@
           </w:p>
         </w:tc>
       </w:tr>
+      <w:tr>
+        <w:trPr>
+          <w:cantSplit/>
+        </w:trPr>
+        <w:tc>
+          <w:tcPr>
+            <w:tcW w:w="1900" w:type="dxa"/>
+            <w:tcBorders>
+              <w:top w:val="single" w:sz="4" w:space="0" w:color="BFBFBF"/>
+              <w:left w:val="single" w:sz="4" w:space="0" w:color="BFBFBF"/>
+              <w:bottom w:val="single" w:sz="4" w:space="0" w:color="BFBFBF"/>
+              <w:right w:val="single" w:sz="4" w:space="0" w:color="BFBFBF"/>
+            </w:tcBorders>
+            <w:tcMar>
+              <w:top w:w="70" w:type="dxa"/>
+              <w:left w:w="110" w:type="dxa"/>
+              <w:bottom w:w="70" w:type="dxa"/>
+              <w:right w:w="110" w:type="dxa"/>
+            </w:tcMar>
+          </w:tcPr>
+          <w:p>
+            <w:r>
+              <w:t>F01/F05</w:t>
+            </w:r>
+          </w:p>
+        </w:tc>
+        <w:tc>
+          <w:tcPr>
+            <w:tcW w:w="2500" w:type="dxa"/>
+            <w:tcBorders>
+              <w:top w:val="single" w:sz="4" w:space="0" w:color="BFBFBF"/>
+              <w:left w:val="single" w:sz="4" w:space="0" w:color="BFBFBF"/>
+              <w:bottom w:val="single" w:sz="4" w:space="0" w:color="BFBFBF"/>
+              <w:right w:val="single" w:sz="4" w:space="0" w:color="BFBFBF"/>
+            </w:tcBorders>
+            <w:tcMar>
+              <w:top w:w="70" w:type="dxa"/>
+              <w:left w:w="110" w:type="dxa"/>
+              <w:bottom w:w="70" w:type="dxa"/>
+              <w:right w:w="110" w:type="dxa"/>
+            </w:tcMar>
+          </w:tcPr>
+          <w:p>
+            <w:r>
+              <w:t>startStory plans first, keeps lore prepared in an empty session; Scenario.readyToStart; controller takes the agent</w:t>
+            </w:r>
+          </w:p>
+        </w:tc>
+        <w:tc>
+          <w:tcPr>
+            <w:tcW w:w="2480" w:type="dxa"/>
+            <w:tcBorders>
+              <w:top w:val="single" w:sz="4" w:space="0" w:color="BFBFBF"/>
+              <w:left w:val="single" w:sz="4" w:space="0" w:color="BFBFBF"/>
+              <w:bottom w:val="single" w:sz="4" w:space="0" w:color="BFBFBF"/>
+              <w:right w:val="single" w:sz="4" w:space="0" w:color="BFBFBF"/>
+            </w:tcBorders>
+            <w:tcMar>
+              <w:top w:w="70" w:type="dxa"/>
+              <w:left w:w="110" w:type="dxa"/>
+              <w:bottom w:w="70" w:type="dxa"/>
+              <w:right w:w="110" w:type="dxa"/>
+            </w:tcMar>
+          </w:tcPr>
+          <w:p>
+            <w:r>
+              <w:t>Lore and characters can be prepared before a scenario; a failed plan must change nothing</w:t>
+            </w:r>
+          </w:p>
+        </w:tc>
+        <w:tc>
+          <w:tcPr>
+            <w:tcW w:w="2480" w:type="dxa"/>
+            <w:tcBorders>
+              <w:top w:val="single" w:sz="4" w:space="0" w:color="BFBFBF"/>
+              <w:left w:val="single" w:sz="4" w:space="0" w:color="BFBFBF"/>
+              <w:bottom w:val="single" w:sz="4" w:space="0" w:color="BFBFBF"/>
+              <w:right w:val="single" w:sz="4" w:space="0" w:color="BFBFBF"/>
+            </w:tcBorders>
+            <w:tcMar>
+              <w:top w:w="70" w:type="dxa"/>
+              <w:left w:w="110" w:type="dxa"/>
+              <w:bottom w:w="70" w:type="dxa"/>
+              <w:right w:w="110" w:type="dxa"/>
+            </w:tcMar>
+          </w:tcPr>
+          <w:p>
+            <w:r>
+              <w:t>UC01; StoryController, Scenario, StoryAgent; SD02</w:t>
+            </w:r>
+          </w:p>
+        </w:tc>
+      </w:tr>
     </w:tbl>
     <w:p>
       <w:pPr>
@@ -18882,6 +19002,445 @@
           <w:p>
             <w:r>
               <w:t>feat(agent): run the tool-use loop in StoryAgent.takeTurn</w:t>
+            </w:r>
+          </w:p>
+        </w:tc>
+      </w:tr>
+    </w:tbl>
+    <w:p>
+      <w:pPr>
+        <w:spacing w:after="0"/>
+      </w:pPr>
+    </w:p>
+    <w:tbl>
+      <w:tblPr>
+        <w:tblLook w:firstColumn="1" w:firstRow="1" w:lastColumn="0" w:lastRow="0" w:noHBand="0" w:noVBand="1" w:val="04A0"/>
+        <w:tblW w:w="9360" w:type="dxa"/>
+      </w:tblPr>
+      <w:tblGrid>
+        <w:gridCol w:w="2500"/>
+        <w:gridCol w:w="6860"/>
+      </w:tblGrid>
+      <w:tr>
+        <w:trPr>
+          <w:cantSplit/>
+        </w:trPr>
+        <w:tc>
+          <w:tcPr>
+            <w:tcW w:w="2500" w:type="dxa"/>
+            <w:tcBorders>
+              <w:top w:val="single" w:sz="4" w:space="0" w:color="BFBFBF"/>
+              <w:left w:val="single" w:sz="4" w:space="0" w:color="BFBFBF"/>
+              <w:bottom w:val="single" w:sz="4" w:space="0" w:color="BFBFBF"/>
+              <w:right w:val="single" w:sz="4" w:space="0" w:color="BFBFBF"/>
+            </w:tcBorders>
+            <w:shd w:val="clear" w:color="auto" w:fill="F2F2F2"/>
+            <w:tcMar>
+              <w:top w:w="70" w:type="dxa"/>
+              <w:left w:w="110" w:type="dxa"/>
+              <w:bottom w:w="70" w:type="dxa"/>
+              <w:right w:w="110" w:type="dxa"/>
+            </w:tcMar>
+          </w:tcPr>
+          <w:p>
+            <w:r>
+              <w:rPr>
+                <w:b/>
+              </w:rPr>
+              <w:t>Original ID</w:t>
+            </w:r>
+          </w:p>
+        </w:tc>
+        <w:tc>
+          <w:tcPr>
+            <w:tcW w:w="6860" w:type="dxa"/>
+            <w:tcBorders>
+              <w:top w:val="single" w:sz="4" w:space="0" w:color="BFBFBF"/>
+              <w:left w:val="single" w:sz="4" w:space="0" w:color="BFBFBF"/>
+              <w:bottom w:val="single" w:sz="4" w:space="0" w:color="BFBFBF"/>
+              <w:right w:val="single" w:sz="4" w:space="0" w:color="BFBFBF"/>
+            </w:tcBorders>
+            <w:tcMar>
+              <w:top w:w="70" w:type="dxa"/>
+              <w:left w:w="110" w:type="dxa"/>
+              <w:bottom w:w="70" w:type="dxa"/>
+              <w:right w:w="110" w:type="dxa"/>
+            </w:tcMar>
+          </w:tcPr>
+          <w:p>
+            <w:r>
+              <w:t>F01/F05: Starting a story keeps lore prepared beforehand</w:t>
+            </w:r>
+          </w:p>
+        </w:tc>
+      </w:tr>
+      <w:tr>
+        <w:trPr>
+          <w:cantSplit/>
+        </w:trPr>
+        <w:tc>
+          <w:tcPr>
+            <w:tcW w:w="2500" w:type="dxa"/>
+            <w:tcBorders>
+              <w:top w:val="single" w:sz="4" w:space="0" w:color="BFBFBF"/>
+              <w:left w:val="single" w:sz="4" w:space="0" w:color="BFBFBF"/>
+              <w:bottom w:val="single" w:sz="4" w:space="0" w:color="BFBFBF"/>
+              <w:right w:val="single" w:sz="4" w:space="0" w:color="BFBFBF"/>
+            </w:tcBorders>
+            <w:shd w:val="clear" w:color="auto" w:fill="F2F2F2"/>
+            <w:tcMar>
+              <w:top w:w="70" w:type="dxa"/>
+              <w:left w:w="110" w:type="dxa"/>
+              <w:bottom w:w="70" w:type="dxa"/>
+              <w:right w:w="110" w:type="dxa"/>
+            </w:tcMar>
+          </w:tcPr>
+          <w:p>
+            <w:r>
+              <w:rPr>
+                <w:b/>
+              </w:rPr>
+              <w:t>Original (Stage 1)</w:t>
+            </w:r>
+          </w:p>
+        </w:tc>
+        <w:tc>
+          <w:tcPr>
+            <w:tcW w:w="6860" w:type="dxa"/>
+            <w:tcBorders>
+              <w:top w:val="single" w:sz="4" w:space="0" w:color="BFBFBF"/>
+              <w:left w:val="single" w:sz="4" w:space="0" w:color="BFBFBF"/>
+              <w:bottom w:val="single" w:sz="4" w:space="0" w:color="BFBFBF"/>
+              <w:right w:val="single" w:sz="4" w:space="0" w:color="BFBFBF"/>
+            </w:tcBorders>
+            <w:tcMar>
+              <w:top w:w="70" w:type="dxa"/>
+              <w:left w:w="110" w:type="dxa"/>
+              <w:bottom w:w="70" w:type="dxa"/>
+              <w:right w:w="110" w:type="dxa"/>
+            </w:tcMar>
+          </w:tcPr>
+          <w:p>
+            <w:r>
+              <w:t>StoryController.startStory(scenario, plotBasis) checks the mandatory fields, has the events planned and creates the StorySession that holds the scenario.</w:t>
+            </w:r>
+          </w:p>
+        </w:tc>
+      </w:tr>
+      <w:tr>
+        <w:trPr>
+          <w:cantSplit/>
+        </w:trPr>
+        <w:tc>
+          <w:tcPr>
+            <w:tcW w:w="2500" w:type="dxa"/>
+            <w:tcBorders>
+              <w:top w:val="single" w:sz="4" w:space="0" w:color="BFBFBF"/>
+              <w:left w:val="single" w:sz="4" w:space="0" w:color="BFBFBF"/>
+              <w:bottom w:val="single" w:sz="4" w:space="0" w:color="BFBFBF"/>
+              <w:right w:val="single" w:sz="4" w:space="0" w:color="BFBFBF"/>
+            </w:tcBorders>
+            <w:shd w:val="clear" w:color="auto" w:fill="F2F2F2"/>
+            <w:tcMar>
+              <w:top w:w="70" w:type="dxa"/>
+              <w:left w:w="110" w:type="dxa"/>
+              <w:bottom w:w="70" w:type="dxa"/>
+              <w:right w:w="110" w:type="dxa"/>
+            </w:tcMar>
+          </w:tcPr>
+          <w:p>
+            <w:r>
+              <w:rPr>
+                <w:b/>
+              </w:rPr>
+              <w:t>Implemented</w:t>
+            </w:r>
+          </w:p>
+        </w:tc>
+        <w:tc>
+          <w:tcPr>
+            <w:tcW w:w="6860" w:type="dxa"/>
+            <w:tcBorders>
+              <w:top w:val="single" w:sz="4" w:space="0" w:color="BFBFBF"/>
+              <w:left w:val="single" w:sz="4" w:space="0" w:color="BFBFBF"/>
+              <w:bottom w:val="single" w:sz="4" w:space="0" w:color="BFBFBF"/>
+              <w:right w:val="single" w:sz="4" w:space="0" w:color="BFBFBF"/>
+            </w:tcBorders>
+            <w:tcMar>
+              <w:top w:w="70" w:type="dxa"/>
+              <w:left w:w="110" w:type="dxa"/>
+              <w:bottom w:w="70" w:type="dxa"/>
+              <w:right w:w="110" w:type="dxa"/>
+            </w:tcMar>
+          </w:tcPr>
+          <w:p>
+            <w:r>
+              <w:t>startStory calls Scenario.readyToStart() (premise and setting mandatory; an empty title becomes the first words of the premise), then StoryAgent.planPlot, and only then changes anything. An empty, unstarted open session receives the scenario and plot; otherwise a new session is created. StoryController takes the StoryAgent in its constructor; isStarted() tells the front ends whether turns are possible. StoryCLI.createController() reads .env; without an API key the app opens and model features report the missing key.</w:t>
+            </w:r>
+          </w:p>
+        </w:tc>
+      </w:tr>
+      <w:tr>
+        <w:trPr>
+          <w:cantSplit/>
+        </w:trPr>
+        <w:tc>
+          <w:tcPr>
+            <w:tcW w:w="2500" w:type="dxa"/>
+            <w:tcBorders>
+              <w:top w:val="single" w:sz="4" w:space="0" w:color="BFBFBF"/>
+              <w:left w:val="single" w:sz="4" w:space="0" w:color="BFBFBF"/>
+              <w:bottom w:val="single" w:sz="4" w:space="0" w:color="BFBFBF"/>
+              <w:right w:val="single" w:sz="4" w:space="0" w:color="BFBFBF"/>
+            </w:tcBorders>
+            <w:shd w:val="clear" w:color="auto" w:fill="F2F2F2"/>
+            <w:tcMar>
+              <w:top w:w="70" w:type="dxa"/>
+              <w:left w:w="110" w:type="dxa"/>
+              <w:bottom w:w="70" w:type="dxa"/>
+              <w:right w:w="110" w:type="dxa"/>
+            </w:tcMar>
+          </w:tcPr>
+          <w:p>
+            <w:r>
+              <w:rPr>
+                <w:b/>
+              </w:rPr>
+              <w:t>What Changed and Why</w:t>
+            </w:r>
+          </w:p>
+        </w:tc>
+        <w:tc>
+          <w:tcPr>
+            <w:tcW w:w="6860" w:type="dxa"/>
+            <w:tcBorders>
+              <w:top w:val="single" w:sz="4" w:space="0" w:color="BFBFBF"/>
+              <w:left w:val="single" w:sz="4" w:space="0" w:color="BFBFBF"/>
+              <w:bottom w:val="single" w:sz="4" w:space="0" w:color="BFBFBF"/>
+              <w:right w:val="single" w:sz="4" w:space="0" w:color="BFBFBF"/>
+            </w:tcBorders>
+            <w:tcMar>
+              <w:top w:w="70" w:type="dxa"/>
+              <w:left w:w="110" w:type="dxa"/>
+              <w:bottom w:w="70" w:type="dxa"/>
+              <w:right w:w="110" w:type="dxa"/>
+            </w:tcMar>
+          </w:tcPr>
+          <w:p>
+            <w:r>
+              <w:t>F02 and F03 already let the user prepare lore and characters before any scenario exists, so starting must not throw that away. Planning before any change means a failed plan leaves everything as it was.</w:t>
+            </w:r>
+          </w:p>
+        </w:tc>
+      </w:tr>
+      <w:tr>
+        <w:trPr>
+          <w:cantSplit/>
+        </w:trPr>
+        <w:tc>
+          <w:tcPr>
+            <w:tcW w:w="2500" w:type="dxa"/>
+            <w:tcBorders>
+              <w:top w:val="single" w:sz="4" w:space="0" w:color="BFBFBF"/>
+              <w:left w:val="single" w:sz="4" w:space="0" w:color="BFBFBF"/>
+              <w:bottom w:val="single" w:sz="4" w:space="0" w:color="BFBFBF"/>
+              <w:right w:val="single" w:sz="4" w:space="0" w:color="BFBFBF"/>
+            </w:tcBorders>
+            <w:shd w:val="clear" w:color="auto" w:fill="F2F2F2"/>
+            <w:tcMar>
+              <w:top w:w="70" w:type="dxa"/>
+              <w:left w:w="110" w:type="dxa"/>
+              <w:bottom w:w="70" w:type="dxa"/>
+              <w:right w:w="110" w:type="dxa"/>
+            </w:tcMar>
+          </w:tcPr>
+          <w:p>
+            <w:r>
+              <w:rPr>
+                <w:b/>
+              </w:rPr>
+              <w:t>How the User Need Is Still Met</w:t>
+            </w:r>
+          </w:p>
+        </w:tc>
+        <w:tc>
+          <w:tcPr>
+            <w:tcW w:w="6860" w:type="dxa"/>
+            <w:tcBorders>
+              <w:top w:val="single" w:sz="4" w:space="0" w:color="BFBFBF"/>
+              <w:left w:val="single" w:sz="4" w:space="0" w:color="BFBFBF"/>
+              <w:bottom w:val="single" w:sz="4" w:space="0" w:color="BFBFBF"/>
+              <w:right w:val="single" w:sz="4" w:space="0" w:color="BFBFBF"/>
+            </w:tcBorders>
+            <w:tcMar>
+              <w:top w:w="70" w:type="dxa"/>
+              <w:left w:w="110" w:type="dxa"/>
+              <w:bottom w:w="70" w:type="dxa"/>
+              <w:right w:w="110" w:type="dxa"/>
+            </w:tcMar>
+          </w:tcPr>
+          <w:p>
+            <w:r>
+              <w:t>The user still writes the scenario, optionally a plot basis, and starts; the plan stays hidden.</w:t>
+            </w:r>
+          </w:p>
+        </w:tc>
+      </w:tr>
+      <w:tr>
+        <w:trPr>
+          <w:cantSplit/>
+        </w:trPr>
+        <w:tc>
+          <w:tcPr>
+            <w:tcW w:w="2500" w:type="dxa"/>
+            <w:tcBorders>
+              <w:top w:val="single" w:sz="4" w:space="0" w:color="BFBFBF"/>
+              <w:left w:val="single" w:sz="4" w:space="0" w:color="BFBFBF"/>
+              <w:bottom w:val="single" w:sz="4" w:space="0" w:color="BFBFBF"/>
+              <w:right w:val="single" w:sz="4" w:space="0" w:color="BFBFBF"/>
+            </w:tcBorders>
+            <w:shd w:val="clear" w:color="auto" w:fill="F2F2F2"/>
+            <w:tcMar>
+              <w:top w:w="70" w:type="dxa"/>
+              <w:left w:w="110" w:type="dxa"/>
+              <w:bottom w:w="70" w:type="dxa"/>
+              <w:right w:w="110" w:type="dxa"/>
+            </w:tcMar>
+          </w:tcPr>
+          <w:p>
+            <w:r>
+              <w:rPr>
+                <w:b/>
+              </w:rPr>
+              <w:t>Affected Use Cases / Classes / Methods / Patterns</w:t>
+            </w:r>
+          </w:p>
+        </w:tc>
+        <w:tc>
+          <w:tcPr>
+            <w:tcW w:w="6860" w:type="dxa"/>
+            <w:tcBorders>
+              <w:top w:val="single" w:sz="4" w:space="0" w:color="BFBFBF"/>
+              <w:left w:val="single" w:sz="4" w:space="0" w:color="BFBFBF"/>
+              <w:bottom w:val="single" w:sz="4" w:space="0" w:color="BFBFBF"/>
+              <w:right w:val="single" w:sz="4" w:space="0" w:color="BFBFBF"/>
+            </w:tcBorders>
+            <w:tcMar>
+              <w:top w:w="70" w:type="dxa"/>
+              <w:left w:w="110" w:type="dxa"/>
+              <w:bottom w:w="70" w:type="dxa"/>
+              <w:right w:w="110" w:type="dxa"/>
+            </w:tcMar>
+          </w:tcPr>
+          <w:p>
+            <w:r>
+              <w:t>UC01; StoryController, Scenario, StoryAgent, PlotPlanner, StoryCLI, StoryGUI; Facade, MVC.</w:t>
+            </w:r>
+          </w:p>
+        </w:tc>
+      </w:tr>
+      <w:tr>
+        <w:trPr>
+          <w:cantSplit/>
+        </w:trPr>
+        <w:tc>
+          <w:tcPr>
+            <w:tcW w:w="2500" w:type="dxa"/>
+            <w:tcBorders>
+              <w:top w:val="single" w:sz="4" w:space="0" w:color="BFBFBF"/>
+              <w:left w:val="single" w:sz="4" w:space="0" w:color="BFBFBF"/>
+              <w:bottom w:val="single" w:sz="4" w:space="0" w:color="BFBFBF"/>
+              <w:right w:val="single" w:sz="4" w:space="0" w:color="BFBFBF"/>
+            </w:tcBorders>
+            <w:shd w:val="clear" w:color="auto" w:fill="F2F2F2"/>
+            <w:tcMar>
+              <w:top w:w="70" w:type="dxa"/>
+              <w:left w:w="110" w:type="dxa"/>
+              <w:bottom w:w="70" w:type="dxa"/>
+              <w:right w:w="110" w:type="dxa"/>
+            </w:tcMar>
+          </w:tcPr>
+          <w:p>
+            <w:r>
+              <w:rPr>
+                <w:b/>
+              </w:rPr>
+              <w:t>Diagrams Updated</w:t>
+            </w:r>
+          </w:p>
+        </w:tc>
+        <w:tc>
+          <w:tcPr>
+            <w:tcW w:w="6860" w:type="dxa"/>
+            <w:tcBorders>
+              <w:top w:val="single" w:sz="4" w:space="0" w:color="BFBFBF"/>
+              <w:left w:val="single" w:sz="4" w:space="0" w:color="BFBFBF"/>
+              <w:bottom w:val="single" w:sz="4" w:space="0" w:color="BFBFBF"/>
+              <w:right w:val="single" w:sz="4" w:space="0" w:color="BFBFBF"/>
+            </w:tcBorders>
+            <w:tcMar>
+              <w:top w:w="70" w:type="dxa"/>
+              <w:left w:w="110" w:type="dxa"/>
+              <w:bottom w:w="70" w:type="dxa"/>
+              <w:right w:w="110" w:type="dxa"/>
+            </w:tcMar>
+          </w:tcPr>
+          <w:p>
+            <w:r>
+              <w:t>03-controller.png, 04-model-story-and-lore.png; SD02.</w:t>
+            </w:r>
+          </w:p>
+        </w:tc>
+      </w:tr>
+      <w:tr>
+        <w:trPr>
+          <w:cantSplit/>
+        </w:trPr>
+        <w:tc>
+          <w:tcPr>
+            <w:tcW w:w="2500" w:type="dxa"/>
+            <w:tcBorders>
+              <w:top w:val="single" w:sz="4" w:space="0" w:color="BFBFBF"/>
+              <w:left w:val="single" w:sz="4" w:space="0" w:color="BFBFBF"/>
+              <w:bottom w:val="single" w:sz="4" w:space="0" w:color="BFBFBF"/>
+              <w:right w:val="single" w:sz="4" w:space="0" w:color="BFBFBF"/>
+            </w:tcBorders>
+            <w:shd w:val="clear" w:color="auto" w:fill="F2F2F2"/>
+            <w:tcMar>
+              <w:top w:w="70" w:type="dxa"/>
+              <w:left w:w="110" w:type="dxa"/>
+              <w:bottom w:w="70" w:type="dxa"/>
+              <w:right w:w="110" w:type="dxa"/>
+            </w:tcMar>
+          </w:tcPr>
+          <w:p>
+            <w:r>
+              <w:rPr>
+                <w:b/>
+              </w:rPr>
+              <w:t>Commit(s)</w:t>
+            </w:r>
+          </w:p>
+        </w:tc>
+        <w:tc>
+          <w:tcPr>
+            <w:tcW w:w="6860" w:type="dxa"/>
+            <w:tcBorders>
+              <w:top w:val="single" w:sz="4" w:space="0" w:color="BFBFBF"/>
+              <w:left w:val="single" w:sz="4" w:space="0" w:color="BFBFBF"/>
+              <w:bottom w:val="single" w:sz="4" w:space="0" w:color="BFBFBF"/>
+              <w:right w:val="single" w:sz="4" w:space="0" w:color="BFBFBF"/>
+            </w:tcBorders>
+            <w:tcMar>
+              <w:top w:w="70" w:type="dxa"/>
+              <w:left w:w="110" w:type="dxa"/>
+              <w:bottom w:w="70" w:type="dxa"/>
+              <w:right w:w="110" w:type="dxa"/>
+            </w:tcMar>
+          </w:tcPr>
+          <w:p>
+            <w:r>
+              <w:t>feat(agent): plan hidden pivotal events before the story starts</w:t>
             </w:r>
           </w:p>
         </w:tc>

</xml_diff>

<commit_message>
feat(agent): draft a scenario from a short prompt
StoryAgent.generateScenario sends the user's idea with
prompts/scenario.txt and reads the five scenario fields from the JSON
reply; a refusal, a failed call or a draft without a premise or setting
is an LLMException. StoryController.generateScenario returns the draft
without changing anything, so the user can edit it before startStory.

The CLI start command now asks for an idea first: the draft is shown,
the user accepts or discards it, then edits each field with the draft
as the default. Pressing Enter skips straight to writing the scenario
by hand. The JSON reading shared with PlotPlanner moves to
StoryAgent.jsonObjectIn.

Refs: F01
Co-Authored-By: Claude Opus 5.5 <noreply@anthropic.com>
Claude-Session: https://claude.ai/code/session_01WQ5gKVQXkP6gSc2ew2jXdc
</commit_message>
<xml_diff>
--- a/Stage2_Report.docx
+++ b/Stage2_Report.docx
@@ -474,7 +474,7 @@
           <w:p>
             <w:r>
               <w:rPr/>
-              <w:t>In progress (manual scenario done)</w:t>
+              <w:t>Partial (CLI done; GUI form next)</w:t>
             </w:r>
           </w:p>
         </w:tc>
@@ -520,7 +520,7 @@
           <w:p>
             <w:r>
               <w:rPr/>
-              <w:t>Yes (start)</w:t>
+              <w:t>Yes</w:t>
             </w:r>
           </w:p>
         </w:tc>
@@ -21264,11 +21264,8 @@
           </w:tcPr>
           <w:p>
             <w:r>
-              <w:rPr>
-                <w:i/>
-                <w:color w:val="7F7F7F"/>
-              </w:rPr>
-              <w:t>[short hash, linked]</w:t>
+              <w:rPr/>
+              <w:t>2f31992 (https://github.com/Polarralop/EECS3311Project/commit/2f31992)</w:t>
             </w:r>
           </w:p>
         </w:tc>
@@ -21290,11 +21287,8 @@
           </w:tcPr>
           <w:p>
             <w:r>
-              <w:rPr>
-                <w:i/>
-                <w:color w:val="7F7F7F"/>
-              </w:rPr>
-              <w:t>[Conventional Commit description]</w:t>
+              <w:rPr/>
+              <w:t>feat(tools): register SearchLoreTool and GetCharacterTool in ToolRegistry</w:t>
             </w:r>
           </w:p>
         </w:tc>
@@ -21316,11 +21310,200 @@
           </w:tcPr>
           <w:p>
             <w:r>
-              <w:rPr>
-                <w:i/>
-                <w:color w:val="7F7F7F"/>
-              </w:rPr>
-              <w:t>[F04]</w:t>
+              <w:rPr/>
+              <w:t>F04 (tools)</w:t>
+            </w:r>
+          </w:p>
+        </w:tc>
+      </w:tr>
+      <w:tr>
+        <w:trPr>
+          <w:cantSplit/>
+        </w:trPr>
+        <w:tc>
+          <w:tcPr>
+            <w:tcW w:w="600" w:type="dxa"/>
+            <w:tcBorders>
+              <w:top w:val="single" w:sz="4" w:space="0" w:color="BFBFBF"/>
+              <w:left w:val="single" w:sz="4" w:space="0" w:color="BFBFBF"/>
+              <w:bottom w:val="single" w:sz="4" w:space="0" w:color="BFBFBF"/>
+              <w:right w:val="single" w:sz="4" w:space="0" w:color="BFBFBF"/>
+            </w:tcBorders>
+            <w:tcMar>
+              <w:top w:w="70" w:type="dxa"/>
+              <w:left w:w="110" w:type="dxa"/>
+              <w:bottom w:w="70" w:type="dxa"/>
+              <w:right w:w="110" w:type="dxa"/>
+            </w:tcMar>
+          </w:tcPr>
+          <w:p>
+            <w:r>
+              <w:t>2</w:t>
+            </w:r>
+          </w:p>
+        </w:tc>
+        <w:tc>
+          <w:tcPr>
+            <w:tcW w:w="2000" w:type="dxa"/>
+            <w:tcBorders>
+              <w:top w:val="single" w:sz="4" w:space="0" w:color="BFBFBF"/>
+              <w:left w:val="single" w:sz="4" w:space="0" w:color="BFBFBF"/>
+              <w:bottom w:val="single" w:sz="4" w:space="0" w:color="BFBFBF"/>
+              <w:right w:val="single" w:sz="4" w:space="0" w:color="BFBFBF"/>
+            </w:tcBorders>
+            <w:tcMar>
+              <w:top w:w="70" w:type="dxa"/>
+              <w:left w:w="110" w:type="dxa"/>
+              <w:bottom w:w="70" w:type="dxa"/>
+              <w:right w:w="110" w:type="dxa"/>
+            </w:tcMar>
+          </w:tcPr>
+          <w:p>
+            <w:r>
+              <w:rPr/>
+              <w:t>139c4c0 (https://github.com/Polarralop/EECS3311Project/commit/139c4c0)</w:t>
+            </w:r>
+          </w:p>
+        </w:tc>
+        <w:tc>
+          <w:tcPr>
+            <w:tcW w:w="5160" w:type="dxa"/>
+            <w:tcBorders>
+              <w:top w:val="single" w:sz="4" w:space="0" w:color="BFBFBF"/>
+              <w:left w:val="single" w:sz="4" w:space="0" w:color="BFBFBF"/>
+              <w:bottom w:val="single" w:sz="4" w:space="0" w:color="BFBFBF"/>
+              <w:right w:val="single" w:sz="4" w:space="0" w:color="BFBFBF"/>
+            </w:tcBorders>
+            <w:tcMar>
+              <w:top w:w="70" w:type="dxa"/>
+              <w:left w:w="110" w:type="dxa"/>
+              <w:bottom w:w="70" w:type="dxa"/>
+              <w:right w:w="110" w:type="dxa"/>
+            </w:tcMar>
+          </w:tcPr>
+          <w:p>
+            <w:r>
+              <w:rPr/>
+              <w:t>feat(agent): run the tool-use loop in StoryAgent.takeTurn</w:t>
+            </w:r>
+          </w:p>
+        </w:tc>
+        <w:tc>
+          <w:tcPr>
+            <w:tcW w:w="1600" w:type="dxa"/>
+            <w:tcBorders>
+              <w:top w:val="single" w:sz="4" w:space="0" w:color="BFBFBF"/>
+              <w:left w:val="single" w:sz="4" w:space="0" w:color="BFBFBF"/>
+              <w:bottom w:val="single" w:sz="4" w:space="0" w:color="BFBFBF"/>
+              <w:right w:val="single" w:sz="4" w:space="0" w:color="BFBFBF"/>
+            </w:tcBorders>
+            <w:tcMar>
+              <w:top w:w="70" w:type="dxa"/>
+              <w:left w:w="110" w:type="dxa"/>
+              <w:bottom w:w="70" w:type="dxa"/>
+              <w:right w:w="110" w:type="dxa"/>
+            </w:tcMar>
+          </w:tcPr>
+          <w:p>
+            <w:r>
+              <w:rPr/>
+              <w:t>F04, F06 (Facade, Strategy)</w:t>
+            </w:r>
+          </w:p>
+        </w:tc>
+      </w:tr>
+      <w:tr>
+        <w:trPr>
+          <w:cantSplit/>
+        </w:trPr>
+        <w:tc>
+          <w:tcPr>
+            <w:tcW w:w="600" w:type="dxa"/>
+            <w:tcBorders>
+              <w:top w:val="single" w:sz="4" w:space="0" w:color="BFBFBF"/>
+              <w:left w:val="single" w:sz="4" w:space="0" w:color="BFBFBF"/>
+              <w:bottom w:val="single" w:sz="4" w:space="0" w:color="BFBFBF"/>
+              <w:right w:val="single" w:sz="4" w:space="0" w:color="BFBFBF"/>
+            </w:tcBorders>
+            <w:tcMar>
+              <w:top w:w="70" w:type="dxa"/>
+              <w:left w:w="110" w:type="dxa"/>
+              <w:bottom w:w="70" w:type="dxa"/>
+              <w:right w:w="110" w:type="dxa"/>
+            </w:tcMar>
+          </w:tcPr>
+          <w:p>
+            <w:r>
+              <w:t>3</w:t>
+            </w:r>
+          </w:p>
+        </w:tc>
+        <w:tc>
+          <w:tcPr>
+            <w:tcW w:w="2000" w:type="dxa"/>
+            <w:tcBorders>
+              <w:top w:val="single" w:sz="4" w:space="0" w:color="BFBFBF"/>
+              <w:left w:val="single" w:sz="4" w:space="0" w:color="BFBFBF"/>
+              <w:bottom w:val="single" w:sz="4" w:space="0" w:color="BFBFBF"/>
+              <w:right w:val="single" w:sz="4" w:space="0" w:color="BFBFBF"/>
+            </w:tcBorders>
+            <w:tcMar>
+              <w:top w:w="70" w:type="dxa"/>
+              <w:left w:w="110" w:type="dxa"/>
+              <w:bottom w:w="70" w:type="dxa"/>
+              <w:right w:w="110" w:type="dxa"/>
+            </w:tcMar>
+          </w:tcPr>
+          <w:p>
+            <w:r>
+              <w:rPr/>
+              <w:t>569e476 (https://github.com/Polarralop/EECS3311Project/commit/569e476)</w:t>
+            </w:r>
+          </w:p>
+        </w:tc>
+        <w:tc>
+          <w:tcPr>
+            <w:tcW w:w="5160" w:type="dxa"/>
+            <w:tcBorders>
+              <w:top w:val="single" w:sz="4" w:space="0" w:color="BFBFBF"/>
+              <w:left w:val="single" w:sz="4" w:space="0" w:color="BFBFBF"/>
+              <w:bottom w:val="single" w:sz="4" w:space="0" w:color="BFBFBF"/>
+              <w:right w:val="single" w:sz="4" w:space="0" w:color="BFBFBF"/>
+            </w:tcBorders>
+            <w:tcMar>
+              <w:top w:w="70" w:type="dxa"/>
+              <w:left w:w="110" w:type="dxa"/>
+              <w:bottom w:w="70" w:type="dxa"/>
+              <w:right w:w="110" w:type="dxa"/>
+            </w:tcMar>
+          </w:tcPr>
+          <w:p>
+            <w:r>
+              <w:rPr/>
+              <w:t>feat(agent): plan hidden pivotal events before the story starts</w:t>
+            </w:r>
+          </w:p>
+        </w:tc>
+        <w:tc>
+          <w:tcPr>
+            <w:tcW w:w="1600" w:type="dxa"/>
+            <w:tcBorders>
+              <w:top w:val="single" w:sz="4" w:space="0" w:color="BFBFBF"/>
+              <w:left w:val="single" w:sz="4" w:space="0" w:color="BFBFBF"/>
+              <w:bottom w:val="single" w:sz="4" w:space="0" w:color="BFBFBF"/>
+              <w:right w:val="single" w:sz="4" w:space="0" w:color="BFBFBF"/>
+            </w:tcBorders>
+            <w:tcMar>
+              <w:top w:w="70" w:type="dxa"/>
+              <w:left w:w="110" w:type="dxa"/>
+              <w:bottom w:w="70" w:type="dxa"/>
+              <w:right w:w="110" w:type="dxa"/>
+            </w:tcMar>
+          </w:tcPr>
+          <w:p>
+            <w:r>
+              <w:rPr/>
+              <w:t>F01, F05</w:t>
             </w:r>
           </w:p>
         </w:tc>
@@ -21336,11 +21519,8 @@
         <w:spacing w:after="120"/>
       </w:pPr>
       <w:r>
-        <w:rPr>
-          <w:i/>
-          <w:color w:val="7F7F7F"/>
-        </w:rPr>
-        <w:t>[Count: N meaningful code commits.]</w:t>
+        <w:rPr/>
+        <w:t>Count so far (period 2): 3 meaningful code commits, all on Oct 27 (each later commit logs the ones before it).</w:t>
       </w:r>
     </w:p>
     <w:p>

</xml_diff>

<commit_message>
feat(controller): submit turns through SubmitTurnCommand and CommandHistory
StoryController.submitTurn picks the input-mode strategy by name and
runs the turn as a SubmitTurnCommand through CommandHistory. The
command copies the plot before the agent runs, adds the narrated turn,
and on undo removes it and restores the pivotal events. A failed turn
puts the plot back and adds nothing, so it cannot be undone.

undoTurn undoes the last command; retryTurn undoes the latest turn
(and any edits on it) and reruns the same input and mode. If the retry
fails the turn stays undone and the CLI prints the input back. The CLI
gains do, say, story, turns, undo and retry, and lists the lore each
turn used.

Refs: F04, F10
Co-Authored-By: Claude Opus 5.5 <noreply@anthropic.com>
Claude-Session: https://claude.ai/code/session_01WQ5gKVQXkP6gSc2ew2jXdc
</commit_message>
<xml_diff>
--- a/Stage2_Report.docx
+++ b/Stage2_Report.docx
@@ -888,7 +888,7 @@
           <w:p>
             <w:r>
               <w:rPr/>
-              <w:t>In progress (agent loop done)</w:t>
+              <w:t>Partial (CLI done; GUI story tab next)</w:t>
             </w:r>
           </w:p>
         </w:tc>
@@ -934,7 +934,7 @@
           <w:p>
             <w:r>
               <w:rPr/>
-              <w:t>-</w:t>
+              <w:t>Yes</w:t>
             </w:r>
           </w:p>
         </w:tc>
@@ -1763,11 +1763,8 @@
           </w:tcPr>
           <w:p>
             <w:r>
-              <w:rPr>
-                <w:i/>
-                <w:color w:val="7F7F7F"/>
-              </w:rPr>
-              <w:t>[Not started]</w:t>
+              <w:rPr/>
+              <w:t>In progress (undo, retry in CLI)</w:t>
             </w:r>
           </w:p>
         </w:tc>
@@ -1789,11 +1786,8 @@
           </w:tcPr>
           <w:p>
             <w:r>
-              <w:rPr>
-                <w:i/>
-                <w:color w:val="7F7F7F"/>
-              </w:rPr>
-              <w:t>[-]</w:t>
+              <w:rPr/>
+              <w:t>-</w:t>
             </w:r>
           </w:p>
         </w:tc>
@@ -1815,11 +1809,8 @@
           </w:tcPr>
           <w:p>
             <w:r>
-              <w:rPr>
-                <w:i/>
-                <w:color w:val="7F7F7F"/>
-              </w:rPr>
-              <w:t>[-]</w:t>
+              <w:rPr/>
+              <w:t>Partial</w:t>
             </w:r>
           </w:p>
         </w:tc>
@@ -15493,6 +15484,99 @@
           </w:p>
         </w:tc>
       </w:tr>
+      <w:tr>
+        <w:trPr>
+          <w:cantSplit/>
+        </w:trPr>
+        <w:tc>
+          <w:tcPr>
+            <w:tcW w:w="1900" w:type="dxa"/>
+            <w:tcBorders>
+              <w:top w:val="single" w:sz="4" w:space="0" w:color="BFBFBF"/>
+              <w:left w:val="single" w:sz="4" w:space="0" w:color="BFBFBF"/>
+              <w:bottom w:val="single" w:sz="4" w:space="0" w:color="BFBFBF"/>
+              <w:right w:val="single" w:sz="4" w:space="0" w:color="BFBFBF"/>
+            </w:tcBorders>
+            <w:tcMar>
+              <w:top w:w="70" w:type="dxa"/>
+              <w:left w:w="110" w:type="dxa"/>
+              <w:bottom w:w="70" w:type="dxa"/>
+              <w:right w:w="110" w:type="dxa"/>
+            </w:tcMar>
+          </w:tcPr>
+          <w:p>
+            <w:r>
+              <w:t>F04/F10</w:t>
+            </w:r>
+          </w:p>
+        </w:tc>
+        <w:tc>
+          <w:tcPr>
+            <w:tcW w:w="2500" w:type="dxa"/>
+            <w:tcBorders>
+              <w:top w:val="single" w:sz="4" w:space="0" w:color="BFBFBF"/>
+              <w:left w:val="single" w:sz="4" w:space="0" w:color="BFBFBF"/>
+              <w:bottom w:val="single" w:sz="4" w:space="0" w:color="BFBFBF"/>
+              <w:right w:val="single" w:sz="4" w:space="0" w:color="BFBFBF"/>
+            </w:tcBorders>
+            <w:tcMar>
+              <w:top w:w="70" w:type="dxa"/>
+              <w:left w:w="110" w:type="dxa"/>
+              <w:bottom w:w="70" w:type="dxa"/>
+              <w:right w:w="110" w:type="dxa"/>
+            </w:tcMar>
+          </w:tcPr>
+          <w:p>
+            <w:r>
+              <w:t>SubmitTurnCommand restores the plot on failure, has getMode/getResult; retry undoes edits first; CommandHistory.latest/peekLast</w:t>
+            </w:r>
+          </w:p>
+        </w:tc>
+        <w:tc>
+          <w:tcPr>
+            <w:tcW w:w="2480" w:type="dxa"/>
+            <w:tcBorders>
+              <w:top w:val="single" w:sz="4" w:space="0" w:color="BFBFBF"/>
+              <w:left w:val="single" w:sz="4" w:space="0" w:color="BFBFBF"/>
+              <w:bottom w:val="single" w:sz="4" w:space="0" w:color="BFBFBF"/>
+              <w:right w:val="single" w:sz="4" w:space="0" w:color="BFBFBF"/>
+            </w:tcBorders>
+            <w:tcMar>
+              <w:top w:w="70" w:type="dxa"/>
+              <w:left w:w="110" w:type="dxa"/>
+              <w:bottom w:w="70" w:type="dxa"/>
+              <w:right w:w="110" w:type="dxa"/>
+            </w:tcMar>
+          </w:tcPr>
+          <w:p>
+            <w:r>
+              <w:t>After an edit the last command is not the turn; retry reuses the strategy</w:t>
+            </w:r>
+          </w:p>
+        </w:tc>
+        <w:tc>
+          <w:tcPr>
+            <w:tcW w:w="2480" w:type="dxa"/>
+            <w:tcBorders>
+              <w:top w:val="single" w:sz="4" w:space="0" w:color="BFBFBF"/>
+              <w:left w:val="single" w:sz="4" w:space="0" w:color="BFBFBF"/>
+              <w:bottom w:val="single" w:sz="4" w:space="0" w:color="BFBFBF"/>
+              <w:right w:val="single" w:sz="4" w:space="0" w:color="BFBFBF"/>
+            </w:tcBorders>
+            <w:tcMar>
+              <w:top w:w="70" w:type="dxa"/>
+              <w:left w:w="110" w:type="dxa"/>
+              <w:bottom w:w="70" w:type="dxa"/>
+              <w:right w:w="110" w:type="dxa"/>
+            </w:tcMar>
+          </w:tcPr>
+          <w:p>
+            <w:r>
+              <w:t>UC04, UC06; controller; Command; SD08</w:t>
+            </w:r>
+          </w:p>
+        </w:tc>
+      </w:tr>
     </w:tbl>
     <w:p>
       <w:pPr>
@@ -19441,6 +19525,445 @@
           <w:p>
             <w:r>
               <w:t>feat(agent): plan hidden pivotal events before the story starts</w:t>
+            </w:r>
+          </w:p>
+        </w:tc>
+      </w:tr>
+    </w:tbl>
+    <w:p>
+      <w:pPr>
+        <w:spacing w:after="0"/>
+      </w:pPr>
+    </w:p>
+    <w:tbl>
+      <w:tblPr>
+        <w:tblLook w:firstColumn="1" w:firstRow="1" w:lastColumn="0" w:lastRow="0" w:noHBand="0" w:noVBand="1" w:val="04A0"/>
+        <w:tblW w:w="9360" w:type="dxa"/>
+      </w:tblPr>
+      <w:tblGrid>
+        <w:gridCol w:w="2500"/>
+        <w:gridCol w:w="6860"/>
+      </w:tblGrid>
+      <w:tr>
+        <w:trPr>
+          <w:cantSplit/>
+        </w:trPr>
+        <w:tc>
+          <w:tcPr>
+            <w:tcW w:w="2500" w:type="dxa"/>
+            <w:tcBorders>
+              <w:top w:val="single" w:sz="4" w:space="0" w:color="BFBFBF"/>
+              <w:left w:val="single" w:sz="4" w:space="0" w:color="BFBFBF"/>
+              <w:bottom w:val="single" w:sz="4" w:space="0" w:color="BFBFBF"/>
+              <w:right w:val="single" w:sz="4" w:space="0" w:color="BFBFBF"/>
+            </w:tcBorders>
+            <w:shd w:val="clear" w:color="auto" w:fill="F2F2F2"/>
+            <w:tcMar>
+              <w:top w:w="70" w:type="dxa"/>
+              <w:left w:w="110" w:type="dxa"/>
+              <w:bottom w:w="70" w:type="dxa"/>
+              <w:right w:w="110" w:type="dxa"/>
+            </w:tcMar>
+          </w:tcPr>
+          <w:p>
+            <w:r>
+              <w:rPr>
+                <w:b/>
+              </w:rPr>
+              <w:t>Original ID</w:t>
+            </w:r>
+          </w:p>
+        </w:tc>
+        <w:tc>
+          <w:tcPr>
+            <w:tcW w:w="6860" w:type="dxa"/>
+            <w:tcBorders>
+              <w:top w:val="single" w:sz="4" w:space="0" w:color="BFBFBF"/>
+              <w:left w:val="single" w:sz="4" w:space="0" w:color="BFBFBF"/>
+              <w:bottom w:val="single" w:sz="4" w:space="0" w:color="BFBFBF"/>
+              <w:right w:val="single" w:sz="4" w:space="0" w:color="BFBFBF"/>
+            </w:tcBorders>
+            <w:tcMar>
+              <w:top w:w="70" w:type="dxa"/>
+              <w:left w:w="110" w:type="dxa"/>
+              <w:bottom w:w="70" w:type="dxa"/>
+              <w:right w:w="110" w:type="dxa"/>
+            </w:tcMar>
+          </w:tcPr>
+          <w:p>
+            <w:r>
+              <w:t>F04/F10: Turn commands and retry details</w:t>
+            </w:r>
+          </w:p>
+        </w:tc>
+      </w:tr>
+      <w:tr>
+        <w:trPr>
+          <w:cantSplit/>
+        </w:trPr>
+        <w:tc>
+          <w:tcPr>
+            <w:tcW w:w="2500" w:type="dxa"/>
+            <w:tcBorders>
+              <w:top w:val="single" w:sz="4" w:space="0" w:color="BFBFBF"/>
+              <w:left w:val="single" w:sz="4" w:space="0" w:color="BFBFBF"/>
+              <w:bottom w:val="single" w:sz="4" w:space="0" w:color="BFBFBF"/>
+              <w:right w:val="single" w:sz="4" w:space="0" w:color="BFBFBF"/>
+            </w:tcBorders>
+            <w:shd w:val="clear" w:color="auto" w:fill="F2F2F2"/>
+            <w:tcMar>
+              <w:top w:w="70" w:type="dxa"/>
+              <w:left w:w="110" w:type="dxa"/>
+              <w:bottom w:w="70" w:type="dxa"/>
+              <w:right w:w="110" w:type="dxa"/>
+            </w:tcMar>
+          </w:tcPr>
+          <w:p>
+            <w:r>
+              <w:rPr>
+                <w:b/>
+              </w:rPr>
+              <w:t>Original (Stage 1)</w:t>
+            </w:r>
+          </w:p>
+        </w:tc>
+        <w:tc>
+          <w:tcPr>
+            <w:tcW w:w="6860" w:type="dxa"/>
+            <w:tcBorders>
+              <w:top w:val="single" w:sz="4" w:space="0" w:color="BFBFBF"/>
+              <w:left w:val="single" w:sz="4" w:space="0" w:color="BFBFBF"/>
+              <w:bottom w:val="single" w:sz="4" w:space="0" w:color="BFBFBF"/>
+              <w:right w:val="single" w:sz="4" w:space="0" w:color="BFBFBF"/>
+            </w:tcBorders>
+            <w:tcMar>
+              <w:top w:w="70" w:type="dxa"/>
+              <w:left w:w="110" w:type="dxa"/>
+              <w:bottom w:w="70" w:type="dxa"/>
+              <w:right w:w="110" w:type="dxa"/>
+            </w:tcMar>
+          </w:tcPr>
+          <w:p>
+            <w:r>
+              <w:t>SubmitTurnCommand(input, mode, plotBefore, result) with execute, undo, getInput; CommandHistory.run/undoLast/canUndo; StoryController.retryTurn() calls undoLast(), reads the input and runs a new command.</w:t>
+            </w:r>
+          </w:p>
+        </w:tc>
+      </w:tr>
+      <w:tr>
+        <w:trPr>
+          <w:cantSplit/>
+        </w:trPr>
+        <w:tc>
+          <w:tcPr>
+            <w:tcW w:w="2500" w:type="dxa"/>
+            <w:tcBorders>
+              <w:top w:val="single" w:sz="4" w:space="0" w:color="BFBFBF"/>
+              <w:left w:val="single" w:sz="4" w:space="0" w:color="BFBFBF"/>
+              <w:bottom w:val="single" w:sz="4" w:space="0" w:color="BFBFBF"/>
+              <w:right w:val="single" w:sz="4" w:space="0" w:color="BFBFBF"/>
+            </w:tcBorders>
+            <w:shd w:val="clear" w:color="auto" w:fill="F2F2F2"/>
+            <w:tcMar>
+              <w:top w:w="70" w:type="dxa"/>
+              <w:left w:w="110" w:type="dxa"/>
+              <w:bottom w:w="70" w:type="dxa"/>
+              <w:right w:w="110" w:type="dxa"/>
+            </w:tcMar>
+          </w:tcPr>
+          <w:p>
+            <w:r>
+              <w:rPr>
+                <w:b/>
+              </w:rPr>
+              <w:t>Implemented</w:t>
+            </w:r>
+          </w:p>
+        </w:tc>
+        <w:tc>
+          <w:tcPr>
+            <w:tcW w:w="6860" w:type="dxa"/>
+            <w:tcBorders>
+              <w:top w:val="single" w:sz="4" w:space="0" w:color="BFBFBF"/>
+              <w:left w:val="single" w:sz="4" w:space="0" w:color="BFBFBF"/>
+              <w:bottom w:val="single" w:sz="4" w:space="0" w:color="BFBFBF"/>
+              <w:right w:val="single" w:sz="4" w:space="0" w:color="BFBFBF"/>
+            </w:tcBorders>
+            <w:tcMar>
+              <w:top w:w="70" w:type="dxa"/>
+              <w:left w:w="110" w:type="dxa"/>
+              <w:bottom w:w="70" w:type="dxa"/>
+              <w:right w:w="110" w:type="dxa"/>
+            </w:tcMar>
+          </w:tcPr>
+          <w:p>
+            <w:r>
+              <w:t>SubmitTurnCommand(session, agent, input, mode) also has getMode() and getResult(), and puts the plot copy back if the agent fails. CommandHistory gains latest(type) and peekLast(). retryTurn() finds the latest SubmitTurnCommand, undoes any edits of that turn, undoes the turn and runs a new command with the same input and mode; observers are notified even when the retry fails. StoryController gains modeNames() and isStarted(); turns need a started story.</w:t>
+            </w:r>
+          </w:p>
+        </w:tc>
+      </w:tr>
+      <w:tr>
+        <w:trPr>
+          <w:cantSplit/>
+        </w:trPr>
+        <w:tc>
+          <w:tcPr>
+            <w:tcW w:w="2500" w:type="dxa"/>
+            <w:tcBorders>
+              <w:top w:val="single" w:sz="4" w:space="0" w:color="BFBFBF"/>
+              <w:left w:val="single" w:sz="4" w:space="0" w:color="BFBFBF"/>
+              <w:bottom w:val="single" w:sz="4" w:space="0" w:color="BFBFBF"/>
+              <w:right w:val="single" w:sz="4" w:space="0" w:color="BFBFBF"/>
+            </w:tcBorders>
+            <w:shd w:val="clear" w:color="auto" w:fill="F2F2F2"/>
+            <w:tcMar>
+              <w:top w:w="70" w:type="dxa"/>
+              <w:left w:w="110" w:type="dxa"/>
+              <w:bottom w:w="70" w:type="dxa"/>
+              <w:right w:w="110" w:type="dxa"/>
+            </w:tcMar>
+          </w:tcPr>
+          <w:p>
+            <w:r>
+              <w:rPr>
+                <w:b/>
+              </w:rPr>
+              <w:t>What Changed and Why</w:t>
+            </w:r>
+          </w:p>
+        </w:tc>
+        <w:tc>
+          <w:tcPr>
+            <w:tcW w:w="6860" w:type="dxa"/>
+            <w:tcBorders>
+              <w:top w:val="single" w:sz="4" w:space="0" w:color="BFBFBF"/>
+              <w:left w:val="single" w:sz="4" w:space="0" w:color="BFBFBF"/>
+              <w:bottom w:val="single" w:sz="4" w:space="0" w:color="BFBFBF"/>
+              <w:right w:val="single" w:sz="4" w:space="0" w:color="BFBFBF"/>
+            </w:tcBorders>
+            <w:tcMar>
+              <w:top w:w="70" w:type="dxa"/>
+              <w:left w:w="110" w:type="dxa"/>
+              <w:bottom w:w="70" w:type="dxa"/>
+              <w:right w:w="110" w:type="dxa"/>
+            </w:tcMar>
+          </w:tcPr>
+          <w:p>
+            <w:r>
+              <w:t>Stage 1 assumed the last command is always the turn, but after an edit the last command is the EditTurnCommand; regenerating the turn must discard the edit too. getMode() is how retry reuses the same strategy.</w:t>
+            </w:r>
+          </w:p>
+        </w:tc>
+      </w:tr>
+      <w:tr>
+        <w:trPr>
+          <w:cantSplit/>
+        </w:trPr>
+        <w:tc>
+          <w:tcPr>
+            <w:tcW w:w="2500" w:type="dxa"/>
+            <w:tcBorders>
+              <w:top w:val="single" w:sz="4" w:space="0" w:color="BFBFBF"/>
+              <w:left w:val="single" w:sz="4" w:space="0" w:color="BFBFBF"/>
+              <w:bottom w:val="single" w:sz="4" w:space="0" w:color="BFBFBF"/>
+              <w:right w:val="single" w:sz="4" w:space="0" w:color="BFBFBF"/>
+            </w:tcBorders>
+            <w:shd w:val="clear" w:color="auto" w:fill="F2F2F2"/>
+            <w:tcMar>
+              <w:top w:w="70" w:type="dxa"/>
+              <w:left w:w="110" w:type="dxa"/>
+              <w:bottom w:w="70" w:type="dxa"/>
+              <w:right w:w="110" w:type="dxa"/>
+            </w:tcMar>
+          </w:tcPr>
+          <w:p>
+            <w:r>
+              <w:rPr>
+                <w:b/>
+              </w:rPr>
+              <w:t>How the User Need Is Still Met</w:t>
+            </w:r>
+          </w:p>
+        </w:tc>
+        <w:tc>
+          <w:tcPr>
+            <w:tcW w:w="6860" w:type="dxa"/>
+            <w:tcBorders>
+              <w:top w:val="single" w:sz="4" w:space="0" w:color="BFBFBF"/>
+              <w:left w:val="single" w:sz="4" w:space="0" w:color="BFBFBF"/>
+              <w:bottom w:val="single" w:sz="4" w:space="0" w:color="BFBFBF"/>
+              <w:right w:val="single" w:sz="4" w:space="0" w:color="BFBFBF"/>
+            </w:tcBorders>
+            <w:tcMar>
+              <w:top w:w="70" w:type="dxa"/>
+              <w:left w:w="110" w:type="dxa"/>
+              <w:bottom w:w="70" w:type="dxa"/>
+              <w:right w:w="110" w:type="dxa"/>
+            </w:tcMar>
+          </w:tcPr>
+          <w:p>
+            <w:r>
+              <w:t>Undo removes the turn and restores the events; retry regenerates it from the same input; a failed retry leaves the turn undone and the input is shown again.</w:t>
+            </w:r>
+          </w:p>
+        </w:tc>
+      </w:tr>
+      <w:tr>
+        <w:trPr>
+          <w:cantSplit/>
+        </w:trPr>
+        <w:tc>
+          <w:tcPr>
+            <w:tcW w:w="2500" w:type="dxa"/>
+            <w:tcBorders>
+              <w:top w:val="single" w:sz="4" w:space="0" w:color="BFBFBF"/>
+              <w:left w:val="single" w:sz="4" w:space="0" w:color="BFBFBF"/>
+              <w:bottom w:val="single" w:sz="4" w:space="0" w:color="BFBFBF"/>
+              <w:right w:val="single" w:sz="4" w:space="0" w:color="BFBFBF"/>
+            </w:tcBorders>
+            <w:shd w:val="clear" w:color="auto" w:fill="F2F2F2"/>
+            <w:tcMar>
+              <w:top w:w="70" w:type="dxa"/>
+              <w:left w:w="110" w:type="dxa"/>
+              <w:bottom w:w="70" w:type="dxa"/>
+              <w:right w:w="110" w:type="dxa"/>
+            </w:tcMar>
+          </w:tcPr>
+          <w:p>
+            <w:r>
+              <w:rPr>
+                <w:b/>
+              </w:rPr>
+              <w:t>Affected Use Cases / Classes / Methods / Patterns</w:t>
+            </w:r>
+          </w:p>
+        </w:tc>
+        <w:tc>
+          <w:tcPr>
+            <w:tcW w:w="6860" w:type="dxa"/>
+            <w:tcBorders>
+              <w:top w:val="single" w:sz="4" w:space="0" w:color="BFBFBF"/>
+              <w:left w:val="single" w:sz="4" w:space="0" w:color="BFBFBF"/>
+              <w:bottom w:val="single" w:sz="4" w:space="0" w:color="BFBFBF"/>
+              <w:right w:val="single" w:sz="4" w:space="0" w:color="BFBFBF"/>
+            </w:tcBorders>
+            <w:tcMar>
+              <w:top w:w="70" w:type="dxa"/>
+              <w:left w:w="110" w:type="dxa"/>
+              <w:bottom w:w="70" w:type="dxa"/>
+              <w:right w:w="110" w:type="dxa"/>
+            </w:tcMar>
+          </w:tcPr>
+          <w:p>
+            <w:r>
+              <w:t>UC04, UC06; SubmitTurnCommand, CommandHistory, StoryController, StoryCLI; Command, Strategy.</w:t>
+            </w:r>
+          </w:p>
+        </w:tc>
+      </w:tr>
+      <w:tr>
+        <w:trPr>
+          <w:cantSplit/>
+        </w:trPr>
+        <w:tc>
+          <w:tcPr>
+            <w:tcW w:w="2500" w:type="dxa"/>
+            <w:tcBorders>
+              <w:top w:val="single" w:sz="4" w:space="0" w:color="BFBFBF"/>
+              <w:left w:val="single" w:sz="4" w:space="0" w:color="BFBFBF"/>
+              <w:bottom w:val="single" w:sz="4" w:space="0" w:color="BFBFBF"/>
+              <w:right w:val="single" w:sz="4" w:space="0" w:color="BFBFBF"/>
+            </w:tcBorders>
+            <w:shd w:val="clear" w:color="auto" w:fill="F2F2F2"/>
+            <w:tcMar>
+              <w:top w:w="70" w:type="dxa"/>
+              <w:left w:w="110" w:type="dxa"/>
+              <w:bottom w:w="70" w:type="dxa"/>
+              <w:right w:w="110" w:type="dxa"/>
+            </w:tcMar>
+          </w:tcPr>
+          <w:p>
+            <w:r>
+              <w:rPr>
+                <w:b/>
+              </w:rPr>
+              <w:t>Diagrams Updated</w:t>
+            </w:r>
+          </w:p>
+        </w:tc>
+        <w:tc>
+          <w:tcPr>
+            <w:tcW w:w="6860" w:type="dxa"/>
+            <w:tcBorders>
+              <w:top w:val="single" w:sz="4" w:space="0" w:color="BFBFBF"/>
+              <w:left w:val="single" w:sz="4" w:space="0" w:color="BFBFBF"/>
+              <w:bottom w:val="single" w:sz="4" w:space="0" w:color="BFBFBF"/>
+              <w:right w:val="single" w:sz="4" w:space="0" w:color="BFBFBF"/>
+            </w:tcBorders>
+            <w:tcMar>
+              <w:top w:w="70" w:type="dxa"/>
+              <w:left w:w="110" w:type="dxa"/>
+              <w:bottom w:w="70" w:type="dxa"/>
+              <w:right w:w="110" w:type="dxa"/>
+            </w:tcMar>
+          </w:tcPr>
+          <w:p>
+            <w:r>
+              <w:t>03-controller.png; SD08.</w:t>
+            </w:r>
+          </w:p>
+        </w:tc>
+      </w:tr>
+      <w:tr>
+        <w:trPr>
+          <w:cantSplit/>
+        </w:trPr>
+        <w:tc>
+          <w:tcPr>
+            <w:tcW w:w="2500" w:type="dxa"/>
+            <w:tcBorders>
+              <w:top w:val="single" w:sz="4" w:space="0" w:color="BFBFBF"/>
+              <w:left w:val="single" w:sz="4" w:space="0" w:color="BFBFBF"/>
+              <w:bottom w:val="single" w:sz="4" w:space="0" w:color="BFBFBF"/>
+              <w:right w:val="single" w:sz="4" w:space="0" w:color="BFBFBF"/>
+            </w:tcBorders>
+            <w:shd w:val="clear" w:color="auto" w:fill="F2F2F2"/>
+            <w:tcMar>
+              <w:top w:w="70" w:type="dxa"/>
+              <w:left w:w="110" w:type="dxa"/>
+              <w:bottom w:w="70" w:type="dxa"/>
+              <w:right w:w="110" w:type="dxa"/>
+            </w:tcMar>
+          </w:tcPr>
+          <w:p>
+            <w:r>
+              <w:rPr>
+                <w:b/>
+              </w:rPr>
+              <w:t>Commit(s)</w:t>
+            </w:r>
+          </w:p>
+        </w:tc>
+        <w:tc>
+          <w:tcPr>
+            <w:tcW w:w="6860" w:type="dxa"/>
+            <w:tcBorders>
+              <w:top w:val="single" w:sz="4" w:space="0" w:color="BFBFBF"/>
+              <w:left w:val="single" w:sz="4" w:space="0" w:color="BFBFBF"/>
+              <w:bottom w:val="single" w:sz="4" w:space="0" w:color="BFBFBF"/>
+              <w:right w:val="single" w:sz="4" w:space="0" w:color="BFBFBF"/>
+            </w:tcBorders>
+            <w:tcMar>
+              <w:top w:w="70" w:type="dxa"/>
+              <w:left w:w="110" w:type="dxa"/>
+              <w:bottom w:w="70" w:type="dxa"/>
+              <w:right w:w="110" w:type="dxa"/>
+            </w:tcMar>
+          </w:tcPr>
+          <w:p>
+            <w:r>
+              <w:t>feat(controller): submit turns through SubmitTurnCommand and CommandHistory</w:t>
             </w:r>
           </w:p>
         </w:tc>
@@ -21508,6 +22031,102 @@
           </w:p>
         </w:tc>
       </w:tr>
+      <w:tr>
+        <w:trPr>
+          <w:cantSplit/>
+        </w:trPr>
+        <w:tc>
+          <w:tcPr>
+            <w:tcW w:w="600" w:type="dxa"/>
+            <w:tcBorders>
+              <w:top w:val="single" w:sz="4" w:space="0" w:color="BFBFBF"/>
+              <w:left w:val="single" w:sz="4" w:space="0" w:color="BFBFBF"/>
+              <w:bottom w:val="single" w:sz="4" w:space="0" w:color="BFBFBF"/>
+              <w:right w:val="single" w:sz="4" w:space="0" w:color="BFBFBF"/>
+            </w:tcBorders>
+            <w:tcMar>
+              <w:top w:w="70" w:type="dxa"/>
+              <w:left w:w="110" w:type="dxa"/>
+              <w:bottom w:w="70" w:type="dxa"/>
+              <w:right w:w="110" w:type="dxa"/>
+            </w:tcMar>
+          </w:tcPr>
+          <w:p>
+            <w:r>
+              <w:t>4</w:t>
+            </w:r>
+          </w:p>
+        </w:tc>
+        <w:tc>
+          <w:tcPr>
+            <w:tcW w:w="2000" w:type="dxa"/>
+            <w:tcBorders>
+              <w:top w:val="single" w:sz="4" w:space="0" w:color="BFBFBF"/>
+              <w:left w:val="single" w:sz="4" w:space="0" w:color="BFBFBF"/>
+              <w:bottom w:val="single" w:sz="4" w:space="0" w:color="BFBFBF"/>
+              <w:right w:val="single" w:sz="4" w:space="0" w:color="BFBFBF"/>
+            </w:tcBorders>
+            <w:tcMar>
+              <w:top w:w="70" w:type="dxa"/>
+              <w:left w:w="110" w:type="dxa"/>
+              <w:bottom w:w="70" w:type="dxa"/>
+              <w:right w:w="110" w:type="dxa"/>
+            </w:tcMar>
+          </w:tcPr>
+          <w:p>
+            <w:r>
+              <w:rPr/>
+              <w:t>c5a57de (https://github.com/Polarralop/EECS3311Project/commit/c5a57de)</w:t>
+            </w:r>
+          </w:p>
+        </w:tc>
+        <w:tc>
+          <w:tcPr>
+            <w:tcW w:w="5160" w:type="dxa"/>
+            <w:tcBorders>
+              <w:top w:val="single" w:sz="4" w:space="0" w:color="BFBFBF"/>
+              <w:left w:val="single" w:sz="4" w:space="0" w:color="BFBFBF"/>
+              <w:bottom w:val="single" w:sz="4" w:space="0" w:color="BFBFBF"/>
+              <w:right w:val="single" w:sz="4" w:space="0" w:color="BFBFBF"/>
+            </w:tcBorders>
+            <w:tcMar>
+              <w:top w:w="70" w:type="dxa"/>
+              <w:left w:w="110" w:type="dxa"/>
+              <w:bottom w:w="70" w:type="dxa"/>
+              <w:right w:w="110" w:type="dxa"/>
+            </w:tcMar>
+          </w:tcPr>
+          <w:p>
+            <w:r>
+              <w:rPr/>
+              <w:t>feat(agent): draft a scenario from a short prompt</w:t>
+            </w:r>
+          </w:p>
+        </w:tc>
+        <w:tc>
+          <w:tcPr>
+            <w:tcW w:w="1600" w:type="dxa"/>
+            <w:tcBorders>
+              <w:top w:val="single" w:sz="4" w:space="0" w:color="BFBFBF"/>
+              <w:left w:val="single" w:sz="4" w:space="0" w:color="BFBFBF"/>
+              <w:bottom w:val="single" w:sz="4" w:space="0" w:color="BFBFBF"/>
+              <w:right w:val="single" w:sz="4" w:space="0" w:color="BFBFBF"/>
+            </w:tcBorders>
+            <w:tcMar>
+              <w:top w:w="70" w:type="dxa"/>
+              <w:left w:w="110" w:type="dxa"/>
+              <w:bottom w:w="70" w:type="dxa"/>
+              <w:right w:w="110" w:type="dxa"/>
+            </w:tcMar>
+          </w:tcPr>
+          <w:p>
+            <w:r>
+              <w:rPr/>
+              <w:t>F01</w:t>
+            </w:r>
+          </w:p>
+        </w:tc>
+      </w:tr>
     </w:tbl>
     <w:p>
       <w:pPr>
@@ -21520,7 +22139,7 @@
       </w:pPr>
       <w:r>
         <w:rPr/>
-        <w:t>Count so far (period 2): 3 meaningful code commits, all on Oct 27 (each later commit logs the ones before it).</w:t>
+        <w:t>Count so far (period 2): 4 meaningful code commits, all on Oct 27 (each later commit logs the ones before it).</w:t>
       </w:r>
     </w:p>
     <w:p>

</xml_diff>

<commit_message>
feat(controller): edit a past turn with EditTurnCommand
EditTurnCommand remembers the latest turn's narration and replaces it;
undo puts the original back without removing the turn.
StoryController.editTurn rejects empty text and runs the command
through CommandHistory, so edit, undo and retry combine: retrying an
edited turn drops the edit along with the turn. Editing works right
after a load because it needs nothing that was lost (logged as a
change from Stage 1).

The CLI edit command shows the current narration and reads the new
text over several lines until a line with only a dot.

Refs: F10
Co-Authored-By: Claude Opus 5.5 <noreply@anthropic.com>
Claude-Session: https://claude.ai/code/session_01WQ5gKVQXkP6gSc2ew2jXdc
</commit_message>
<xml_diff>
--- a/Stage2_Report.docx
+++ b/Stage2_Report.docx
@@ -1764,7 +1764,7 @@
           <w:p>
             <w:r>
               <w:rPr/>
-              <w:t>In progress (undo, retry in CLI)</w:t>
+              <w:t>Partial (CLI done; GUI buttons next)</w:t>
             </w:r>
           </w:p>
         </w:tc>
@@ -1810,7 +1810,7 @@
           <w:p>
             <w:r>
               <w:rPr/>
-              <w:t>Partial</w:t>
+              <w:t>Yes</w:t>
             </w:r>
           </w:p>
         </w:tc>
@@ -11263,11 +11263,8 @@
           </w:tcPr>
           <w:p>
             <w:r>
-              <w:rPr>
-                <w:i/>
-                <w:color w:val="7F7F7F"/>
-              </w:rPr>
-              <w:t>[The concrete design problem in this app that the pattern solves.]</w:t>
+              <w:rPr/>
+              <w:t>The most recent turn must be undoable, retryable and editable, and undoing a turn must also put the hidden pivotal events back as they were before it, even though the turn may have changed them through tool calls.</w:t>
             </w:r>
           </w:p>
         </w:tc>
@@ -11320,11 +11317,8 @@
           </w:tcPr>
           <w:p>
             <w:r>
-              <w:rPr>
-                <w:i/>
-                <w:color w:val="7F7F7F"/>
-              </w:rPr>
-              <w:t>[Stage 1: Command: StoryCommand. Concrete commands: SubmitTurnCommand, EditTurnCommand. Invoker: CommandHistory. Client: StoryController. Receivers: StorySession, StoryAgent. Replace with the implemented roles.]</w:t>
+              <w:rPr/>
+              <w:t>Command: StoryCommand (execute, undo). Concrete commands: SubmitTurnCommand (keeps input, mode, plotBefore and the resulting Turn), EditTurnCommand (keeps the turn and oldNarration). Invoker: CommandHistory (run, undoLast, canUndo, latest, peekLast, clear). Client: StoryController (submitTurn, undoTurn, retryTurn, editTurn). Receivers: StorySession, Turn, and StoryAgent (called by SubmitTurnCommand.execute).</w:t>
             </w:r>
           </w:p>
         </w:tc>
@@ -11377,11 +11371,8 @@
           </w:tcPr>
           <w:p>
             <w:r>
-              <w:rPr>
-                <w:i/>
-                <w:color w:val="7F7F7F"/>
-              </w:rPr>
-              <w:t>[File paths and the methods where the pattern is visible.]</w:t>
+              <w:rPr/>
+              <w:t>src/main/java/ca/yorku/storyteller/controller/StoryCommand.java: execute(), undo(). SubmitTurnCommand.java: execute() copies the plot and calls StoryAgent.takeTurn, undo() calls StorySession.removeLastTurn() and setPlot(plotBefore), getInput(), getMode(). EditTurnCommand.java: execute() swaps the narration, undo() restores it. CommandHistory.java: run(command), undoLast(), latest(type). StoryController.java: submitTurn, undoTurn, retryTurn, editTurn.</w:t>
             </w:r>
           </w:p>
         </w:tc>
@@ -11434,11 +11425,8 @@
           </w:tcPr>
           <w:p>
             <w:r>
-              <w:rPr>
-                <w:i/>
-                <w:color w:val="7F7F7F"/>
-              </w:rPr>
-              <w:t>[Why this pattern, and what the code would look like without it.]</w:t>
+              <w:rPr/>
+              <w:t>Each action knows exactly what it changed, so undo needs no knowledge of what kind of action came last, and retry is just "undo, then run a new command with the same input and mode". Without it, the controller would need its own records of every turn's plot and narration and separate undo code for each action. The history is not saved, so a load starts with nothing to undo.</w:t>
             </w:r>
           </w:p>
         </w:tc>
@@ -11491,11 +11479,8 @@
           </w:tcPr>
           <w:p>
             <w:r>
-              <w:rPr>
-                <w:i/>
-                <w:color w:val="7F7F7F"/>
-              </w:rPr>
-              <w:t>[Matches the Stage 1 design / changed (see Section 4).]</w:t>
+              <w:rPr/>
+              <w:t>Matches the Stage 1 roles. Additions: getMode()/getResult(), latest/peekLast on the history, retry undoes edits of the turn first, and edit works after a load (Section 4).</w:t>
             </w:r>
           </w:p>
         </w:tc>
@@ -15577,6 +15562,99 @@
           </w:p>
         </w:tc>
       </w:tr>
+      <w:tr>
+        <w:trPr>
+          <w:cantSplit/>
+        </w:trPr>
+        <w:tc>
+          <w:tcPr>
+            <w:tcW w:w="1900" w:type="dxa"/>
+            <w:tcBorders>
+              <w:top w:val="single" w:sz="4" w:space="0" w:color="BFBFBF"/>
+              <w:left w:val="single" w:sz="4" w:space="0" w:color="BFBFBF"/>
+              <w:bottom w:val="single" w:sz="4" w:space="0" w:color="BFBFBF"/>
+              <w:right w:val="single" w:sz="4" w:space="0" w:color="BFBFBF"/>
+            </w:tcBorders>
+            <w:tcMar>
+              <w:top w:w="70" w:type="dxa"/>
+              <w:left w:w="110" w:type="dxa"/>
+              <w:bottom w:w="70" w:type="dxa"/>
+              <w:right w:w="110" w:type="dxa"/>
+            </w:tcMar>
+          </w:tcPr>
+          <w:p>
+            <w:r>
+              <w:t>F10</w:t>
+            </w:r>
+          </w:p>
+        </w:tc>
+        <w:tc>
+          <w:tcPr>
+            <w:tcW w:w="2500" w:type="dxa"/>
+            <w:tcBorders>
+              <w:top w:val="single" w:sz="4" w:space="0" w:color="BFBFBF"/>
+              <w:left w:val="single" w:sz="4" w:space="0" w:color="BFBFBF"/>
+              <w:bottom w:val="single" w:sz="4" w:space="0" w:color="BFBFBF"/>
+              <w:right w:val="single" w:sz="4" w:space="0" w:color="BFBFBF"/>
+            </w:tcBorders>
+            <w:tcMar>
+              <w:top w:w="70" w:type="dxa"/>
+              <w:left w:w="110" w:type="dxa"/>
+              <w:bottom w:w="70" w:type="dxa"/>
+              <w:right w:w="110" w:type="dxa"/>
+            </w:tcMar>
+          </w:tcPr>
+          <w:p>
+            <w:r>
+              <w:t>Edit works whenever there is a turn, including after a load</w:t>
+            </w:r>
+          </w:p>
+        </w:tc>
+        <w:tc>
+          <w:tcPr>
+            <w:tcW w:w="2480" w:type="dxa"/>
+            <w:tcBorders>
+              <w:top w:val="single" w:sz="4" w:space="0" w:color="BFBFBF"/>
+              <w:left w:val="single" w:sz="4" w:space="0" w:color="BFBFBF"/>
+              <w:bottom w:val="single" w:sz="4" w:space="0" w:color="BFBFBF"/>
+              <w:right w:val="single" w:sz="4" w:space="0" w:color="BFBFBF"/>
+            </w:tcBorders>
+            <w:tcMar>
+              <w:top w:w="70" w:type="dxa"/>
+              <w:left w:w="110" w:type="dxa"/>
+              <w:bottom w:w="70" w:type="dxa"/>
+              <w:right w:w="110" w:type="dxa"/>
+            </w:tcMar>
+          </w:tcPr>
+          <w:p>
+            <w:r>
+              <w:t>Replacing text needs nothing lost at load time</w:t>
+            </w:r>
+          </w:p>
+        </w:tc>
+        <w:tc>
+          <w:tcPr>
+            <w:tcW w:w="2480" w:type="dxa"/>
+            <w:tcBorders>
+              <w:top w:val="single" w:sz="4" w:space="0" w:color="BFBFBF"/>
+              <w:left w:val="single" w:sz="4" w:space="0" w:color="BFBFBF"/>
+              <w:bottom w:val="single" w:sz="4" w:space="0" w:color="BFBFBF"/>
+              <w:right w:val="single" w:sz="4" w:space="0" w:color="BFBFBF"/>
+            </w:tcBorders>
+            <w:tcMar>
+              <w:top w:w="70" w:type="dxa"/>
+              <w:left w:w="110" w:type="dxa"/>
+              <w:bottom w:w="70" w:type="dxa"/>
+              <w:right w:w="110" w:type="dxa"/>
+            </w:tcMar>
+          </w:tcPr>
+          <w:p>
+            <w:r>
+              <w:t>UC06; EditTurnCommand, StoryController; Command</w:t>
+            </w:r>
+          </w:p>
+        </w:tc>
+      </w:tr>
     </w:tbl>
     <w:p>
       <w:pPr>
@@ -19964,6 +20042,445 @@
           <w:p>
             <w:r>
               <w:t>feat(controller): submit turns through SubmitTurnCommand and CommandHistory</w:t>
+            </w:r>
+          </w:p>
+        </w:tc>
+      </w:tr>
+    </w:tbl>
+    <w:p>
+      <w:pPr>
+        <w:spacing w:after="0"/>
+      </w:pPr>
+    </w:p>
+    <w:tbl>
+      <w:tblPr>
+        <w:tblLook w:firstColumn="1" w:firstRow="1" w:lastColumn="0" w:lastRow="0" w:noHBand="0" w:noVBand="1" w:val="04A0"/>
+        <w:tblW w:w="9360" w:type="dxa"/>
+      </w:tblPr>
+      <w:tblGrid>
+        <w:gridCol w:w="2500"/>
+        <w:gridCol w:w="6860"/>
+      </w:tblGrid>
+      <w:tr>
+        <w:trPr>
+          <w:cantSplit/>
+        </w:trPr>
+        <w:tc>
+          <w:tcPr>
+            <w:tcW w:w="2500" w:type="dxa"/>
+            <w:tcBorders>
+              <w:top w:val="single" w:sz="4" w:space="0" w:color="BFBFBF"/>
+              <w:left w:val="single" w:sz="4" w:space="0" w:color="BFBFBF"/>
+              <w:bottom w:val="single" w:sz="4" w:space="0" w:color="BFBFBF"/>
+              <w:right w:val="single" w:sz="4" w:space="0" w:color="BFBFBF"/>
+            </w:tcBorders>
+            <w:shd w:val="clear" w:color="auto" w:fill="F2F2F2"/>
+            <w:tcMar>
+              <w:top w:w="70" w:type="dxa"/>
+              <w:left w:w="110" w:type="dxa"/>
+              <w:bottom w:w="70" w:type="dxa"/>
+              <w:right w:w="110" w:type="dxa"/>
+            </w:tcMar>
+          </w:tcPr>
+          <w:p>
+            <w:r>
+              <w:rPr>
+                <w:b/>
+              </w:rPr>
+              <w:t>Original ID</w:t>
+            </w:r>
+          </w:p>
+        </w:tc>
+        <w:tc>
+          <w:tcPr>
+            <w:tcW w:w="6860" w:type="dxa"/>
+            <w:tcBorders>
+              <w:top w:val="single" w:sz="4" w:space="0" w:color="BFBFBF"/>
+              <w:left w:val="single" w:sz="4" w:space="0" w:color="BFBFBF"/>
+              <w:bottom w:val="single" w:sz="4" w:space="0" w:color="BFBFBF"/>
+              <w:right w:val="single" w:sz="4" w:space="0" w:color="BFBFBF"/>
+            </w:tcBorders>
+            <w:tcMar>
+              <w:top w:w="70" w:type="dxa"/>
+              <w:left w:w="110" w:type="dxa"/>
+              <w:bottom w:w="70" w:type="dxa"/>
+              <w:right w:w="110" w:type="dxa"/>
+            </w:tcMar>
+          </w:tcPr>
+          <w:p>
+            <w:r>
+              <w:t>F10: A loaded turn can be edited</w:t>
+            </w:r>
+          </w:p>
+        </w:tc>
+      </w:tr>
+      <w:tr>
+        <w:trPr>
+          <w:cantSplit/>
+        </w:trPr>
+        <w:tc>
+          <w:tcPr>
+            <w:tcW w:w="2500" w:type="dxa"/>
+            <w:tcBorders>
+              <w:top w:val="single" w:sz="4" w:space="0" w:color="BFBFBF"/>
+              <w:left w:val="single" w:sz="4" w:space="0" w:color="BFBFBF"/>
+              <w:bottom w:val="single" w:sz="4" w:space="0" w:color="BFBFBF"/>
+              <w:right w:val="single" w:sz="4" w:space="0" w:color="BFBFBF"/>
+            </w:tcBorders>
+            <w:shd w:val="clear" w:color="auto" w:fill="F2F2F2"/>
+            <w:tcMar>
+              <w:top w:w="70" w:type="dxa"/>
+              <w:left w:w="110" w:type="dxa"/>
+              <w:bottom w:w="70" w:type="dxa"/>
+              <w:right w:w="110" w:type="dxa"/>
+            </w:tcMar>
+          </w:tcPr>
+          <w:p>
+            <w:r>
+              <w:rPr>
+                <w:b/>
+              </w:rPr>
+              <w:t>Original (Stage 1)</w:t>
+            </w:r>
+          </w:p>
+        </w:tc>
+        <w:tc>
+          <w:tcPr>
+            <w:tcW w:w="6860" w:type="dxa"/>
+            <w:tcBorders>
+              <w:top w:val="single" w:sz="4" w:space="0" w:color="BFBFBF"/>
+              <w:left w:val="single" w:sz="4" w:space="0" w:color="BFBFBF"/>
+              <w:bottom w:val="single" w:sz="4" w:space="0" w:color="BFBFBF"/>
+              <w:right w:val="single" w:sz="4" w:space="0" w:color="BFBFBF"/>
+            </w:tcBorders>
+            <w:tcMar>
+              <w:top w:w="70" w:type="dxa"/>
+              <w:left w:w="110" w:type="dxa"/>
+              <w:bottom w:w="70" w:type="dxa"/>
+              <w:right w:w="110" w:type="dxa"/>
+            </w:tcMar>
+          </w:tcPr>
+          <w:p>
+            <w:r>
+              <w:t>The Undo, Retry and Edit buttons are available only while CommandHistory.canUndo() is true; EditTurnCommand(newNarration, oldNarration).</w:t>
+            </w:r>
+          </w:p>
+        </w:tc>
+      </w:tr>
+      <w:tr>
+        <w:trPr>
+          <w:cantSplit/>
+        </w:trPr>
+        <w:tc>
+          <w:tcPr>
+            <w:tcW w:w="2500" w:type="dxa"/>
+            <w:tcBorders>
+              <w:top w:val="single" w:sz="4" w:space="0" w:color="BFBFBF"/>
+              <w:left w:val="single" w:sz="4" w:space="0" w:color="BFBFBF"/>
+              <w:bottom w:val="single" w:sz="4" w:space="0" w:color="BFBFBF"/>
+              <w:right w:val="single" w:sz="4" w:space="0" w:color="BFBFBF"/>
+            </w:tcBorders>
+            <w:shd w:val="clear" w:color="auto" w:fill="F2F2F2"/>
+            <w:tcMar>
+              <w:top w:w="70" w:type="dxa"/>
+              <w:left w:w="110" w:type="dxa"/>
+              <w:bottom w:w="70" w:type="dxa"/>
+              <w:right w:w="110" w:type="dxa"/>
+            </w:tcMar>
+          </w:tcPr>
+          <w:p>
+            <w:r>
+              <w:rPr>
+                <w:b/>
+              </w:rPr>
+              <w:t>Implemented</w:t>
+            </w:r>
+          </w:p>
+        </w:tc>
+        <w:tc>
+          <w:tcPr>
+            <w:tcW w:w="6860" w:type="dxa"/>
+            <w:tcBorders>
+              <w:top w:val="single" w:sz="4" w:space="0" w:color="BFBFBF"/>
+              <w:left w:val="single" w:sz="4" w:space="0" w:color="BFBFBF"/>
+              <w:bottom w:val="single" w:sz="4" w:space="0" w:color="BFBFBF"/>
+              <w:right w:val="single" w:sz="4" w:space="0" w:color="BFBFBF"/>
+            </w:tcBorders>
+            <w:tcMar>
+              <w:top w:w="70" w:type="dxa"/>
+              <w:left w:w="110" w:type="dxa"/>
+              <w:bottom w:w="70" w:type="dxa"/>
+              <w:right w:w="110" w:type="dxa"/>
+            </w:tcMar>
+          </w:tcPr>
+          <w:p>
+            <w:r>
+              <w:t>StoryController.editTurn(newNarration) works whenever the story has a turn, including right after a load; the edit is then in the history and can be undone. Undo and retry still need a turn taken since the story was opened. EditTurnCommand(session, newNarration) keeps the edited Turn and its oldNarration.</w:t>
+            </w:r>
+          </w:p>
+        </w:tc>
+      </w:tr>
+      <w:tr>
+        <w:trPr>
+          <w:cantSplit/>
+        </w:trPr>
+        <w:tc>
+          <w:tcPr>
+            <w:tcW w:w="2500" w:type="dxa"/>
+            <w:tcBorders>
+              <w:top w:val="single" w:sz="4" w:space="0" w:color="BFBFBF"/>
+              <w:left w:val="single" w:sz="4" w:space="0" w:color="BFBFBF"/>
+              <w:bottom w:val="single" w:sz="4" w:space="0" w:color="BFBFBF"/>
+              <w:right w:val="single" w:sz="4" w:space="0" w:color="BFBFBF"/>
+            </w:tcBorders>
+            <w:shd w:val="clear" w:color="auto" w:fill="F2F2F2"/>
+            <w:tcMar>
+              <w:top w:w="70" w:type="dxa"/>
+              <w:left w:w="110" w:type="dxa"/>
+              <w:bottom w:w="70" w:type="dxa"/>
+              <w:right w:w="110" w:type="dxa"/>
+            </w:tcMar>
+          </w:tcPr>
+          <w:p>
+            <w:r>
+              <w:rPr>
+                <w:b/>
+              </w:rPr>
+              <w:t>What Changed and Why</w:t>
+            </w:r>
+          </w:p>
+        </w:tc>
+        <w:tc>
+          <w:tcPr>
+            <w:tcW w:w="6860" w:type="dxa"/>
+            <w:tcBorders>
+              <w:top w:val="single" w:sz="4" w:space="0" w:color="BFBFBF"/>
+              <w:left w:val="single" w:sz="4" w:space="0" w:color="BFBFBF"/>
+              <w:bottom w:val="single" w:sz="4" w:space="0" w:color="BFBFBF"/>
+              <w:right w:val="single" w:sz="4" w:space="0" w:color="BFBFBF"/>
+            </w:tcBorders>
+            <w:tcMar>
+              <w:top w:w="70" w:type="dxa"/>
+              <w:left w:w="110" w:type="dxa"/>
+              <w:bottom w:w="70" w:type="dxa"/>
+              <w:right w:w="110" w:type="dxa"/>
+            </w:tcMar>
+          </w:tcPr>
+          <w:p>
+            <w:r>
+              <w:t>Replacing text needs nothing that was lost at load time (no plot copy, no original input), so there is no reason to forbid it.</w:t>
+            </w:r>
+          </w:p>
+        </w:tc>
+      </w:tr>
+      <w:tr>
+        <w:trPr>
+          <w:cantSplit/>
+        </w:trPr>
+        <w:tc>
+          <w:tcPr>
+            <w:tcW w:w="2500" w:type="dxa"/>
+            <w:tcBorders>
+              <w:top w:val="single" w:sz="4" w:space="0" w:color="BFBFBF"/>
+              <w:left w:val="single" w:sz="4" w:space="0" w:color="BFBFBF"/>
+              <w:bottom w:val="single" w:sz="4" w:space="0" w:color="BFBFBF"/>
+              <w:right w:val="single" w:sz="4" w:space="0" w:color="BFBFBF"/>
+            </w:tcBorders>
+            <w:shd w:val="clear" w:color="auto" w:fill="F2F2F2"/>
+            <w:tcMar>
+              <w:top w:w="70" w:type="dxa"/>
+              <w:left w:w="110" w:type="dxa"/>
+              <w:bottom w:w="70" w:type="dxa"/>
+              <w:right w:w="110" w:type="dxa"/>
+            </w:tcMar>
+          </w:tcPr>
+          <w:p>
+            <w:r>
+              <w:rPr>
+                <w:b/>
+              </w:rPr>
+              <w:t>How the User Need Is Still Met</w:t>
+            </w:r>
+          </w:p>
+        </w:tc>
+        <w:tc>
+          <w:tcPr>
+            <w:tcW w:w="6860" w:type="dxa"/>
+            <w:tcBorders>
+              <w:top w:val="single" w:sz="4" w:space="0" w:color="BFBFBF"/>
+              <w:left w:val="single" w:sz="4" w:space="0" w:color="BFBFBF"/>
+              <w:bottom w:val="single" w:sz="4" w:space="0" w:color="BFBFBF"/>
+              <w:right w:val="single" w:sz="4" w:space="0" w:color="BFBFBF"/>
+            </w:tcBorders>
+            <w:tcMar>
+              <w:top w:w="70" w:type="dxa"/>
+              <w:left w:w="110" w:type="dxa"/>
+              <w:bottom w:w="70" w:type="dxa"/>
+              <w:right w:w="110" w:type="dxa"/>
+            </w:tcMar>
+          </w:tcPr>
+          <w:p>
+            <w:r>
+              <w:t>Edit, undo of the edit, and the empty-text and cancel cases behave as in UC06.</w:t>
+            </w:r>
+          </w:p>
+        </w:tc>
+      </w:tr>
+      <w:tr>
+        <w:trPr>
+          <w:cantSplit/>
+        </w:trPr>
+        <w:tc>
+          <w:tcPr>
+            <w:tcW w:w="2500" w:type="dxa"/>
+            <w:tcBorders>
+              <w:top w:val="single" w:sz="4" w:space="0" w:color="BFBFBF"/>
+              <w:left w:val="single" w:sz="4" w:space="0" w:color="BFBFBF"/>
+              <w:bottom w:val="single" w:sz="4" w:space="0" w:color="BFBFBF"/>
+              <w:right w:val="single" w:sz="4" w:space="0" w:color="BFBFBF"/>
+            </w:tcBorders>
+            <w:shd w:val="clear" w:color="auto" w:fill="F2F2F2"/>
+            <w:tcMar>
+              <w:top w:w="70" w:type="dxa"/>
+              <w:left w:w="110" w:type="dxa"/>
+              <w:bottom w:w="70" w:type="dxa"/>
+              <w:right w:w="110" w:type="dxa"/>
+            </w:tcMar>
+          </w:tcPr>
+          <w:p>
+            <w:r>
+              <w:rPr>
+                <w:b/>
+              </w:rPr>
+              <w:t>Affected Use Cases / Classes / Methods / Patterns</w:t>
+            </w:r>
+          </w:p>
+        </w:tc>
+        <w:tc>
+          <w:tcPr>
+            <w:tcW w:w="6860" w:type="dxa"/>
+            <w:tcBorders>
+              <w:top w:val="single" w:sz="4" w:space="0" w:color="BFBFBF"/>
+              <w:left w:val="single" w:sz="4" w:space="0" w:color="BFBFBF"/>
+              <w:bottom w:val="single" w:sz="4" w:space="0" w:color="BFBFBF"/>
+              <w:right w:val="single" w:sz="4" w:space="0" w:color="BFBFBF"/>
+            </w:tcBorders>
+            <w:tcMar>
+              <w:top w:w="70" w:type="dxa"/>
+              <w:left w:w="110" w:type="dxa"/>
+              <w:bottom w:w="70" w:type="dxa"/>
+              <w:right w:w="110" w:type="dxa"/>
+            </w:tcMar>
+          </w:tcPr>
+          <w:p>
+            <w:r>
+              <w:t>UC06; EditTurnCommand, StoryController, StoryCLI; Command.</w:t>
+            </w:r>
+          </w:p>
+        </w:tc>
+      </w:tr>
+      <w:tr>
+        <w:trPr>
+          <w:cantSplit/>
+        </w:trPr>
+        <w:tc>
+          <w:tcPr>
+            <w:tcW w:w="2500" w:type="dxa"/>
+            <w:tcBorders>
+              <w:top w:val="single" w:sz="4" w:space="0" w:color="BFBFBF"/>
+              <w:left w:val="single" w:sz="4" w:space="0" w:color="BFBFBF"/>
+              <w:bottom w:val="single" w:sz="4" w:space="0" w:color="BFBFBF"/>
+              <w:right w:val="single" w:sz="4" w:space="0" w:color="BFBFBF"/>
+            </w:tcBorders>
+            <w:shd w:val="clear" w:color="auto" w:fill="F2F2F2"/>
+            <w:tcMar>
+              <w:top w:w="70" w:type="dxa"/>
+              <w:left w:w="110" w:type="dxa"/>
+              <w:bottom w:w="70" w:type="dxa"/>
+              <w:right w:w="110" w:type="dxa"/>
+            </w:tcMar>
+          </w:tcPr>
+          <w:p>
+            <w:r>
+              <w:rPr>
+                <w:b/>
+              </w:rPr>
+              <w:t>Diagrams Updated</w:t>
+            </w:r>
+          </w:p>
+        </w:tc>
+        <w:tc>
+          <w:tcPr>
+            <w:tcW w:w="6860" w:type="dxa"/>
+            <w:tcBorders>
+              <w:top w:val="single" w:sz="4" w:space="0" w:color="BFBFBF"/>
+              <w:left w:val="single" w:sz="4" w:space="0" w:color="BFBFBF"/>
+              <w:bottom w:val="single" w:sz="4" w:space="0" w:color="BFBFBF"/>
+              <w:right w:val="single" w:sz="4" w:space="0" w:color="BFBFBF"/>
+            </w:tcBorders>
+            <w:tcMar>
+              <w:top w:w="70" w:type="dxa"/>
+              <w:left w:w="110" w:type="dxa"/>
+              <w:bottom w:w="70" w:type="dxa"/>
+              <w:right w:w="110" w:type="dxa"/>
+            </w:tcMar>
+          </w:tcPr>
+          <w:p>
+            <w:r>
+              <w:t>03-controller.png.</w:t>
+            </w:r>
+          </w:p>
+        </w:tc>
+      </w:tr>
+      <w:tr>
+        <w:trPr>
+          <w:cantSplit/>
+        </w:trPr>
+        <w:tc>
+          <w:tcPr>
+            <w:tcW w:w="2500" w:type="dxa"/>
+            <w:tcBorders>
+              <w:top w:val="single" w:sz="4" w:space="0" w:color="BFBFBF"/>
+              <w:left w:val="single" w:sz="4" w:space="0" w:color="BFBFBF"/>
+              <w:bottom w:val="single" w:sz="4" w:space="0" w:color="BFBFBF"/>
+              <w:right w:val="single" w:sz="4" w:space="0" w:color="BFBFBF"/>
+            </w:tcBorders>
+            <w:shd w:val="clear" w:color="auto" w:fill="F2F2F2"/>
+            <w:tcMar>
+              <w:top w:w="70" w:type="dxa"/>
+              <w:left w:w="110" w:type="dxa"/>
+              <w:bottom w:w="70" w:type="dxa"/>
+              <w:right w:w="110" w:type="dxa"/>
+            </w:tcMar>
+          </w:tcPr>
+          <w:p>
+            <w:r>
+              <w:rPr>
+                <w:b/>
+              </w:rPr>
+              <w:t>Commit(s)</w:t>
+            </w:r>
+          </w:p>
+        </w:tc>
+        <w:tc>
+          <w:tcPr>
+            <w:tcW w:w="6860" w:type="dxa"/>
+            <w:tcBorders>
+              <w:top w:val="single" w:sz="4" w:space="0" w:color="BFBFBF"/>
+              <w:left w:val="single" w:sz="4" w:space="0" w:color="BFBFBF"/>
+              <w:bottom w:val="single" w:sz="4" w:space="0" w:color="BFBFBF"/>
+              <w:right w:val="single" w:sz="4" w:space="0" w:color="BFBFBF"/>
+            </w:tcBorders>
+            <w:tcMar>
+              <w:top w:w="70" w:type="dxa"/>
+              <w:left w:w="110" w:type="dxa"/>
+              <w:bottom w:w="70" w:type="dxa"/>
+              <w:right w:w="110" w:type="dxa"/>
+            </w:tcMar>
+          </w:tcPr>
+          <w:p>
+            <w:r>
+              <w:t>feat(controller): edit a past turn with EditTurnCommand</w:t>
             </w:r>
           </w:p>
         </w:tc>
@@ -22127,6 +22644,102 @@
           </w:p>
         </w:tc>
       </w:tr>
+      <w:tr>
+        <w:trPr>
+          <w:cantSplit/>
+        </w:trPr>
+        <w:tc>
+          <w:tcPr>
+            <w:tcW w:w="600" w:type="dxa"/>
+            <w:tcBorders>
+              <w:top w:val="single" w:sz="4" w:space="0" w:color="BFBFBF"/>
+              <w:left w:val="single" w:sz="4" w:space="0" w:color="BFBFBF"/>
+              <w:bottom w:val="single" w:sz="4" w:space="0" w:color="BFBFBF"/>
+              <w:right w:val="single" w:sz="4" w:space="0" w:color="BFBFBF"/>
+            </w:tcBorders>
+            <w:tcMar>
+              <w:top w:w="70" w:type="dxa"/>
+              <w:left w:w="110" w:type="dxa"/>
+              <w:bottom w:w="70" w:type="dxa"/>
+              <w:right w:w="110" w:type="dxa"/>
+            </w:tcMar>
+          </w:tcPr>
+          <w:p>
+            <w:r>
+              <w:t>5</w:t>
+            </w:r>
+          </w:p>
+        </w:tc>
+        <w:tc>
+          <w:tcPr>
+            <w:tcW w:w="2000" w:type="dxa"/>
+            <w:tcBorders>
+              <w:top w:val="single" w:sz="4" w:space="0" w:color="BFBFBF"/>
+              <w:left w:val="single" w:sz="4" w:space="0" w:color="BFBFBF"/>
+              <w:bottom w:val="single" w:sz="4" w:space="0" w:color="BFBFBF"/>
+              <w:right w:val="single" w:sz="4" w:space="0" w:color="BFBFBF"/>
+            </w:tcBorders>
+            <w:tcMar>
+              <w:top w:w="70" w:type="dxa"/>
+              <w:left w:w="110" w:type="dxa"/>
+              <w:bottom w:w="70" w:type="dxa"/>
+              <w:right w:w="110" w:type="dxa"/>
+            </w:tcMar>
+          </w:tcPr>
+          <w:p>
+            <w:r>
+              <w:rPr/>
+              <w:t>912b3d0 (https://github.com/Polarralop/EECS3311Project/commit/912b3d0)</w:t>
+            </w:r>
+          </w:p>
+        </w:tc>
+        <w:tc>
+          <w:tcPr>
+            <w:tcW w:w="5160" w:type="dxa"/>
+            <w:tcBorders>
+              <w:top w:val="single" w:sz="4" w:space="0" w:color="BFBFBF"/>
+              <w:left w:val="single" w:sz="4" w:space="0" w:color="BFBFBF"/>
+              <w:bottom w:val="single" w:sz="4" w:space="0" w:color="BFBFBF"/>
+              <w:right w:val="single" w:sz="4" w:space="0" w:color="BFBFBF"/>
+            </w:tcBorders>
+            <w:tcMar>
+              <w:top w:w="70" w:type="dxa"/>
+              <w:left w:w="110" w:type="dxa"/>
+              <w:bottom w:w="70" w:type="dxa"/>
+              <w:right w:w="110" w:type="dxa"/>
+            </w:tcMar>
+          </w:tcPr>
+          <w:p>
+            <w:r>
+              <w:rPr/>
+              <w:t>feat(controller): submit turns through SubmitTurnCommand and CommandHistory</w:t>
+            </w:r>
+          </w:p>
+        </w:tc>
+        <w:tc>
+          <w:tcPr>
+            <w:tcW w:w="1600" w:type="dxa"/>
+            <w:tcBorders>
+              <w:top w:val="single" w:sz="4" w:space="0" w:color="BFBFBF"/>
+              <w:left w:val="single" w:sz="4" w:space="0" w:color="BFBFBF"/>
+              <w:bottom w:val="single" w:sz="4" w:space="0" w:color="BFBFBF"/>
+              <w:right w:val="single" w:sz="4" w:space="0" w:color="BFBFBF"/>
+            </w:tcBorders>
+            <w:tcMar>
+              <w:top w:w="70" w:type="dxa"/>
+              <w:left w:w="110" w:type="dxa"/>
+              <w:bottom w:w="70" w:type="dxa"/>
+              <w:right w:w="110" w:type="dxa"/>
+            </w:tcMar>
+          </w:tcPr>
+          <w:p>
+            <w:r>
+              <w:rPr/>
+              <w:t>F04, F10 (Command)</w:t>
+            </w:r>
+          </w:p>
+        </w:tc>
+      </w:tr>
     </w:tbl>
     <w:p>
       <w:pPr>
@@ -22139,7 +22752,7 @@
       </w:pPr>
       <w:r>
         <w:rPr/>
-        <w:t>Count so far (period 2): 4 meaningful code commits, all on Oct 27 (each later commit logs the ones before it).</w:t>
+        <w:t>Count so far (period 2): 5 meaningful code commits, all on Oct 27 (each later commit logs the ones before it).</w:t>
       </w:r>
     </w:p>
     <w:p>

</xml_diff>

<commit_message>
feat(tools): raise lore proposals and resolve them in StoryController
ProposeLoreTool lets the model queue a new lore entry during a turn as
a pending LoreProposal. It needs a title and content and refuses a
title the lore book or another pending proposal already has; it never
touches the lore book. StoryController.resolveProposal applies the
user's decision: approval adds the entry through
StorySession.approveProposal (a title taken meanwhile keeps it
pending), rejection marks it rejected. Proposals from an undone or
failed turn stay pending, and a failed turn still notifies the views
when it raised one.

The tool is registered in StoryAgent.create and the system prompt says
when to use it. The CLI gains proposals, approve and reject, and its
status line counts the proposals waiting.

Refs: F07
Co-Authored-By: Claude Opus 5.5 <noreply@anthropic.com>
Claude-Session: https://claude.ai/code/session_01WQ5gKVQXkP6gSc2ew2jXdc
</commit_message>
<xml_diff>
--- a/Stage2_Report.docx
+++ b/Stage2_Report.docx
@@ -1316,11 +1316,8 @@
           </w:tcPr>
           <w:p>
             <w:r>
-              <w:rPr>
-                <w:i/>
-                <w:color w:val="7F7F7F"/>
-              </w:rPr>
-              <w:t>[Not started]</w:t>
+              <w:rPr/>
+              <w:t>Partial (CLI done; GUI list next)</w:t>
             </w:r>
           </w:p>
         </w:tc>
@@ -1342,11 +1339,8 @@
           </w:tcPr>
           <w:p>
             <w:r>
-              <w:rPr>
-                <w:i/>
-                <w:color w:val="7F7F7F"/>
-              </w:rPr>
-              <w:t>[-]</w:t>
+              <w:rPr/>
+              <w:t>-</w:t>
             </w:r>
           </w:p>
         </w:tc>
@@ -1368,11 +1362,8 @@
           </w:tcPr>
           <w:p>
             <w:r>
-              <w:rPr>
-                <w:i/>
-                <w:color w:val="7F7F7F"/>
-              </w:rPr>
-              <w:t>[-]</w:t>
+              <w:rPr/>
+              <w:t>Yes</w:t>
             </w:r>
           </w:p>
         </w:tc>
@@ -15655,6 +15646,99 @@
           </w:p>
         </w:tc>
       </w:tr>
+      <w:tr>
+        <w:trPr>
+          <w:cantSplit/>
+        </w:trPr>
+        <w:tc>
+          <w:tcPr>
+            <w:tcW w:w="1900" w:type="dxa"/>
+            <w:tcBorders>
+              <w:top w:val="single" w:sz="4" w:space="0" w:color="BFBFBF"/>
+              <w:left w:val="single" w:sz="4" w:space="0" w:color="BFBFBF"/>
+              <w:bottom w:val="single" w:sz="4" w:space="0" w:color="BFBFBF"/>
+              <w:right w:val="single" w:sz="4" w:space="0" w:color="BFBFBF"/>
+            </w:tcBorders>
+            <w:tcMar>
+              <w:top w:w="70" w:type="dxa"/>
+              <w:left w:w="110" w:type="dxa"/>
+              <w:bottom w:w="70" w:type="dxa"/>
+              <w:right w:w="110" w:type="dxa"/>
+            </w:tcMar>
+          </w:tcPr>
+          <w:p>
+            <w:r>
+              <w:t>F07</w:t>
+            </w:r>
+          </w:p>
+        </w:tc>
+        <w:tc>
+          <w:tcPr>
+            <w:tcW w:w="2500" w:type="dxa"/>
+            <w:tcBorders>
+              <w:top w:val="single" w:sz="4" w:space="0" w:color="BFBFBF"/>
+              <w:left w:val="single" w:sz="4" w:space="0" w:color="BFBFBF"/>
+              <w:bottom w:val="single" w:sz="4" w:space="0" w:color="BFBFBF"/>
+              <w:right w:val="single" w:sz="4" w:space="0" w:color="BFBFBF"/>
+            </w:tcBorders>
+            <w:tcMar>
+              <w:top w:w="70" w:type="dxa"/>
+              <w:left w:w="110" w:type="dxa"/>
+              <w:bottom w:w="70" w:type="dxa"/>
+              <w:right w:w="110" w:type="dxa"/>
+            </w:tcMar>
+          </w:tcPr>
+          <w:p>
+            <w:r>
+              <w:t>ProposeLoreTool refuses titles already in the lore book or pending; listPendingProposals; lists redrawn on notify</w:t>
+            </w:r>
+          </w:p>
+        </w:tc>
+        <w:tc>
+          <w:tcPr>
+            <w:tcW w:w="2480" w:type="dxa"/>
+            <w:tcBorders>
+              <w:top w:val="single" w:sz="4" w:space="0" w:color="BFBFBF"/>
+              <w:left w:val="single" w:sz="4" w:space="0" w:color="BFBFBF"/>
+              <w:bottom w:val="single" w:sz="4" w:space="0" w:color="BFBFBF"/>
+              <w:right w:val="single" w:sz="4" w:space="0" w:color="BFBFBF"/>
+            </w:tcBorders>
+            <w:tcMar>
+              <w:top w:w="70" w:type="dxa"/>
+              <w:left w:w="110" w:type="dxa"/>
+              <w:bottom w:w="70" w:type="dxa"/>
+              <w:right w:w="110" w:type="dxa"/>
+            </w:tcMar>
+          </w:tcPr>
+          <w:p>
+            <w:r>
+              <w:t>Avoids re-proposing known facts; same refresh path as every other list</w:t>
+            </w:r>
+          </w:p>
+        </w:tc>
+        <w:tc>
+          <w:tcPr>
+            <w:tcW w:w="2480" w:type="dxa"/>
+            <w:tcBorders>
+              <w:top w:val="single" w:sz="4" w:space="0" w:color="BFBFBF"/>
+              <w:left w:val="single" w:sz="4" w:space="0" w:color="BFBFBF"/>
+              <w:bottom w:val="single" w:sz="4" w:space="0" w:color="BFBFBF"/>
+              <w:right w:val="single" w:sz="4" w:space="0" w:color="BFBFBF"/>
+            </w:tcBorders>
+            <w:tcMar>
+              <w:top w:w="70" w:type="dxa"/>
+              <w:left w:w="110" w:type="dxa"/>
+              <w:bottom w:w="70" w:type="dxa"/>
+              <w:right w:w="110" w:type="dxa"/>
+            </w:tcMar>
+          </w:tcPr>
+          <w:p>
+            <w:r>
+              <w:t>UC05; ProposeLoreTool, StoryController; SD07</w:t>
+            </w:r>
+          </w:p>
+        </w:tc>
+      </w:tr>
     </w:tbl>
     <w:p>
       <w:pPr>
@@ -19776,7 +19860,7 @@
           </w:tcPr>
           <w:p>
             <w:r>
-              <w:t>SubmitTurnCommand(session, agent, input, mode) also has getMode() and getResult(), and puts the plot copy back if the agent fails. CommandHistory gains latest(type) and peekLast(). retryTurn() finds the latest SubmitTurnCommand, undoes any edits of that turn, undoes the turn and runs a new command with the same input and mode; observers are notified even when the retry fails. StoryController gains modeNames() and isStarted(); turns need a started story.</w:t>
+              <w:t>SubmitTurnCommand(session, agent, input, mode) also has getMode() and getResult(), and puts the plot copy back if the agent fails (lore proposals it raised stay pending, as for an undone turn). CommandHistory gains latest(type) and peekLast(). retryTurn() finds the latest SubmitTurnCommand, undoes any edits of that turn, undoes the turn and runs a new command with the same input and mode; observers are notified even when the retry fails. StoryController gains modeNames() and isStarted(); turns need a started story.</w:t>
             </w:r>
           </w:p>
         </w:tc>
@@ -20481,6 +20565,445 @@
           <w:p>
             <w:r>
               <w:t>feat(controller): edit a past turn with EditTurnCommand</w:t>
+            </w:r>
+          </w:p>
+        </w:tc>
+      </w:tr>
+    </w:tbl>
+    <w:p>
+      <w:pPr>
+        <w:spacing w:after="0"/>
+      </w:pPr>
+    </w:p>
+    <w:tbl>
+      <w:tblPr>
+        <w:tblLook w:firstColumn="1" w:firstRow="1" w:lastColumn="0" w:lastRow="0" w:noHBand="0" w:noVBand="1" w:val="04A0"/>
+        <w:tblW w:w="9360" w:type="dxa"/>
+      </w:tblPr>
+      <w:tblGrid>
+        <w:gridCol w:w="2500"/>
+        <w:gridCol w:w="6860"/>
+      </w:tblGrid>
+      <w:tr>
+        <w:trPr>
+          <w:cantSplit/>
+        </w:trPr>
+        <w:tc>
+          <w:tcPr>
+            <w:tcW w:w="2500" w:type="dxa"/>
+            <w:tcBorders>
+              <w:top w:val="single" w:sz="4" w:space="0" w:color="BFBFBF"/>
+              <w:left w:val="single" w:sz="4" w:space="0" w:color="BFBFBF"/>
+              <w:bottom w:val="single" w:sz="4" w:space="0" w:color="BFBFBF"/>
+              <w:right w:val="single" w:sz="4" w:space="0" w:color="BFBFBF"/>
+            </w:tcBorders>
+            <w:shd w:val="clear" w:color="auto" w:fill="F2F2F2"/>
+            <w:tcMar>
+              <w:top w:w="70" w:type="dxa"/>
+              <w:left w:w="110" w:type="dxa"/>
+              <w:bottom w:w="70" w:type="dxa"/>
+              <w:right w:w="110" w:type="dxa"/>
+            </w:tcMar>
+          </w:tcPr>
+          <w:p>
+            <w:r>
+              <w:rPr>
+                <w:b/>
+              </w:rPr>
+              <w:t>Original ID</w:t>
+            </w:r>
+          </w:p>
+        </w:tc>
+        <w:tc>
+          <w:tcPr>
+            <w:tcW w:w="6860" w:type="dxa"/>
+            <w:tcBorders>
+              <w:top w:val="single" w:sz="4" w:space="0" w:color="BFBFBF"/>
+              <w:left w:val="single" w:sz="4" w:space="0" w:color="BFBFBF"/>
+              <w:bottom w:val="single" w:sz="4" w:space="0" w:color="BFBFBF"/>
+              <w:right w:val="single" w:sz="4" w:space="0" w:color="BFBFBF"/>
+            </w:tcBorders>
+            <w:tcMar>
+              <w:top w:w="70" w:type="dxa"/>
+              <w:left w:w="110" w:type="dxa"/>
+              <w:bottom w:w="70" w:type="dxa"/>
+              <w:right w:w="110" w:type="dxa"/>
+            </w:tcMar>
+          </w:tcPr>
+          <w:p>
+            <w:r>
+              <w:t>F07: Proposal checks and the pending list</w:t>
+            </w:r>
+          </w:p>
+        </w:tc>
+      </w:tr>
+      <w:tr>
+        <w:trPr>
+          <w:cantSplit/>
+        </w:trPr>
+        <w:tc>
+          <w:tcPr>
+            <w:tcW w:w="2500" w:type="dxa"/>
+            <w:tcBorders>
+              <w:top w:val="single" w:sz="4" w:space="0" w:color="BFBFBF"/>
+              <w:left w:val="single" w:sz="4" w:space="0" w:color="BFBFBF"/>
+              <w:bottom w:val="single" w:sz="4" w:space="0" w:color="BFBFBF"/>
+              <w:right w:val="single" w:sz="4" w:space="0" w:color="BFBFBF"/>
+            </w:tcBorders>
+            <w:shd w:val="clear" w:color="auto" w:fill="F2F2F2"/>
+            <w:tcMar>
+              <w:top w:w="70" w:type="dxa"/>
+              <w:left w:w="110" w:type="dxa"/>
+              <w:bottom w:w="70" w:type="dxa"/>
+              <w:right w:w="110" w:type="dxa"/>
+            </w:tcMar>
+          </w:tcPr>
+          <w:p>
+            <w:r>
+              <w:rPr>
+                <w:b/>
+              </w:rPr>
+              <w:t>Original (Stage 1)</w:t>
+            </w:r>
+          </w:p>
+        </w:tc>
+        <w:tc>
+          <w:tcPr>
+            <w:tcW w:w="6860" w:type="dxa"/>
+            <w:tcBorders>
+              <w:top w:val="single" w:sz="4" w:space="0" w:color="BFBFBF"/>
+              <w:left w:val="single" w:sz="4" w:space="0" w:color="BFBFBF"/>
+              <w:bottom w:val="single" w:sz="4" w:space="0" w:color="BFBFBF"/>
+              <w:right w:val="single" w:sz="4" w:space="0" w:color="BFBFBF"/>
+            </w:tcBorders>
+            <w:tcMar>
+              <w:top w:w="70" w:type="dxa"/>
+              <w:left w:w="110" w:type="dxa"/>
+              <w:bottom w:w="70" w:type="dxa"/>
+              <w:right w:w="110" w:type="dxa"/>
+            </w:tcMar>
+          </w:tcPr>
+          <w:p>
+            <w:r>
+              <w:t>ProposeLoreTool.execute(args, session) checks that the title and content are present and calls StorySession.addProposal; StoryController.resolveProposal(id, approved); the front end calls showProposal(proposal).</w:t>
+            </w:r>
+          </w:p>
+        </w:tc>
+      </w:tr>
+      <w:tr>
+        <w:trPr>
+          <w:cantSplit/>
+        </w:trPr>
+        <w:tc>
+          <w:tcPr>
+            <w:tcW w:w="2500" w:type="dxa"/>
+            <w:tcBorders>
+              <w:top w:val="single" w:sz="4" w:space="0" w:color="BFBFBF"/>
+              <w:left w:val="single" w:sz="4" w:space="0" w:color="BFBFBF"/>
+              <w:bottom w:val="single" w:sz="4" w:space="0" w:color="BFBFBF"/>
+              <w:right w:val="single" w:sz="4" w:space="0" w:color="BFBFBF"/>
+            </w:tcBorders>
+            <w:shd w:val="clear" w:color="auto" w:fill="F2F2F2"/>
+            <w:tcMar>
+              <w:top w:w="70" w:type="dxa"/>
+              <w:left w:w="110" w:type="dxa"/>
+              <w:bottom w:w="70" w:type="dxa"/>
+              <w:right w:w="110" w:type="dxa"/>
+            </w:tcMar>
+          </w:tcPr>
+          <w:p>
+            <w:r>
+              <w:rPr>
+                <w:b/>
+              </w:rPr>
+              <w:t>Implemented</w:t>
+            </w:r>
+          </w:p>
+        </w:tc>
+        <w:tc>
+          <w:tcPr>
+            <w:tcW w:w="6860" w:type="dxa"/>
+            <w:tcBorders>
+              <w:top w:val="single" w:sz="4" w:space="0" w:color="BFBFBF"/>
+              <w:left w:val="single" w:sz="4" w:space="0" w:color="BFBFBF"/>
+              <w:bottom w:val="single" w:sz="4" w:space="0" w:color="BFBFBF"/>
+              <w:right w:val="single" w:sz="4" w:space="0" w:color="BFBFBF"/>
+            </w:tcBorders>
+            <w:tcMar>
+              <w:top w:w="70" w:type="dxa"/>
+              <w:left w:w="110" w:type="dxa"/>
+              <w:bottom w:w="70" w:type="dxa"/>
+              <w:right w:w="110" w:type="dxa"/>
+            </w:tcMar>
+          </w:tcPr>
+          <w:p>
+            <w:r>
+              <w:t>As designed, plus: the tool refuses a title that the lore book or another pending proposal already has, and StoryController.listPendingProposals() gives the front ends the list. A proposal raised before a failed model call still triggers a notification so it appears. The front ends redraw the list in onStoryChanged instead of a separate showProposal call.</w:t>
+            </w:r>
+          </w:p>
+        </w:tc>
+      </w:tr>
+      <w:tr>
+        <w:trPr>
+          <w:cantSplit/>
+        </w:trPr>
+        <w:tc>
+          <w:tcPr>
+            <w:tcW w:w="2500" w:type="dxa"/>
+            <w:tcBorders>
+              <w:top w:val="single" w:sz="4" w:space="0" w:color="BFBFBF"/>
+              <w:left w:val="single" w:sz="4" w:space="0" w:color="BFBFBF"/>
+              <w:bottom w:val="single" w:sz="4" w:space="0" w:color="BFBFBF"/>
+              <w:right w:val="single" w:sz="4" w:space="0" w:color="BFBFBF"/>
+            </w:tcBorders>
+            <w:shd w:val="clear" w:color="auto" w:fill="F2F2F2"/>
+            <w:tcMar>
+              <w:top w:w="70" w:type="dxa"/>
+              <w:left w:w="110" w:type="dxa"/>
+              <w:bottom w:w="70" w:type="dxa"/>
+              <w:right w:w="110" w:type="dxa"/>
+            </w:tcMar>
+          </w:tcPr>
+          <w:p>
+            <w:r>
+              <w:rPr>
+                <w:b/>
+              </w:rPr>
+              <w:t>What Changed and Why</w:t>
+            </w:r>
+          </w:p>
+        </w:tc>
+        <w:tc>
+          <w:tcPr>
+            <w:tcW w:w="6860" w:type="dxa"/>
+            <w:tcBorders>
+              <w:top w:val="single" w:sz="4" w:space="0" w:color="BFBFBF"/>
+              <w:left w:val="single" w:sz="4" w:space="0" w:color="BFBFBF"/>
+              <w:bottom w:val="single" w:sz="4" w:space="0" w:color="BFBFBF"/>
+              <w:right w:val="single" w:sz="4" w:space="0" w:color="BFBFBF"/>
+            </w:tcBorders>
+            <w:tcMar>
+              <w:top w:w="70" w:type="dxa"/>
+              <w:left w:w="110" w:type="dxa"/>
+              <w:bottom w:w="70" w:type="dxa"/>
+              <w:right w:w="110" w:type="dxa"/>
+            </w:tcMar>
+          </w:tcPr>
+          <w:p>
+            <w:r>
+              <w:t>Without the title check the model tends to re-propose facts it has just looked up, and approval would fail on the lore book's duplicate-title rule anyway. Redrawing from the session is how every other list already works (Observer).</w:t>
+            </w:r>
+          </w:p>
+        </w:tc>
+      </w:tr>
+      <w:tr>
+        <w:trPr>
+          <w:cantSplit/>
+        </w:trPr>
+        <w:tc>
+          <w:tcPr>
+            <w:tcW w:w="2500" w:type="dxa"/>
+            <w:tcBorders>
+              <w:top w:val="single" w:sz="4" w:space="0" w:color="BFBFBF"/>
+              <w:left w:val="single" w:sz="4" w:space="0" w:color="BFBFBF"/>
+              <w:bottom w:val="single" w:sz="4" w:space="0" w:color="BFBFBF"/>
+              <w:right w:val="single" w:sz="4" w:space="0" w:color="BFBFBF"/>
+            </w:tcBorders>
+            <w:shd w:val="clear" w:color="auto" w:fill="F2F2F2"/>
+            <w:tcMar>
+              <w:top w:w="70" w:type="dxa"/>
+              <w:left w:w="110" w:type="dxa"/>
+              <w:bottom w:w="70" w:type="dxa"/>
+              <w:right w:w="110" w:type="dxa"/>
+            </w:tcMar>
+          </w:tcPr>
+          <w:p>
+            <w:r>
+              <w:rPr>
+                <w:b/>
+              </w:rPr>
+              <w:t>How the User Need Is Still Met</w:t>
+            </w:r>
+          </w:p>
+        </w:tc>
+        <w:tc>
+          <w:tcPr>
+            <w:tcW w:w="6860" w:type="dxa"/>
+            <w:tcBorders>
+              <w:top w:val="single" w:sz="4" w:space="0" w:color="BFBFBF"/>
+              <w:left w:val="single" w:sz="4" w:space="0" w:color="BFBFBF"/>
+              <w:bottom w:val="single" w:sz="4" w:space="0" w:color="BFBFBF"/>
+              <w:right w:val="single" w:sz="4" w:space="0" w:color="BFBFBF"/>
+            </w:tcBorders>
+            <w:tcMar>
+              <w:top w:w="70" w:type="dxa"/>
+              <w:left w:w="110" w:type="dxa"/>
+              <w:bottom w:w="70" w:type="dxa"/>
+              <w:right w:w="110" w:type="dxa"/>
+            </w:tcMar>
+          </w:tcPr>
+          <w:p>
+            <w:r>
+              <w:t>The agent proposes, the user approves or rejects each proposal, and only approved proposals become lore.</w:t>
+            </w:r>
+          </w:p>
+        </w:tc>
+      </w:tr>
+      <w:tr>
+        <w:trPr>
+          <w:cantSplit/>
+        </w:trPr>
+        <w:tc>
+          <w:tcPr>
+            <w:tcW w:w="2500" w:type="dxa"/>
+            <w:tcBorders>
+              <w:top w:val="single" w:sz="4" w:space="0" w:color="BFBFBF"/>
+              <w:left w:val="single" w:sz="4" w:space="0" w:color="BFBFBF"/>
+              <w:bottom w:val="single" w:sz="4" w:space="0" w:color="BFBFBF"/>
+              <w:right w:val="single" w:sz="4" w:space="0" w:color="BFBFBF"/>
+            </w:tcBorders>
+            <w:shd w:val="clear" w:color="auto" w:fill="F2F2F2"/>
+            <w:tcMar>
+              <w:top w:w="70" w:type="dxa"/>
+              <w:left w:w="110" w:type="dxa"/>
+              <w:bottom w:w="70" w:type="dxa"/>
+              <w:right w:w="110" w:type="dxa"/>
+            </w:tcMar>
+          </w:tcPr>
+          <w:p>
+            <w:r>
+              <w:rPr>
+                <w:b/>
+              </w:rPr>
+              <w:t>Affected Use Cases / Classes / Methods / Patterns</w:t>
+            </w:r>
+          </w:p>
+        </w:tc>
+        <w:tc>
+          <w:tcPr>
+            <w:tcW w:w="6860" w:type="dxa"/>
+            <w:tcBorders>
+              <w:top w:val="single" w:sz="4" w:space="0" w:color="BFBFBF"/>
+              <w:left w:val="single" w:sz="4" w:space="0" w:color="BFBFBF"/>
+              <w:bottom w:val="single" w:sz="4" w:space="0" w:color="BFBFBF"/>
+              <w:right w:val="single" w:sz="4" w:space="0" w:color="BFBFBF"/>
+            </w:tcBorders>
+            <w:tcMar>
+              <w:top w:w="70" w:type="dxa"/>
+              <w:left w:w="110" w:type="dxa"/>
+              <w:bottom w:w="70" w:type="dxa"/>
+              <w:right w:w="110" w:type="dxa"/>
+            </w:tcMar>
+          </w:tcPr>
+          <w:p>
+            <w:r>
+              <w:t>UC05; ProposeLoreTool, StoryController, StoryCLI; Observer, MVC.</w:t>
+            </w:r>
+          </w:p>
+        </w:tc>
+      </w:tr>
+      <w:tr>
+        <w:trPr>
+          <w:cantSplit/>
+        </w:trPr>
+        <w:tc>
+          <w:tcPr>
+            <w:tcW w:w="2500" w:type="dxa"/>
+            <w:tcBorders>
+              <w:top w:val="single" w:sz="4" w:space="0" w:color="BFBFBF"/>
+              <w:left w:val="single" w:sz="4" w:space="0" w:color="BFBFBF"/>
+              <w:bottom w:val="single" w:sz="4" w:space="0" w:color="BFBFBF"/>
+              <w:right w:val="single" w:sz="4" w:space="0" w:color="BFBFBF"/>
+            </w:tcBorders>
+            <w:shd w:val="clear" w:color="auto" w:fill="F2F2F2"/>
+            <w:tcMar>
+              <w:top w:w="70" w:type="dxa"/>
+              <w:left w:w="110" w:type="dxa"/>
+              <w:bottom w:w="70" w:type="dxa"/>
+              <w:right w:w="110" w:type="dxa"/>
+            </w:tcMar>
+          </w:tcPr>
+          <w:p>
+            <w:r>
+              <w:rPr>
+                <w:b/>
+              </w:rPr>
+              <w:t>Diagrams Updated</w:t>
+            </w:r>
+          </w:p>
+        </w:tc>
+        <w:tc>
+          <w:tcPr>
+            <w:tcW w:w="6860" w:type="dxa"/>
+            <w:tcBorders>
+              <w:top w:val="single" w:sz="4" w:space="0" w:color="BFBFBF"/>
+              <w:left w:val="single" w:sz="4" w:space="0" w:color="BFBFBF"/>
+              <w:bottom w:val="single" w:sz="4" w:space="0" w:color="BFBFBF"/>
+              <w:right w:val="single" w:sz="4" w:space="0" w:color="BFBFBF"/>
+            </w:tcBorders>
+            <w:tcMar>
+              <w:top w:w="70" w:type="dxa"/>
+              <w:left w:w="110" w:type="dxa"/>
+              <w:bottom w:w="70" w:type="dxa"/>
+              <w:right w:w="110" w:type="dxa"/>
+            </w:tcMar>
+          </w:tcPr>
+          <w:p>
+            <w:r>
+              <w:t>SD07.</w:t>
+            </w:r>
+          </w:p>
+        </w:tc>
+      </w:tr>
+      <w:tr>
+        <w:trPr>
+          <w:cantSplit/>
+        </w:trPr>
+        <w:tc>
+          <w:tcPr>
+            <w:tcW w:w="2500" w:type="dxa"/>
+            <w:tcBorders>
+              <w:top w:val="single" w:sz="4" w:space="0" w:color="BFBFBF"/>
+              <w:left w:val="single" w:sz="4" w:space="0" w:color="BFBFBF"/>
+              <w:bottom w:val="single" w:sz="4" w:space="0" w:color="BFBFBF"/>
+              <w:right w:val="single" w:sz="4" w:space="0" w:color="BFBFBF"/>
+            </w:tcBorders>
+            <w:shd w:val="clear" w:color="auto" w:fill="F2F2F2"/>
+            <w:tcMar>
+              <w:top w:w="70" w:type="dxa"/>
+              <w:left w:w="110" w:type="dxa"/>
+              <w:bottom w:w="70" w:type="dxa"/>
+              <w:right w:w="110" w:type="dxa"/>
+            </w:tcMar>
+          </w:tcPr>
+          <w:p>
+            <w:r>
+              <w:rPr>
+                <w:b/>
+              </w:rPr>
+              <w:t>Commit(s)</w:t>
+            </w:r>
+          </w:p>
+        </w:tc>
+        <w:tc>
+          <w:tcPr>
+            <w:tcW w:w="6860" w:type="dxa"/>
+            <w:tcBorders>
+              <w:top w:val="single" w:sz="4" w:space="0" w:color="BFBFBF"/>
+              <w:left w:val="single" w:sz="4" w:space="0" w:color="BFBFBF"/>
+              <w:bottom w:val="single" w:sz="4" w:space="0" w:color="BFBFBF"/>
+              <w:right w:val="single" w:sz="4" w:space="0" w:color="BFBFBF"/>
+            </w:tcBorders>
+            <w:tcMar>
+              <w:top w:w="70" w:type="dxa"/>
+              <w:left w:w="110" w:type="dxa"/>
+              <w:bottom w:w="70" w:type="dxa"/>
+              <w:right w:w="110" w:type="dxa"/>
+            </w:tcMar>
+          </w:tcPr>
+          <w:p>
+            <w:r>
+              <w:t>feat(tools): raise lore proposals and resolve them in StoryController</w:t>
             </w:r>
           </w:p>
         </w:tc>
@@ -22740,6 +23263,102 @@
           </w:p>
         </w:tc>
       </w:tr>
+      <w:tr>
+        <w:trPr>
+          <w:cantSplit/>
+        </w:trPr>
+        <w:tc>
+          <w:tcPr>
+            <w:tcW w:w="600" w:type="dxa"/>
+            <w:tcBorders>
+              <w:top w:val="single" w:sz="4" w:space="0" w:color="BFBFBF"/>
+              <w:left w:val="single" w:sz="4" w:space="0" w:color="BFBFBF"/>
+              <w:bottom w:val="single" w:sz="4" w:space="0" w:color="BFBFBF"/>
+              <w:right w:val="single" w:sz="4" w:space="0" w:color="BFBFBF"/>
+            </w:tcBorders>
+            <w:tcMar>
+              <w:top w:w="70" w:type="dxa"/>
+              <w:left w:w="110" w:type="dxa"/>
+              <w:bottom w:w="70" w:type="dxa"/>
+              <w:right w:w="110" w:type="dxa"/>
+            </w:tcMar>
+          </w:tcPr>
+          <w:p>
+            <w:r>
+              <w:t>6</w:t>
+            </w:r>
+          </w:p>
+        </w:tc>
+        <w:tc>
+          <w:tcPr>
+            <w:tcW w:w="2000" w:type="dxa"/>
+            <w:tcBorders>
+              <w:top w:val="single" w:sz="4" w:space="0" w:color="BFBFBF"/>
+              <w:left w:val="single" w:sz="4" w:space="0" w:color="BFBFBF"/>
+              <w:bottom w:val="single" w:sz="4" w:space="0" w:color="BFBFBF"/>
+              <w:right w:val="single" w:sz="4" w:space="0" w:color="BFBFBF"/>
+            </w:tcBorders>
+            <w:tcMar>
+              <w:top w:w="70" w:type="dxa"/>
+              <w:left w:w="110" w:type="dxa"/>
+              <w:bottom w:w="70" w:type="dxa"/>
+              <w:right w:w="110" w:type="dxa"/>
+            </w:tcMar>
+          </w:tcPr>
+          <w:p>
+            <w:r>
+              <w:rPr/>
+              <w:t>f260c7f (https://github.com/Polarralop/EECS3311Project/commit/f260c7f)</w:t>
+            </w:r>
+          </w:p>
+        </w:tc>
+        <w:tc>
+          <w:tcPr>
+            <w:tcW w:w="5160" w:type="dxa"/>
+            <w:tcBorders>
+              <w:top w:val="single" w:sz="4" w:space="0" w:color="BFBFBF"/>
+              <w:left w:val="single" w:sz="4" w:space="0" w:color="BFBFBF"/>
+              <w:bottom w:val="single" w:sz="4" w:space="0" w:color="BFBFBF"/>
+              <w:right w:val="single" w:sz="4" w:space="0" w:color="BFBFBF"/>
+            </w:tcBorders>
+            <w:tcMar>
+              <w:top w:w="70" w:type="dxa"/>
+              <w:left w:w="110" w:type="dxa"/>
+              <w:bottom w:w="70" w:type="dxa"/>
+              <w:right w:w="110" w:type="dxa"/>
+            </w:tcMar>
+          </w:tcPr>
+          <w:p>
+            <w:r>
+              <w:rPr/>
+              <w:t>feat(controller): edit a past turn with EditTurnCommand</w:t>
+            </w:r>
+          </w:p>
+        </w:tc>
+        <w:tc>
+          <w:tcPr>
+            <w:tcW w:w="1600" w:type="dxa"/>
+            <w:tcBorders>
+              <w:top w:val="single" w:sz="4" w:space="0" w:color="BFBFBF"/>
+              <w:left w:val="single" w:sz="4" w:space="0" w:color="BFBFBF"/>
+              <w:bottom w:val="single" w:sz="4" w:space="0" w:color="BFBFBF"/>
+              <w:right w:val="single" w:sz="4" w:space="0" w:color="BFBFBF"/>
+            </w:tcBorders>
+            <w:tcMar>
+              <w:top w:w="70" w:type="dxa"/>
+              <w:left w:w="110" w:type="dxa"/>
+              <w:bottom w:w="70" w:type="dxa"/>
+              <w:right w:w="110" w:type="dxa"/>
+            </w:tcMar>
+          </w:tcPr>
+          <w:p>
+            <w:r>
+              <w:rPr/>
+              <w:t>F10 (Command)</w:t>
+            </w:r>
+          </w:p>
+        </w:tc>
+      </w:tr>
     </w:tbl>
     <w:p>
       <w:pPr>
@@ -22752,7 +23371,7 @@
       </w:pPr>
       <w:r>
         <w:rPr/>
-        <w:t>Count so far (period 2): 5 meaningful code commits, all on Oct 27 (each later commit logs the ones before it).</w:t>
+        <w:t>Count so far (period 2): 6 meaningful code commits, all on Oct 27 (each later commit logs the ones before it).</w:t>
       </w:r>
     </w:p>
     <w:p>

</xml_diff>

<commit_message>
docs: redraw changed UML diagrams and log the week 2 session
Class diagrams 02 to 08 and sequence diagrams SD03 and SD09 are
redrawn from the code into figures/stage2/ with the Stage 1 file
names and inserted into report sections 3.7 and 3.8. The 3.8 table
records which other diagrams no longer match and when they will be
redrawn. Also logs commit 70e760d and this session's AI use and cost.

Refs: F01, F04, F05, F07, F10

Co-Authored-By: Claude Opus 5.5 <noreply@anthropic.com>
Claude-Session: https://claude.ai/code/session_01WQ5gKVQXkP6gSc2ew2jXdc
</commit_message>
<xml_diff>
--- a/Stage2_Report.docx
+++ b/Stage2_Report.docx
@@ -13381,11 +13381,8 @@
         <w:spacing w:after="120"/>
       </w:pPr>
       <w:r>
-        <w:rPr>
-          <w:i/>
-          <w:color w:val="7F7F7F"/>
-        </w:rPr>
-        <w:t>[Redraw each diagram that no longer matches the code and save it under figures/stage2/class-diagram/ with the same file name. Keep the Stage 1 figure where nothing changed, and say so in the caption.]</w:t>
+        <w:rPr/>
+        <w:t>Figures 2 to 8 are redrawn from the code as of Oct 27 (end of the F04, F05, F07 and F10 work) and saved under figures/stage2/class-diagram/ with the Stage 1 file names. Pattern roles are shown under each class name. A dashed box is a class from another package shown for context, or a class that is designed but not built yet (its feature is named). Figures 1 and 9 are checked again in week 3, after F06, F08 and F09 add their classes.</w:t>
       </w:r>
     </w:p>
     <w:p>
@@ -13426,7 +13423,38 @@
           <w:i/>
           <w:color w:val="7F7F7F"/>
         </w:rPr>
-        <w:t>[Insert figure: figures/stage2/class-diagram/02-ui.png (or figures/class-diagram/02-ui.png if unchanged)]</w:t>
+        <w:drawing>
+          <wp:inline xmlns:a="http://schemas.openxmlformats.org/drawingml/2006/main" xmlns:pic="http://schemas.openxmlformats.org/drawingml/2006/picture">
+            <wp:extent cx="5760720" cy="4180788"/>
+            <wp:docPr id="1" name="Picture 1"/>
+            <wp:cNvGraphicFramePr>
+              <a:graphicFrameLocks noChangeAspect="1"/>
+            </wp:cNvGraphicFramePr>
+            <a:graphic>
+              <a:graphicData uri="http://schemas.openxmlformats.org/drawingml/2006/picture">
+                <pic:pic>
+                  <pic:nvPicPr>
+                    <pic:cNvPr id="0" name="02-ui.png"/>
+                    <pic:cNvPicPr/>
+                  </pic:nvPicPr>
+                  <pic:blipFill>
+                    <a:blip r:embed="rId8"/>
+                    <a:stretch>
+                      <a:fillRect/>
+                    </a:stretch>
+                  </pic:blipFill>
+                  <pic:spPr>
+                    <a:xfrm>
+                      <a:off x="0" y="0"/>
+                      <a:ext cx="5760720" cy="4180788"/>
+                    </a:xfrm>
+                    <a:prstGeom prst="rect"/>
+                  </pic:spPr>
+                </pic:pic>
+              </a:graphicData>
+            </a:graphic>
+          </wp:inline>
+        </w:drawing>
       </w:r>
     </w:p>
     <w:p>
@@ -13453,7 +13481,38 @@
           <w:i/>
           <w:color w:val="7F7F7F"/>
         </w:rPr>
-        <w:t>[Insert figure: figures/stage2/class-diagram/03-controller.png (or figures/class-diagram/03-controller.png if unchanged)]</w:t>
+        <w:drawing>
+          <wp:inline xmlns:a="http://schemas.openxmlformats.org/drawingml/2006/main" xmlns:pic="http://schemas.openxmlformats.org/drawingml/2006/picture">
+            <wp:extent cx="5760720" cy="4620373"/>
+            <wp:docPr id="2" name="Picture 2"/>
+            <wp:cNvGraphicFramePr>
+              <a:graphicFrameLocks noChangeAspect="1"/>
+            </wp:cNvGraphicFramePr>
+            <a:graphic>
+              <a:graphicData uri="http://schemas.openxmlformats.org/drawingml/2006/picture">
+                <pic:pic>
+                  <pic:nvPicPr>
+                    <pic:cNvPr id="0" name="03-controller.png"/>
+                    <pic:cNvPicPr/>
+                  </pic:nvPicPr>
+                  <pic:blipFill>
+                    <a:blip r:embed="rId10"/>
+                    <a:stretch>
+                      <a:fillRect/>
+                    </a:stretch>
+                  </pic:blipFill>
+                  <pic:spPr>
+                    <a:xfrm>
+                      <a:off x="0" y="0"/>
+                      <a:ext cx="5760720" cy="4620373"/>
+                    </a:xfrm>
+                    <a:prstGeom prst="rect"/>
+                  </pic:spPr>
+                </pic:pic>
+              </a:graphicData>
+            </a:graphic>
+          </wp:inline>
+        </w:drawing>
       </w:r>
     </w:p>
     <w:p>
@@ -13480,7 +13539,38 @@
           <w:i/>
           <w:color w:val="7F7F7F"/>
         </w:rPr>
-        <w:t>[Insert figure: figures/stage2/class-diagram/04-model-story-and-lore.png (or figures/class-diagram/04-model-story-and-lore.png if unchanged)]</w:t>
+        <w:drawing>
+          <wp:inline xmlns:a="http://schemas.openxmlformats.org/drawingml/2006/main" xmlns:pic="http://schemas.openxmlformats.org/drawingml/2006/picture">
+            <wp:extent cx="5760720" cy="5557341"/>
+            <wp:docPr id="3" name="Picture 3"/>
+            <wp:cNvGraphicFramePr>
+              <a:graphicFrameLocks noChangeAspect="1"/>
+            </wp:cNvGraphicFramePr>
+            <a:graphic>
+              <a:graphicData uri="http://schemas.openxmlformats.org/drawingml/2006/picture">
+                <pic:pic>
+                  <pic:nvPicPr>
+                    <pic:cNvPr id="0" name="04-model-story-and-lore.png"/>
+                    <pic:cNvPicPr/>
+                  </pic:nvPicPr>
+                  <pic:blipFill>
+                    <a:blip r:embed="rId11"/>
+                    <a:stretch>
+                      <a:fillRect/>
+                    </a:stretch>
+                  </pic:blipFill>
+                  <pic:spPr>
+                    <a:xfrm>
+                      <a:off x="0" y="0"/>
+                      <a:ext cx="5760720" cy="5557341"/>
+                    </a:xfrm>
+                    <a:prstGeom prst="rect"/>
+                  </pic:spPr>
+                </pic:pic>
+              </a:graphicData>
+            </a:graphic>
+          </wp:inline>
+        </w:drawing>
       </w:r>
     </w:p>
     <w:p>
@@ -13507,7 +13597,38 @@
           <w:i/>
           <w:color w:val="7F7F7F"/>
         </w:rPr>
-        <w:t>[Insert figure: figures/stage2/class-diagram/05-model-characters-and-events.png (or figures/class-diagram/05-model-characters-and-events.png if unchanged)]</w:t>
+        <w:drawing>
+          <wp:inline xmlns:a="http://schemas.openxmlformats.org/drawingml/2006/main" xmlns:pic="http://schemas.openxmlformats.org/drawingml/2006/picture">
+            <wp:extent cx="5760720" cy="5246764"/>
+            <wp:docPr id="4" name="Picture 4"/>
+            <wp:cNvGraphicFramePr>
+              <a:graphicFrameLocks noChangeAspect="1"/>
+            </wp:cNvGraphicFramePr>
+            <a:graphic>
+              <a:graphicData uri="http://schemas.openxmlformats.org/drawingml/2006/picture">
+                <pic:pic>
+                  <pic:nvPicPr>
+                    <pic:cNvPr id="0" name="05-model-characters-and-events.png"/>
+                    <pic:cNvPicPr/>
+                  </pic:nvPicPr>
+                  <pic:blipFill>
+                    <a:blip r:embed="rId13"/>
+                    <a:stretch>
+                      <a:fillRect/>
+                    </a:stretch>
+                  </pic:blipFill>
+                  <pic:spPr>
+                    <a:xfrm>
+                      <a:off x="0" y="0"/>
+                      <a:ext cx="5760720" cy="5246764"/>
+                    </a:xfrm>
+                    <a:prstGeom prst="rect"/>
+                  </pic:spPr>
+                </pic:pic>
+              </a:graphicData>
+            </a:graphic>
+          </wp:inline>
+        </w:drawing>
       </w:r>
     </w:p>
     <w:p>
@@ -13534,7 +13655,38 @@
           <w:i/>
           <w:color w:val="7F7F7F"/>
         </w:rPr>
-        <w:t>[Insert figure: figures/stage2/class-diagram/06-agent.png (or figures/class-diagram/06-agent.png if unchanged)]</w:t>
+        <w:drawing>
+          <wp:inline xmlns:a="http://schemas.openxmlformats.org/drawingml/2006/main" xmlns:pic="http://schemas.openxmlformats.org/drawingml/2006/picture">
+            <wp:extent cx="5760720" cy="4094377"/>
+            <wp:docPr id="5" name="Picture 5"/>
+            <wp:cNvGraphicFramePr>
+              <a:graphicFrameLocks noChangeAspect="1"/>
+            </wp:cNvGraphicFramePr>
+            <a:graphic>
+              <a:graphicData uri="http://schemas.openxmlformats.org/drawingml/2006/picture">
+                <pic:pic>
+                  <pic:nvPicPr>
+                    <pic:cNvPr id="0" name="06-agent.png"/>
+                    <pic:cNvPicPr/>
+                  </pic:nvPicPr>
+                  <pic:blipFill>
+                    <a:blip r:embed="rId15"/>
+                    <a:stretch>
+                      <a:fillRect/>
+                    </a:stretch>
+                  </pic:blipFill>
+                  <pic:spPr>
+                    <a:xfrm>
+                      <a:off x="0" y="0"/>
+                      <a:ext cx="5760720" cy="4094377"/>
+                    </a:xfrm>
+                    <a:prstGeom prst="rect"/>
+                  </pic:spPr>
+                </pic:pic>
+              </a:graphicData>
+            </a:graphic>
+          </wp:inline>
+        </w:drawing>
       </w:r>
     </w:p>
     <w:p>
@@ -13561,7 +13713,38 @@
           <w:i/>
           <w:color w:val="7F7F7F"/>
         </w:rPr>
-        <w:t>[Insert figure: figures/stage2/class-diagram/07-agent-tools.png (or figures/class-diagram/07-agent-tools.png if unchanged)]</w:t>
+        <w:drawing>
+          <wp:inline xmlns:a="http://schemas.openxmlformats.org/drawingml/2006/main" xmlns:pic="http://schemas.openxmlformats.org/drawingml/2006/picture">
+            <wp:extent cx="5760720" cy="3014150"/>
+            <wp:docPr id="6" name="Picture 6"/>
+            <wp:cNvGraphicFramePr>
+              <a:graphicFrameLocks noChangeAspect="1"/>
+            </wp:cNvGraphicFramePr>
+            <a:graphic>
+              <a:graphicData uri="http://schemas.openxmlformats.org/drawingml/2006/picture">
+                <pic:pic>
+                  <pic:nvPicPr>
+                    <pic:cNvPr id="0" name="07-agent-tools.png"/>
+                    <pic:cNvPicPr/>
+                  </pic:nvPicPr>
+                  <pic:blipFill>
+                    <a:blip r:embed="rId17"/>
+                    <a:stretch>
+                      <a:fillRect/>
+                    </a:stretch>
+                  </pic:blipFill>
+                  <pic:spPr>
+                    <a:xfrm>
+                      <a:off x="0" y="0"/>
+                      <a:ext cx="5760720" cy="3014150"/>
+                    </a:xfrm>
+                    <a:prstGeom prst="rect"/>
+                  </pic:spPr>
+                </pic:pic>
+              </a:graphicData>
+            </a:graphic>
+          </wp:inline>
+        </w:drawing>
       </w:r>
     </w:p>
     <w:p>
@@ -13588,7 +13771,38 @@
           <w:i/>
           <w:color w:val="7F7F7F"/>
         </w:rPr>
-        <w:t>[Insert figure: figures/stage2/class-diagram/08-llm.png (or figures/class-diagram/08-llm.png if unchanged)]</w:t>
+        <w:drawing>
+          <wp:inline xmlns:a="http://schemas.openxmlformats.org/drawingml/2006/main" xmlns:pic="http://schemas.openxmlformats.org/drawingml/2006/picture">
+            <wp:extent cx="5760720" cy="3804699"/>
+            <wp:docPr id="7" name="Picture 7"/>
+            <wp:cNvGraphicFramePr>
+              <a:graphicFrameLocks noChangeAspect="1"/>
+            </wp:cNvGraphicFramePr>
+            <a:graphic>
+              <a:graphicData uri="http://schemas.openxmlformats.org/drawingml/2006/picture">
+                <pic:pic>
+                  <pic:nvPicPr>
+                    <pic:cNvPr id="0" name="08-llm.png"/>
+                    <pic:cNvPicPr/>
+                  </pic:nvPicPr>
+                  <pic:blipFill>
+                    <a:blip r:embed="rId18"/>
+                    <a:stretch>
+                      <a:fillRect/>
+                    </a:stretch>
+                  </pic:blipFill>
+                  <pic:spPr>
+                    <a:xfrm>
+                      <a:off x="0" y="0"/>
+                      <a:ext cx="5760720" cy="3804699"/>
+                    </a:xfrm>
+                    <a:prstGeom prst="rect"/>
+                  </pic:spPr>
+                </pic:pic>
+              </a:graphicData>
+            </a:graphic>
+          </wp:inline>
+        </w:drawing>
       </w:r>
     </w:p>
     <w:p>
@@ -13786,11 +14000,8 @@
           </w:tcPr>
           <w:p>
             <w:r>
-              <w:rPr>
-                <w:i/>
-                <w:color w:val="7F7F7F"/>
-              </w:rPr>
-              <w:t>[Yes / No]</w:t>
+              <w:rPr/>
+              <w:t>Yes</w:t>
             </w:r>
           </w:p>
         </w:tc>
@@ -13812,11 +14023,8 @@
           </w:tcPr>
           <w:p>
             <w:r>
-              <w:rPr>
-                <w:i/>
-                <w:color w:val="7F7F7F"/>
-              </w:rPr>
-              <w:t>[-]</w:t>
+              <w:rPr/>
+              <w:t>No change; all ten use cases are still planned.</w:t>
             </w:r>
           </w:p>
         </w:tc>
@@ -13865,11 +14073,8 @@
           </w:tcPr>
           <w:p>
             <w:r>
-              <w:rPr>
-                <w:i/>
-                <w:color w:val="7F7F7F"/>
-              </w:rPr>
-              <w:t>[Yes / No]</w:t>
+              <w:rPr/>
+              <w:t>No</w:t>
             </w:r>
           </w:p>
         </w:tc>
@@ -13891,11 +14096,8 @@
           </w:tcPr>
           <w:p>
             <w:r>
-              <w:rPr>
-                <w:i/>
-                <w:color w:val="7F7F7F"/>
-              </w:rPr>
-              <w:t>[-]</w:t>
+              <w:rPr/>
+              <w:t>Errors come back as exceptions that the view shows; the adapter calls messages().create(params) on the SDK. To redraw in week 3.</w:t>
             </w:r>
           </w:p>
         </w:tc>
@@ -13944,11 +14146,8 @@
           </w:tcPr>
           <w:p>
             <w:r>
-              <w:rPr>
-                <w:i/>
-                <w:color w:val="7F7F7F"/>
-              </w:rPr>
-              <w:t>[Yes / No]</w:t>
+              <w:rPr/>
+              <w:t>No</w:t>
             </w:r>
           </w:p>
         </w:tc>
@@ -13970,11 +14169,8 @@
           </w:tcPr>
           <w:p>
             <w:r>
-              <w:rPr>
-                <w:i/>
-                <w:color w:val="7F7F7F"/>
-              </w:rPr>
-              <w:t>[-]</w:t>
+              <w:rPr/>
+              <w:t>startStory plans the pivotal events first and reuses an empty, unstarted session so prepared lore is kept. To redraw in week 3.</w:t>
             </w:r>
           </w:p>
         </w:tc>
@@ -14023,11 +14219,8 @@
           </w:tcPr>
           <w:p>
             <w:r>
-              <w:rPr>
-                <w:i/>
-                <w:color w:val="7F7F7F"/>
-              </w:rPr>
-              <w:t>[Yes / No]</w:t>
+              <w:rPr/>
+              <w:t>No</w:t>
             </w:r>
           </w:p>
         </w:tc>
@@ -14049,11 +14242,8 @@
           </w:tcPr>
           <w:p>
             <w:r>
-              <w:rPr>
-                <w:i/>
-                <w:color w:val="7F7F7F"/>
-              </w:rPr>
-              <w:t>[-]</w:t>
+              <w:rPr/>
+              <w:t>Figure 10.</w:t>
             </w:r>
           </w:p>
         </w:tc>
@@ -14102,11 +14292,8 @@
           </w:tcPr>
           <w:p>
             <w:r>
-              <w:rPr>
-                <w:i/>
-                <w:color w:val="7F7F7F"/>
-              </w:rPr>
-              <w:t>[Yes / No]</w:t>
+              <w:rPr/>
+              <w:t>No</w:t>
             </w:r>
           </w:p>
         </w:tc>
@@ -14128,11 +14315,8 @@
           </w:tcPr>
           <w:p>
             <w:r>
-              <w:rPr>
-                <w:i/>
-                <w:color w:val="7F7F7F"/>
-              </w:rPr>
-              <w:t>[-]</w:t>
+              <w:rPr/>
+              <w:t>Errors come back as exceptions; the GUI runs the turn in the background and redraws from onStoryChanged. To redraw in week 3.</w:t>
             </w:r>
           </w:p>
         </w:tc>
@@ -14181,11 +14365,8 @@
           </w:tcPr>
           <w:p>
             <w:r>
-              <w:rPr>
-                <w:i/>
-                <w:color w:val="7F7F7F"/>
-              </w:rPr>
-              <w:t>[Yes / No]</w:t>
+              <w:rPr/>
+              <w:t>No</w:t>
             </w:r>
           </w:p>
         </w:tc>
@@ -14207,11 +14388,8 @@
           </w:tcPr>
           <w:p>
             <w:r>
-              <w:rPr>
-                <w:i/>
-                <w:color w:val="7F7F7F"/>
-              </w:rPr>
-              <w:t>[-]</w:t>
+              <w:rPr/>
+              <w:t>planStep makes no model call; the tool loop is capped at 8 rounds. The consistency step waits for F08. To redraw after F08.</w:t>
             </w:r>
           </w:p>
         </w:tc>
@@ -14260,11 +14438,8 @@
           </w:tcPr>
           <w:p>
             <w:r>
-              <w:rPr>
-                <w:i/>
-                <w:color w:val="7F7F7F"/>
-              </w:rPr>
-              <w:t>[Yes / No]</w:t>
+              <w:rPr/>
+              <w:t>Not built yet</w:t>
             </w:r>
           </w:p>
         </w:tc>
@@ -14286,11 +14461,8 @@
           </w:tcPr>
           <w:p>
             <w:r>
-              <w:rPr>
-                <w:i/>
-                <w:color w:val="7F7F7F"/>
-              </w:rPr>
-              <w:t>[-]</w:t>
+              <w:rPr/>
+              <w:t>F08 and F09 are planned for week 3.</w:t>
             </w:r>
           </w:p>
         </w:tc>
@@ -14339,11 +14511,8 @@
           </w:tcPr>
           <w:p>
             <w:r>
-              <w:rPr>
-                <w:i/>
-                <w:color w:val="7F7F7F"/>
-              </w:rPr>
-              <w:t>[Yes / No]</w:t>
+              <w:rPr/>
+              <w:t>No</w:t>
             </w:r>
           </w:p>
         </w:tc>
@@ -14365,11 +14534,8 @@
           </w:tcPr>
           <w:p>
             <w:r>
-              <w:rPr>
-                <w:i/>
-                <w:color w:val="7F7F7F"/>
-              </w:rPr>
-              <w:t>[-]</w:t>
+              <w:rPr/>
+              <w:t>No showProposal call: the proposals list is redrawn when observers are notified. To redraw in week 3.</w:t>
             </w:r>
           </w:p>
         </w:tc>
@@ -14418,11 +14584,8 @@
           </w:tcPr>
           <w:p>
             <w:r>
-              <w:rPr>
-                <w:i/>
-                <w:color w:val="7F7F7F"/>
-              </w:rPr>
-              <w:t>[Yes / No]</w:t>
+              <w:rPr/>
+              <w:t>No</w:t>
             </w:r>
           </w:p>
         </w:tc>
@@ -14444,11 +14607,8 @@
           </w:tcPr>
           <w:p>
             <w:r>
-              <w:rPr>
-                <w:i/>
-                <w:color w:val="7F7F7F"/>
-              </w:rPr>
-              <w:t>[-]</w:t>
+              <w:rPr/>
+              <w:t>Retry first undoes any edits made after the last turn, then the turn, then runs it again. To redraw in week 3.</w:t>
             </w:r>
           </w:p>
         </w:tc>
@@ -14497,11 +14657,8 @@
           </w:tcPr>
           <w:p>
             <w:r>
-              <w:rPr>
-                <w:i/>
-                <w:color w:val="7F7F7F"/>
-              </w:rPr>
-              <w:t>[Yes / No]</w:t>
+              <w:rPr/>
+              <w:t>No</w:t>
             </w:r>
           </w:p>
         </w:tc>
@@ -14523,11 +14680,8 @@
           </w:tcPr>
           <w:p>
             <w:r>
-              <w:rPr>
-                <w:i/>
-                <w:color w:val="7F7F7F"/>
-              </w:rPr>
-              <w:t>[-]</w:t>
+              <w:rPr/>
+              <w:t>Figure 11.</w:t>
             </w:r>
           </w:p>
         </w:tc>
@@ -14576,11 +14730,8 @@
           </w:tcPr>
           <w:p>
             <w:r>
-              <w:rPr>
-                <w:i/>
-                <w:color w:val="7F7F7F"/>
-              </w:rPr>
-              <w:t>[Yes / No]</w:t>
+              <w:rPr/>
+              <w:t>Not built yet</w:t>
             </w:r>
           </w:p>
         </w:tc>
@@ -14602,11 +14753,8 @@
           </w:tcPr>
           <w:p>
             <w:r>
-              <w:rPr>
-                <w:i/>
-                <w:color w:val="7F7F7F"/>
-              </w:rPr>
-              <w:t>[-]</w:t>
+              <w:rPr/>
+              <w:t>F12 is planned for week 3.</w:t>
             </w:r>
           </w:p>
         </w:tc>
@@ -14620,13 +14768,113 @@
     <w:p>
       <w:pPr>
         <w:spacing w:after="120"/>
+        <w:jc w:val="center"/>
       </w:pPr>
       <w:r>
         <w:rPr>
           <w:i/>
           <w:color w:val="7F7F7F"/>
         </w:rPr>
-        <w:t>[Insert each redrawn diagram here with a numbered caption continuing from Figure 9.]</w:t>
+        <w:drawing>
+          <wp:inline xmlns:a="http://schemas.openxmlformats.org/drawingml/2006/main" xmlns:pic="http://schemas.openxmlformats.org/drawingml/2006/picture">
+            <wp:extent cx="5120640" cy="7508952"/>
+            <wp:docPr id="8" name="Picture 8"/>
+            <wp:cNvGraphicFramePr>
+              <a:graphicFrameLocks noChangeAspect="1"/>
+            </wp:cNvGraphicFramePr>
+            <a:graphic>
+              <a:graphicData uri="http://schemas.openxmlformats.org/drawingml/2006/picture">
+                <pic:pic>
+                  <pic:nvPicPr>
+                    <pic:cNvPr id="0" name="SD03-manage-lore-entries-and-characters.png"/>
+                    <pic:cNvPicPr/>
+                  </pic:nvPicPr>
+                  <pic:blipFill>
+                    <a:blip r:embed="rId19"/>
+                    <a:stretch>
+                      <a:fillRect/>
+                    </a:stretch>
+                  </pic:blipFill>
+                  <pic:spPr>
+                    <a:xfrm>
+                      <a:off x="0" y="0"/>
+                      <a:ext cx="5120640" cy="7508952"/>
+                    </a:xfrm>
+                    <a:prstGeom prst="rect"/>
+                  </pic:spPr>
+                </pic:pic>
+              </a:graphicData>
+            </a:graphic>
+          </wp:inline>
+        </w:drawing>
+      </w:r>
+    </w:p>
+    <w:p>
+      <w:pPr>
+        <w:spacing w:after="200"/>
+        <w:jc w:val="center"/>
+      </w:pPr>
+      <w:r>
+        <w:rPr>
+          <w:sz w:val="20"/>
+        </w:rPr>
+        <w:t>Figure 10. SD03 redrawn: invalid lore or characters throw an exception that the view catches and shows; the controller never calls showError.</w:t>
+      </w:r>
+    </w:p>
+    <w:p>
+      <w:pPr>
+        <w:spacing w:after="120"/>
+        <w:jc w:val="center"/>
+      </w:pPr>
+      <w:r>
+        <w:rPr>
+          <w:i/>
+          <w:color w:val="7F7F7F"/>
+        </w:rPr>
+        <w:drawing>
+          <wp:inline xmlns:a="http://schemas.openxmlformats.org/drawingml/2006/main" xmlns:pic="http://schemas.openxmlformats.org/drawingml/2006/picture">
+            <wp:extent cx="5760720" cy="6458197"/>
+            <wp:docPr id="9" name="Picture 9"/>
+            <wp:cNvGraphicFramePr>
+              <a:graphicFrameLocks noChangeAspect="1"/>
+            </wp:cNvGraphicFramePr>
+            <a:graphic>
+              <a:graphicData uri="http://schemas.openxmlformats.org/drawingml/2006/picture">
+                <pic:pic>
+                  <pic:nvPicPr>
+                    <pic:cNvPr id="0" name="SD09-save-and-load-a-story.png"/>
+                    <pic:cNvPicPr/>
+                  </pic:nvPicPr>
+                  <pic:blipFill>
+                    <a:blip r:embed="rId21"/>
+                    <a:stretch>
+                      <a:fillRect/>
+                    </a:stretch>
+                  </pic:blipFill>
+                  <pic:spPr>
+                    <a:xfrm>
+                      <a:off x="0" y="0"/>
+                      <a:ext cx="5760720" cy="6458197"/>
+                    </a:xfrm>
+                    <a:prstGeom prst="rect"/>
+                  </pic:spPr>
+                </pic:pic>
+              </a:graphicData>
+            </a:graphic>
+          </wp:inline>
+        </w:drawing>
+      </w:r>
+    </w:p>
+    <w:p>
+      <w:pPr>
+        <w:spacing w:after="200"/>
+        <w:jc w:val="center"/>
+      </w:pPr>
+      <w:r>
+        <w:rPr>
+          <w:sz w:val="20"/>
+        </w:rPr>
+        <w:t>Figure 11. SD09 redrawn: save and load errors come back as exceptions; loading swaps the observers onto the loaded session, clears the undo history, and returns a recap built from the saved data (the model-written recap arrives with F09).</w:t>
       </w:r>
     </w:p>
     <w:p>
@@ -21431,7 +21679,7 @@
           </w:tcPr>
           <w:p>
             <w:r>
-              <w:t>Project scaffolding; Stage 2 report scaffold; week 1 implementation (model, F02, F03, F11, ClaudeAdapter, controller, CLI and GUI tabs, with tests and docs)</w:t>
+              <w:t>Project scaffolding; Stage 2 report scaffold; week 1 (F02, F03, F11, Adapter, controller, both front ends); week 2 (F04 tool-use turn, F05 hidden events, F01 scenario draft, F07 lore proposals, F10 undo/retry/edit, GUI story tab, redrawn UML diagrams)</w:t>
             </w:r>
           </w:p>
         </w:tc>
@@ -21453,7 +21701,7 @@
           </w:tcPr>
           <w:p>
             <w:r>
-              <w:t>~11.6M input incl. cache reads, ~145K output (three sessions to Oct 20)</w:t>
+              <w:t>~36M input incl. cache reads, ~400K output</w:t>
             </w:r>
           </w:p>
         </w:tc>
@@ -21475,7 +21723,7 @@
           </w:tcPr>
           <w:p>
             <w:r>
-              <w:t>~$7.00</w:t>
+              <w:t>~$17.50</w:t>
             </w:r>
           </w:p>
         </w:tc>
@@ -23620,6 +23868,102 @@
           </w:p>
         </w:tc>
       </w:tr>
+      <w:tr>
+        <w:trPr>
+          <w:cantSplit/>
+        </w:trPr>
+        <w:tc>
+          <w:tcPr>
+            <w:tcW w:w="600" w:type="dxa"/>
+            <w:tcBorders>
+              <w:top w:val="single" w:sz="4" w:space="0" w:color="BFBFBF"/>
+              <w:left w:val="single" w:sz="4" w:space="0" w:color="BFBFBF"/>
+              <w:bottom w:val="single" w:sz="4" w:space="0" w:color="BFBFBF"/>
+              <w:right w:val="single" w:sz="4" w:space="0" w:color="BFBFBF"/>
+            </w:tcBorders>
+            <w:tcMar>
+              <w:top w:w="70" w:type="dxa"/>
+              <w:left w:w="110" w:type="dxa"/>
+              <w:bottom w:w="70" w:type="dxa"/>
+              <w:right w:w="110" w:type="dxa"/>
+            </w:tcMar>
+          </w:tcPr>
+          <w:p>
+            <w:r>
+              <w:t>8</w:t>
+            </w:r>
+          </w:p>
+        </w:tc>
+        <w:tc>
+          <w:tcPr>
+            <w:tcW w:w="2000" w:type="dxa"/>
+            <w:tcBorders>
+              <w:top w:val="single" w:sz="4" w:space="0" w:color="BFBFBF"/>
+              <w:left w:val="single" w:sz="4" w:space="0" w:color="BFBFBF"/>
+              <w:bottom w:val="single" w:sz="4" w:space="0" w:color="BFBFBF"/>
+              <w:right w:val="single" w:sz="4" w:space="0" w:color="BFBFBF"/>
+            </w:tcBorders>
+            <w:tcMar>
+              <w:top w:w="70" w:type="dxa"/>
+              <w:left w:w="110" w:type="dxa"/>
+              <w:bottom w:w="70" w:type="dxa"/>
+              <w:right w:w="110" w:type="dxa"/>
+            </w:tcMar>
+          </w:tcPr>
+          <w:p>
+            <w:r>
+              <w:rPr/>
+              <w:t>70e760d (https://github.com/Polarralop/EECS3311Project/commit/70e760d)</w:t>
+            </w:r>
+          </w:p>
+        </w:tc>
+        <w:tc>
+          <w:tcPr>
+            <w:tcW w:w="5160" w:type="dxa"/>
+            <w:tcBorders>
+              <w:top w:val="single" w:sz="4" w:space="0" w:color="BFBFBF"/>
+              <w:left w:val="single" w:sz="4" w:space="0" w:color="BFBFBF"/>
+              <w:bottom w:val="single" w:sz="4" w:space="0" w:color="BFBFBF"/>
+              <w:right w:val="single" w:sz="4" w:space="0" w:color="BFBFBF"/>
+            </w:tcBorders>
+            <w:tcMar>
+              <w:top w:w="70" w:type="dxa"/>
+              <w:left w:w="110" w:type="dxa"/>
+              <w:bottom w:w="70" w:type="dxa"/>
+              <w:right w:w="110" w:type="dxa"/>
+            </w:tcMar>
+          </w:tcPr>
+          <w:p>
+            <w:r>
+              <w:rPr/>
+              <w:t>feat(ui): play turns and review proposals in StoryGUI</w:t>
+            </w:r>
+          </w:p>
+        </w:tc>
+        <w:tc>
+          <w:tcPr>
+            <w:tcW w:w="1600" w:type="dxa"/>
+            <w:tcBorders>
+              <w:top w:val="single" w:sz="4" w:space="0" w:color="BFBFBF"/>
+              <w:left w:val="single" w:sz="4" w:space="0" w:color="BFBFBF"/>
+              <w:bottom w:val="single" w:sz="4" w:space="0" w:color="BFBFBF"/>
+              <w:right w:val="single" w:sz="4" w:space="0" w:color="BFBFBF"/>
+            </w:tcBorders>
+            <w:tcMar>
+              <w:top w:w="70" w:type="dxa"/>
+              <w:left w:w="110" w:type="dxa"/>
+              <w:bottom w:w="70" w:type="dxa"/>
+              <w:right w:w="110" w:type="dxa"/>
+            </w:tcMar>
+          </w:tcPr>
+          <w:p>
+            <w:r>
+              <w:rPr/>
+              <w:t>F04, F07, F10, F01 (GUI)</w:t>
+            </w:r>
+          </w:p>
+        </w:tc>
+      </w:tr>
     </w:tbl>
     <w:p>
       <w:pPr>
@@ -23632,7 +23976,7 @@
       </w:pPr>
       <w:r>
         <w:rPr/>
-        <w:t>Count so far (period 2): 7 meaningful code commits, all on Oct 27 (each later commit logs the ones before it).</w:t>
+        <w:t>Count so far (period 2): 8 meaningful code commits, all on Oct 27 (each later commit logs the ones before it).</w:t>
       </w:r>
     </w:p>
     <w:p>

</xml_diff>